<commit_message>
Retitle offer page as Internship Acceptance Letter
Co-Authored-By: Claude Sonnet 5.5 <noreply@anthropic.com>
Claude-Session: https://claude.ai/code/session_014qmguLz6rfSFg9e1TvRQwa
</commit_message>
<xml_diff>
--- a/Internship_Report_Renuka_S_RAG_Final.docx
+++ b/Internship_Report_Renuka_S_RAG_Final.docx
@@ -6593,7 +6593,7 @@
                 <w:sz w:val="28"/>
                 <w:szCs w:val="28"/>
               </w:rPr>
-              <w:t xml:space="preserve">Internship Offer Letter</w:t>
+              <w:t xml:space="preserve">Internship Acceptance Letter</w:t>
             </w:r>
           </w:p>
         </w:tc>
@@ -11524,7 +11524,7 @@
           <w:b/>
           <w:sz w:val="28"/>
         </w:rPr>
-        <w:t xml:space="preserve">INTERNSHIP OFFER LETTER</w:t>
+        <w:t xml:space="preserve">INTERNSHIP ACCEPTANCE LETTER</w:t>
       </w:r>
     </w:p>
     <w:p xmlns:a="http://schemas.openxmlformats.org/drawingml/2006/main" xmlns:pic="http://schemas.openxmlformats.org/drawingml/2006/picture">
@@ -11845,7 +11845,7 @@
           <w:rFonts w:ascii="Times New Roman" w:hAnsi="Times New Roman"/>
           <w:sz w:val="28"/>
         </w:rPr>
-        <w:t xml:space="preserve">Internship engagement in AI/ML at Pyntree Technologies from 01 July 2026 to 01 September 2026 as AI/ML Intern, covering AI/ML model development, data preprocessing and analysis, model evaluation, and REST API integration with Python, PyTorch, TensorFlow, Scikit-Learn and Git/GitHub, under developer mentorship with review meeting dated 17.08.2026. A copy of the offer letter is reproduced in full on page 26, before the References.</w:t>
+        <w:t xml:space="preserve">Internship engagement in AI/ML at Pyntree Technologies from 01 July 2026 to 01 September 2026 as AI/ML Intern, covering AI/ML model development, data preprocessing and analysis, model evaluation, and REST API integration with Python, PyTorch, TensorFlow, Scikit-Learn and Git/GitHub, under developer mentorship with review meeting dated 17.08.2026. A copy of the offer and acceptance letter is reproduced in full on page 26, before the References.</w:t>
       </w:r>
       <w:proofErr w:type="spellStart"/>
       <w:r>

</xml_diff>

<commit_message>
Fix cover/page-2 overflow, add safety margins on chapter-end pages, add PDF versions
Co-Authored-By: Claude Sonnet 5.5 <noreply@anthropic.com>
Claude-Session: https://claude.ai/code/session_014qmguLz6rfSFg9e1TvRQwa
</commit_message>
<xml_diff>
--- a/Internship_Report_Renuka_S_RAG_Final.docx
+++ b/Internship_Report_Renuka_S_RAG_Final.docx
@@ -4,7 +4,7 @@
   <w:body>
     <w:p>
       <w:pPr>
-        <w:spacing w:line="360" w:lineRule="auto"/>
+        <w:spacing w:line="288" w:lineRule="auto"/>
         <w:jc w:val="center"/>
         <w:rPr>
           <w:rFonts w:ascii="Times New Roman" w:hAnsi="Times New Roman" w:cs="Times New Roman"/>
@@ -57,7 +57,7 @@
     <w:p>
       <w:pPr>
         <w:keepNext xmlns:a="http://schemas.openxmlformats.org/drawingml/2006/main" xmlns:pic="http://schemas.openxmlformats.org/drawingml/2006/picture"/>
-        <w:spacing w:line="360" w:lineRule="auto"/>
+        <w:spacing w:line="288" w:lineRule="auto"/>
         <w:jc w:val="center"/>
         <w:rPr>
           <w:rFonts w:ascii="Times New Roman" w:hAnsi="Times New Roman" w:cs="Times New Roman"/>
@@ -79,7 +79,7 @@
     <w:p>
       <w:pPr>
         <w:keepNext xmlns:a="http://schemas.openxmlformats.org/drawingml/2006/main" xmlns:pic="http://schemas.openxmlformats.org/drawingml/2006/picture"/>
-        <w:spacing w:line="360" w:lineRule="auto"/>
+        <w:spacing w:line="288" w:lineRule="auto"/>
         <w:jc w:val="center"/>
         <w:rPr>
           <w:rFonts w:ascii="Times New Roman" w:hAnsi="Times New Roman" w:cs="Times New Roman"/>
@@ -101,7 +101,7 @@
     <w:p>
       <w:pPr>
         <w:keepNext xmlns:a="http://schemas.openxmlformats.org/drawingml/2006/main" xmlns:pic="http://schemas.openxmlformats.org/drawingml/2006/picture"/>
-        <w:spacing w:line="360" w:lineRule="auto"/>
+        <w:spacing w:line="288" w:lineRule="auto"/>
         <w:jc w:val="center"/>
         <w:rPr>
           <w:rFonts w:ascii="Times New Roman" w:hAnsi="Times New Roman" w:cs="Times New Roman"/>
@@ -122,7 +122,7 @@
     </w:p>
     <w:p>
       <w:pPr>
-        <w:spacing w:line="360" w:lineRule="auto"/>
+        <w:spacing w:line="288" w:lineRule="auto"/>
         <w:jc w:val="center"/>
         <w:rPr>
           <w:rFonts w:ascii="Times New Roman" w:hAnsi="Times New Roman" w:cs="Times New Roman"/>
@@ -136,7 +136,7 @@
     <w:p>
       <w:pPr>
         <w:keepNext xmlns:a="http://schemas.openxmlformats.org/drawingml/2006/main" xmlns:pic="http://schemas.openxmlformats.org/drawingml/2006/picture"/>
-        <w:spacing w:line="360" w:lineRule="auto"/>
+        <w:spacing w:line="288" w:lineRule="auto"/>
         <w:jc w:val="center"/>
         <w:rPr>
           <w:rFonts w:ascii="Times New Roman" w:hAnsi="Times New Roman" w:cs="Times New Roman"/>
@@ -189,7 +189,7 @@
     </w:p>
     <w:p>
       <w:pPr>
-        <w:spacing w:line="360" w:lineRule="auto"/>
+        <w:spacing w:line="288" w:lineRule="auto"/>
         <w:jc w:val="center"/>
         <w:rPr>
           <w:rFonts w:ascii="Times New Roman" w:hAnsi="Times New Roman" w:cs="Times New Roman"/>
@@ -202,7 +202,7 @@
     </w:p>
     <w:p>
       <w:pPr>
-        <w:spacing w:line="360" w:lineRule="auto"/>
+        <w:spacing w:line="288" w:lineRule="auto"/>
         <w:jc w:val="center"/>
         <w:rPr>
           <w:rFonts w:ascii="Times New Roman" w:hAnsi="Times New Roman" w:cs="Times New Roman"/>
@@ -225,7 +225,7 @@
     </w:p>
     <w:p>
       <w:pPr>
-        <w:spacing w:line="360" w:lineRule="auto"/>
+        <w:spacing w:line="288" w:lineRule="auto"/>
         <w:jc w:val="center"/>
         <w:rPr>
           <w:rFonts w:ascii="Times New Roman" w:hAnsi="Times New Roman" w:cs="Times New Roman"/>
@@ -239,7 +239,7 @@
     <w:p>
       <w:pPr>
         <w:keepNext xmlns:a="http://schemas.openxmlformats.org/drawingml/2006/main" xmlns:pic="http://schemas.openxmlformats.org/drawingml/2006/picture"/>
-        <w:spacing w:line="360" w:lineRule="auto"/>
+        <w:spacing w:line="288" w:lineRule="auto"/>
         <w:jc w:val="center"/>
         <w:rPr>
           <w:rFonts w:ascii="Times New Roman" w:hAnsi="Times New Roman" w:cs="Times New Roman"/>
@@ -260,7 +260,7 @@
     </w:p>
     <w:p>
       <w:pPr>
-        <w:spacing w:line="360" w:lineRule="auto"/>
+        <w:spacing w:line="288" w:lineRule="auto"/>
         <w:jc w:val="center"/>
         <w:rPr>
           <w:rFonts w:ascii="Times New Roman" w:hAnsi="Times New Roman" w:cs="Times New Roman"/>
@@ -273,7 +273,7 @@
     </w:p>
     <w:p>
       <w:pPr>
-        <w:spacing w:line="360" w:lineRule="auto"/>
+        <w:spacing w:line="288" w:lineRule="auto"/>
         <w:jc w:val="center"/>
         <w:rPr>
           <w:rFonts w:ascii="Times New Roman" w:hAnsi="Times New Roman" w:cs="Times New Roman"/>
@@ -286,7 +286,7 @@
     </w:p>
     <w:p>
       <w:pPr>
-        <w:spacing w:line="360" w:lineRule="auto"/>
+        <w:spacing w:line="288" w:lineRule="auto"/>
         <w:jc w:val="center"/>
         <w:rPr>
           <w:rFonts w:ascii="Times New Roman" w:hAnsi="Times New Roman" w:cs="Times New Roman"/>
@@ -331,7 +331,7 @@
     </w:p>
     <w:p>
       <w:pPr>
-        <w:spacing w:line="360" w:lineRule="auto"/>
+        <w:spacing w:line="288" w:lineRule="auto"/>
         <w:jc w:val="center"/>
         <w:rPr>
           <w:rFonts w:ascii="Times New Roman" w:hAnsi="Times New Roman" w:cs="Times New Roman"/>
@@ -365,7 +365,7 @@
     <w:p>
       <w:pPr>
         <w:keepNext xmlns:a="http://schemas.openxmlformats.org/drawingml/2006/main" xmlns:pic="http://schemas.openxmlformats.org/drawingml/2006/picture"/>
-        <w:spacing w:line="360" w:lineRule="auto"/>
+        <w:spacing w:line="288" w:lineRule="auto"/>
         <w:jc w:val="center"/>
         <w:rPr>
           <w:rFonts w:ascii="Times New Roman" w:hAnsi="Times New Roman" w:cs="Times New Roman"/>
@@ -398,7 +398,7 @@
     </w:p>
     <w:p>
       <w:pPr>
-        <w:spacing w:line="360" w:lineRule="auto"/>
+        <w:spacing w:line="288" w:lineRule="auto"/>
         <w:jc w:val="center"/>
         <w:rPr>
           <w:rFonts w:ascii="Times New Roman" w:hAnsi="Times New Roman" w:cs="Times New Roman"/>
@@ -417,7 +417,7 @@
     </w:p>
     <w:p>
       <w:pPr>
-        <w:spacing w:line="360" w:lineRule="auto"/>
+        <w:spacing w:line="288" w:lineRule="auto"/>
         <w:jc w:val="center"/>
         <w:rPr>
           <w:rFonts w:ascii="Times New Roman" w:hAnsi="Times New Roman" w:cs="Times New Roman"/>
@@ -437,7 +437,7 @@
     <w:p>
       <w:pPr>
         <w:keepNext xmlns:a="http://schemas.openxmlformats.org/drawingml/2006/main" xmlns:pic="http://schemas.openxmlformats.org/drawingml/2006/picture"/>
-        <w:spacing w:line="360" w:lineRule="auto"/>
+        <w:spacing w:line="288" w:lineRule="auto"/>
         <w:jc w:val="center"/>
         <w:rPr>
           <w:rFonts w:ascii="Times New Roman" w:hAnsi="Times New Roman" w:cs="Times New Roman"/>
@@ -461,7 +461,7 @@
     <w:p>
       <w:pPr>
         <w:keepNext xmlns:a="http://schemas.openxmlformats.org/drawingml/2006/main" xmlns:pic="http://schemas.openxmlformats.org/drawingml/2006/picture"/>
-        <w:spacing w:line="360" w:lineRule="auto"/>
+        <w:spacing w:line="288" w:lineRule="auto"/>
         <w:jc w:val="center"/>
         <w:rPr>
           <w:rFonts w:ascii="Times New Roman" w:hAnsi="Times New Roman" w:cs="Times New Roman"/>
@@ -485,7 +485,7 @@
     <w:p>
       <w:pPr>
         <w:keepNext xmlns:a="http://schemas.openxmlformats.org/drawingml/2006/main" xmlns:pic="http://schemas.openxmlformats.org/drawingml/2006/picture"/>
-        <w:spacing w:line="360" w:lineRule="auto"/>
+        <w:spacing w:line="288" w:lineRule="auto"/>
         <w:jc w:val="center"/>
         <w:rPr>
           <w:rFonts w:ascii="Times New Roman" w:hAnsi="Times New Roman" w:cs="Times New Roman"/>
@@ -530,7 +530,7 @@
     </w:p>
     <w:p>
       <w:pPr>
-        <w:spacing w:line="360" w:lineRule="auto"/>
+        <w:spacing w:line="288" w:lineRule="auto"/>
         <w:jc w:val="center"/>
         <w:rPr>
           <w:rFonts w:ascii="Times New Roman" w:hAnsi="Times New Roman" w:cs="Times New Roman"/>
@@ -8595,18 +8595,6 @@
         <w:t>The internship domain was Artificial Intelligence and Machine Learning: building, fine-tuning and evaluating models, data preprocessing and analysis, and integrating models into web applications and REST API microservices.</w:t>
       </w:r>
     </w:p>
-    <w:p xmlns:a="http://schemas.openxmlformats.org/drawingml/2006/main" xmlns:pic="http://schemas.openxmlformats.org/drawingml/2006/picture">
-      <w:pPr>
-        <w:jc w:val="both"/>
-      </w:pPr>
-      <w:r>
-        <w:rPr>
-          <w:rFonts w:ascii="Times New Roman" w:hAnsi="Times New Roman"/>
-          <w:sz w:val="28"/>
-        </w:rPr>
-        <w:t xml:space="preserve">Within this domain, the emphasis of the internship was on applied work: preparing real documents and data, comparing the effect of retrieval settings on answer quality, and placing the results behind service interfaces that a product can call.</w:t>
-      </w:r>
-    </w:p>
     <w:p>
       <w:pPr>
         <w:keepNext xmlns:a="http://schemas.openxmlformats.org/drawingml/2006/main" xmlns:pic="http://schemas.openxmlformats.org/drawingml/2006/picture"/>
@@ -10751,18 +10739,6 @@
         <w:t>, TensorFlow and Scikit-Learn.</w:t>
       </w:r>
     </w:p>
-    <w:p xmlns:a="http://schemas.openxmlformats.org/drawingml/2006/main" xmlns:pic="http://schemas.openxmlformats.org/drawingml/2006/picture">
-      <w:pPr>
-        <w:jc w:val="both"/>
-      </w:pPr>
-      <w:r>
-        <w:rPr>
-          <w:rFonts w:ascii="Times New Roman" w:hAnsi="Times New Roman"/>
-          <w:sz w:val="28"/>
-        </w:rPr>
-        <w:t xml:space="preserve">These skills were developed through repeated practice on real tasks and were reinforced by review feedback, which made it possible to see not only whether a change worked but also whether it was clear, small and safe to merge.</w:t>
-      </w:r>
-    </w:p>
     <w:p>
       <w:pPr>
         <w:keepNext xmlns:a="http://schemas.openxmlformats.org/drawingml/2006/main" xmlns:pic="http://schemas.openxmlformats.org/drawingml/2006/picture"/>
@@ -11157,18 +11133,6 @@
           <w:sz w:val="28"/>
         </w:rPr>
         <w:t>Incremental work with requirement discussion, implementation, review and integration; version control on Git and GitHub; and review before merge kept partially finished work out of the product.</w:t>
-      </w:r>
-    </w:p>
-    <w:p xmlns:a="http://schemas.openxmlformats.org/drawingml/2006/main" xmlns:pic="http://schemas.openxmlformats.org/drawingml/2006/picture">
-      <w:pPr>
-        <w:jc w:val="both"/>
-      </w:pPr>
-      <w:r>
-        <w:rPr>
-          <w:rFonts w:ascii="Times New Roman" w:hAnsi="Times New Roman"/>
-          <w:sz w:val="28"/>
-        </w:rPr>
-        <w:t xml:space="preserve">The incremental rhythm made progress visible. At the end of each unit of work, the completed work, the open items and the plan for the next unit were reviewed, so that the intern and the mentor always shared the same picture of where the work stood.</w:t>
       </w:r>
     </w:p>
     <w:p>
@@ -11459,18 +11423,6 @@
           <w:sz w:val="28"/>
         </w:rPr>
         <w:t>The internship established end-to-end RAG understanding and production habits that carry forward into the final-year project and professional AI engineering work.</w:t>
-      </w:r>
-    </w:p>
-    <w:p xmlns:a="http://schemas.openxmlformats.org/drawingml/2006/main" xmlns:pic="http://schemas.openxmlformats.org/drawingml/2006/picture">
-      <w:pPr>
-        <w:jc w:val="both"/>
-      </w:pPr>
-      <w:r>
-        <w:rPr>
-          <w:rFonts w:ascii="Times New Roman" w:hAnsi="Times New Roman"/>
-          <w:sz w:val="28"/>
-        </w:rPr>
-        <w:t xml:space="preserve">The experience is directly relevant to careers in AI and machine learning engineering, where language models are valued through the services and products that use them. The habits of review, testing and clear communication are equally useful in any software role.</w:t>
       </w:r>
     </w:p>
     <w:p>

</xml_diff>

<commit_message>
Move completion certificate to the last page
Co-Authored-By: Claude Sonnet 5.5 <noreply@anthropic.com>
Claude-Session: https://claude.ai/code/session_014qmguLz6rfSFg9e1TvRQwa
</commit_message>
<xml_diff>
--- a/Internship_Report_Renuka_S_RAG_Final.docx
+++ b/Internship_Report_Renuka_S_RAG_Final.docx
@@ -6542,7 +6542,7 @@
                 <w:sz w:val="28"/>
                 <w:szCs w:val="28"/>
               </w:rPr>
-              <w:t xml:space="preserve">17</w:t>
+              <w:t>17</w:t>
             </w:r>
           </w:p>
         </w:tc>
@@ -6566,7 +6566,7 @@
                 <w:sz w:val="28"/>
                 <w:szCs w:val="28"/>
               </w:rPr>
-              <w:t xml:space="preserve">Completion Certificate</w:t>
+              <w:t>References</w:t>
             </w:r>
           </w:p>
         </w:tc>
@@ -6614,7 +6614,7 @@
                 <w:sz w:val="28"/>
                 <w:szCs w:val="28"/>
               </w:rPr>
-              <w:t xml:space="preserve">18</w:t>
+              <w:t>18</w:t>
             </w:r>
           </w:p>
         </w:tc>
@@ -6634,11 +6634,13 @@
             </w:pPr>
             <w:r>
               <w:rPr>
-                <w:rFonts w:ascii="Times New Roman" w:hAnsi="Times New Roman" w:cs="Times New Roman"/>
-                <w:sz w:val="28"/>
-                <w:szCs w:val="28"/>
-              </w:rPr>
-              <w:t>References</w:t>
+                <w:rStyle w:val="Strong"/>
+                <w:rFonts w:ascii="Times New Roman" w:hAnsi="Times New Roman" w:cs="Times New Roman"/>
+                <w:b w:val="0"/>
+                <w:sz w:val="28"/>
+                <w:szCs w:val="28"/>
+              </w:rPr>
+              <w:t>Appendices</w:t>
             </w:r>
           </w:p>
         </w:tc>
@@ -6686,7 +6688,7 @@
                 <w:sz w:val="28"/>
                 <w:szCs w:val="28"/>
               </w:rPr>
-              <w:t xml:space="preserve">19</w:t>
+              <w:t>18.1</w:t>
             </w:r>
           </w:p>
         </w:tc>
@@ -6706,13 +6708,11 @@
             </w:pPr>
             <w:r>
               <w:rPr>
-                <w:rStyle w:val="Strong"/>
-                <w:rFonts w:ascii="Times New Roman" w:hAnsi="Times New Roman" w:cs="Times New Roman"/>
-                <w:b w:val="0"/>
-                <w:sz w:val="28"/>
-                <w:szCs w:val="28"/>
-              </w:rPr>
-              <w:t>Appendices</w:t>
+                <w:rFonts w:ascii="Times New Roman" w:hAnsi="Times New Roman" w:cs="Times New Roman"/>
+                <w:sz w:val="28"/>
+                <w:szCs w:val="28"/>
+              </w:rPr>
+              <w:t>Appendix A – Internship Certificate</w:t>
             </w:r>
           </w:p>
         </w:tc>
@@ -6730,7 +6730,7 @@
                 <w:rFonts w:ascii="Times New Roman" w:hAnsi="Times New Roman"/>
                 <w:sz w:val="28"/>
               </w:rPr>
-              <w:t xml:space="preserve">28</w:t>
+              <w:t xml:space="preserve">27</w:t>
             </w:r>
           </w:p>
         </w:tc>
@@ -6760,7 +6760,7 @@
                 <w:sz w:val="28"/>
                 <w:szCs w:val="28"/>
               </w:rPr>
-              <w:t xml:space="preserve">19.1</w:t>
+              <w:t>18.2</w:t>
             </w:r>
           </w:p>
         </w:tc>
@@ -6784,7 +6784,7 @@
                 <w:sz w:val="28"/>
                 <w:szCs w:val="28"/>
               </w:rPr>
-              <w:t>Appendix A – Internship Certificate</w:t>
+              <w:t>Appendix B – Internship Offer / Permission Letter</w:t>
             </w:r>
           </w:p>
         </w:tc>
@@ -6802,7 +6802,7 @@
                 <w:rFonts w:ascii="Times New Roman" w:hAnsi="Times New Roman"/>
                 <w:sz w:val="28"/>
               </w:rPr>
-              <w:t xml:space="preserve">28</w:t>
+              <w:t xml:space="preserve">27</w:t>
             </w:r>
           </w:p>
         </w:tc>
@@ -6832,7 +6832,7 @@
                 <w:sz w:val="28"/>
                 <w:szCs w:val="28"/>
               </w:rPr>
-              <w:t xml:space="preserve">19.2</w:t>
+              <w:t>18.3</w:t>
             </w:r>
           </w:p>
         </w:tc>
@@ -6856,7 +6856,7 @@
                 <w:sz w:val="28"/>
                 <w:szCs w:val="28"/>
               </w:rPr>
-              <w:t>Appendix B – Internship Offer / Permission Letter</w:t>
+              <w:t>Appendix C – Weekly Internship Logbook</w:t>
             </w:r>
           </w:p>
         </w:tc>
@@ -6874,7 +6874,7 @@
                 <w:rFonts w:ascii="Times New Roman" w:hAnsi="Times New Roman"/>
                 <w:sz w:val="28"/>
               </w:rPr>
-              <w:t xml:space="preserve">28</w:t>
+              <w:t xml:space="preserve">27</w:t>
             </w:r>
           </w:p>
         </w:tc>
@@ -6904,7 +6904,7 @@
                 <w:sz w:val="28"/>
                 <w:szCs w:val="28"/>
               </w:rPr>
-              <w:t xml:space="preserve">19.3</w:t>
+              <w:t>18.4</w:t>
             </w:r>
           </w:p>
         </w:tc>
@@ -6928,7 +6928,7 @@
                 <w:sz w:val="28"/>
                 <w:szCs w:val="28"/>
               </w:rPr>
-              <w:t>Appendix C – Weekly Internship Logbook</w:t>
+              <w:t>Appendix D – Industry Mentor Evaluation</w:t>
             </w:r>
           </w:p>
         </w:tc>
@@ -6976,7 +6976,7 @@
                 <w:sz w:val="28"/>
                 <w:szCs w:val="28"/>
               </w:rPr>
-              <w:t xml:space="preserve">19.4</w:t>
+              <w:t>18.5</w:t>
             </w:r>
           </w:p>
         </w:tc>
@@ -7000,7 +7000,7 @@
                 <w:sz w:val="28"/>
                 <w:szCs w:val="28"/>
               </w:rPr>
-              <w:t>Appendix D – Industry Mentor Evaluation</w:t>
+              <w:t>Appendix E – Final Internship Presentation / Viva Record</w:t>
             </w:r>
           </w:p>
         </w:tc>
@@ -7018,7 +7018,7 @@
                 <w:rFonts w:ascii="Times New Roman" w:hAnsi="Times New Roman"/>
                 <w:sz w:val="28"/>
               </w:rPr>
-              <w:t xml:space="preserve">29</w:t>
+              <w:t xml:space="preserve">28</w:t>
             </w:r>
           </w:p>
         </w:tc>
@@ -7048,7 +7048,7 @@
                 <w:sz w:val="28"/>
                 <w:szCs w:val="28"/>
               </w:rPr>
-              <w:t xml:space="preserve">19.5</w:t>
+              <w:t>18.6</w:t>
             </w:r>
           </w:p>
         </w:tc>
@@ -7072,7 +7072,7 @@
                 <w:sz w:val="28"/>
                 <w:szCs w:val="28"/>
               </w:rPr>
-              <w:t>Appendix E – Final Internship Presentation / Viva Record</w:t>
+              <w:t>Appendix F – Photographs, Screenshots and Project Evidence</w:t>
             </w:r>
           </w:p>
         </w:tc>
@@ -7090,7 +7090,7 @@
                 <w:rFonts w:ascii="Times New Roman" w:hAnsi="Times New Roman"/>
                 <w:sz w:val="28"/>
               </w:rPr>
-              <w:t xml:space="preserve">29</w:t>
+              <w:t xml:space="preserve">28</w:t>
             </w:r>
           </w:p>
         </w:tc>
@@ -7120,7 +7120,7 @@
                 <w:sz w:val="28"/>
                 <w:szCs w:val="28"/>
               </w:rPr>
-              <w:t xml:space="preserve">19.6</w:t>
+              <w:t xml:space="preserve">19</w:t>
             </w:r>
           </w:p>
         </w:tc>
@@ -7144,7 +7144,7 @@
                 <w:sz w:val="28"/>
                 <w:szCs w:val="28"/>
               </w:rPr>
-              <w:t>Appendix F – Photographs, Screenshots and Project Evidence</w:t>
+              <w:t xml:space="preserve">Completion Certificate</w:t>
             </w:r>
           </w:p>
         </w:tc>
@@ -7162,7 +7162,7 @@
                 <w:rFonts w:ascii="Times New Roman" w:hAnsi="Times New Roman"/>
                 <w:sz w:val="28"/>
               </w:rPr>
-              <w:t xml:space="preserve">29</w:t>
+              <w:t xml:space="preserve">30</w:t>
             </w:r>
           </w:p>
         </w:tc>
@@ -7960,7 +7960,7 @@
               <w:jc w:val="center"/>
             </w:pPr>
             <w:r>
-              <w:t xml:space="preserve">28</w:t>
+              <w:t xml:space="preserve">27</w:t>
             </w:r>
           </w:p>
         </w:tc>
@@ -8014,7 +8014,7 @@
               <w:jc w:val="center"/>
             </w:pPr>
             <w:r>
-              <w:t xml:space="preserve">29</w:t>
+              <w:t xml:space="preserve">28</w:t>
             </w:r>
           </w:p>
         </w:tc>
@@ -11437,6 +11437,1573 @@
         <w:t xml:space="preserve">Recommendations for continuing the work include extending automated tests across the retrieval pipeline, measuring answer quality on a fixed set of questions after every change, and evaluating larger document collections.</w:t>
       </w:r>
     </w:p>
+    <w:p>
+      <w:pPr>
+        <w:keepNext xmlns:a="http://schemas.openxmlformats.org/drawingml/2006/main" xmlns:pic="http://schemas.openxmlformats.org/drawingml/2006/picture"/>
+        <w:pageBreakBefore/>
+        <w:jc w:val="center"/>
+      </w:pPr>
+      <w:r>
+        <w:rPr>
+          <w:rFonts w:ascii="Times New Roman" w:hAnsi="Times New Roman"/>
+          <w:b/>
+          <w:sz w:val="28"/>
+        </w:rPr>
+        <w:lastRenderedPageBreak/>
+        <w:t>REFERENCES</w:t>
+      </w:r>
+    </w:p>
+    <w:p>
+      <w:pPr>
+        <w:jc w:val="both"/>
+      </w:pPr>
+      <w:r>
+        <w:rPr>
+          <w:rFonts w:ascii="Times New Roman" w:hAnsi="Times New Roman"/>
+          <w:sz w:val="28"/>
+        </w:rPr>
+        <w:t>IV-Year Project First Review Meeting Report, Department of Artificial Intelligence and Data Science, review meeting dated 17.08.2026, Academic Year 2026-2027.</w:t>
+      </w:r>
+    </w:p>
+    <w:p>
+      <w:pPr>
+        <w:jc w:val="both"/>
+      </w:pPr>
+      <w:r>
+        <w:rPr>
+          <w:rFonts w:ascii="Times New Roman" w:hAnsi="Times New Roman"/>
+          <w:sz w:val="28"/>
+        </w:rPr>
+        <w:t xml:space="preserve">Project documentation and development records, RAG chatbot, </w:t>
+      </w:r>
+      <w:proofErr w:type="spellStart"/>
+      <w:r>
+        <w:rPr>
+          <w:rFonts w:ascii="Times New Roman" w:hAnsi="Times New Roman"/>
+          <w:sz w:val="28"/>
+        </w:rPr>
+        <w:t>Pyntree</w:t>
+      </w:r>
+      <w:proofErr w:type="spellEnd"/>
+      <w:r>
+        <w:rPr>
+          <w:rFonts w:ascii="Times New Roman" w:hAnsi="Times New Roman"/>
+          <w:sz w:val="28"/>
+        </w:rPr>
+        <w:t xml:space="preserve"> Technologies (internal, not reproduced).</w:t>
+      </w:r>
+    </w:p>
+    <w:p>
+      <w:pPr>
+        <w:jc w:val="both"/>
+      </w:pPr>
+      <w:r>
+        <w:rPr>
+          <w:rFonts w:ascii="Times New Roman" w:hAnsi="Times New Roman"/>
+          <w:sz w:val="28"/>
+        </w:rPr>
+        <w:t>Technical guidance and code review notes from the industry mentor, Karthikeyan, Software Developer.</w:t>
+      </w:r>
+    </w:p>
+    <w:p>
+      <w:pPr>
+        <w:jc w:val="both"/>
+      </w:pPr>
+      <w:r>
+        <w:rPr>
+          <w:rFonts w:ascii="Times New Roman" w:hAnsi="Times New Roman"/>
+          <w:sz w:val="28"/>
+        </w:rPr>
+        <w:t xml:space="preserve">Python machine learning frameworks used during the internship: </w:t>
+      </w:r>
+      <w:proofErr w:type="spellStart"/>
+      <w:r>
+        <w:rPr>
+          <w:rFonts w:ascii="Times New Roman" w:hAnsi="Times New Roman"/>
+          <w:sz w:val="28"/>
+        </w:rPr>
+        <w:t>PyTorch</w:t>
+      </w:r>
+      <w:proofErr w:type="spellEnd"/>
+      <w:r>
+        <w:rPr>
+          <w:rFonts w:ascii="Times New Roman" w:hAnsi="Times New Roman"/>
+          <w:sz w:val="28"/>
+        </w:rPr>
+        <w:t>, TensorFlow and Scikit-Learn.</w:t>
+      </w:r>
+    </w:p>
+    <w:p xmlns:a="http://schemas.openxmlformats.org/drawingml/2006/main" xmlns:pic="http://schemas.openxmlformats.org/drawingml/2006/picture">
+      <w:pPr>
+        <w:jc w:val="both"/>
+      </w:pPr>
+      <w:r>
+        <w:rPr>
+          <w:rFonts w:ascii="Times New Roman" w:hAnsi="Times New Roman"/>
+          <w:sz w:val="28"/>
+        </w:rPr>
+        <w:t xml:space="preserve">Lewis, P. et al., Retrieval-Augmented Generation for Knowledge-Intensive NLP Tasks, Advances in Neural Information Processing Systems (NeurIPS), 2020.</w:t>
+      </w:r>
+    </w:p>
+    <w:p xmlns:a="http://schemas.openxmlformats.org/drawingml/2006/main" xmlns:pic="http://schemas.openxmlformats.org/drawingml/2006/picture">
+      <w:pPr>
+        <w:jc w:val="both"/>
+      </w:pPr>
+      <w:r>
+        <w:rPr>
+          <w:rFonts w:ascii="Times New Roman" w:hAnsi="Times New Roman"/>
+          <w:sz w:val="28"/>
+        </w:rPr>
+        <w:t xml:space="preserve">Vaswani, A. et al., Attention Is All You Need, Advances in Neural Information Processing Systems (NeurIPS), 2017.</w:t>
+      </w:r>
+    </w:p>
+    <w:p xmlns:a="http://schemas.openxmlformats.org/drawingml/2006/main" xmlns:pic="http://schemas.openxmlformats.org/drawingml/2006/picture">
+      <w:pPr>
+        <w:jc w:val="both"/>
+      </w:pPr>
+      <w:r>
+        <w:rPr>
+          <w:rFonts w:ascii="Times New Roman" w:hAnsi="Times New Roman"/>
+          <w:sz w:val="28"/>
+        </w:rPr>
+        <w:t xml:space="preserve">Pedregosa, F. et al., Scikit-learn: Machine Learning in Python, Journal of Machine Learning Research, vol. 12, 2011.</w:t>
+      </w:r>
+    </w:p>
+    <w:p xmlns:a="http://schemas.openxmlformats.org/drawingml/2006/main" xmlns:pic="http://schemas.openxmlformats.org/drawingml/2006/picture">
+      <w:pPr>
+        <w:jc w:val="both"/>
+      </w:pPr>
+      <w:r>
+        <w:rPr>
+          <w:rFonts w:ascii="Times New Roman" w:hAnsi="Times New Roman"/>
+          <w:sz w:val="28"/>
+        </w:rPr>
+        <w:t xml:space="preserve">Paszke, A. et al., PyTorch: An Imperative Style, High-Performance Deep Learning Library, Advances in Neural Information Processing Systems (NeurIPS), 2019.</w:t>
+      </w:r>
+    </w:p>
+    <w:p xmlns:a="http://schemas.openxmlformats.org/drawingml/2006/main" xmlns:pic="http://schemas.openxmlformats.org/drawingml/2006/picture">
+      <w:pPr>
+        <w:jc w:val="both"/>
+      </w:pPr>
+      <w:r>
+        <w:rPr>
+          <w:rFonts w:ascii="Times New Roman" w:hAnsi="Times New Roman"/>
+          <w:sz w:val="28"/>
+        </w:rPr>
+        <w:t xml:space="preserve">Abadi, M. et al., TensorFlow: A System for Large-Scale Machine Learning, USENIX OSDI, 2016.</w:t>
+      </w:r>
+    </w:p>
+    <w:p xmlns:a="http://schemas.openxmlformats.org/drawingml/2006/main" xmlns:pic="http://schemas.openxmlformats.org/drawingml/2006/picture">
+      <w:pPr>
+        <w:jc w:val="both"/>
+      </w:pPr>
+      <w:r>
+        <w:rPr>
+          <w:rFonts w:ascii="Times New Roman" w:hAnsi="Times New Roman"/>
+          <w:sz w:val="28"/>
+        </w:rPr>
+        <w:t xml:space="preserve">Chacon, S. and Straub, B., Pro Git, Apress (available at git-scm.com).</w:t>
+      </w:r>
+    </w:p>
+    <w:p xmlns:a="http://schemas.openxmlformats.org/drawingml/2006/main" xmlns:pic="http://schemas.openxmlformats.org/drawingml/2006/picture">
+      <w:pPr>
+        <w:jc w:val="both"/>
+      </w:pPr>
+      <w:r>
+        <w:rPr>
+          <w:rFonts w:ascii="Times New Roman" w:hAnsi="Times New Roman"/>
+          <w:sz w:val="28"/>
+        </w:rPr>
+        <w:t xml:space="preserve">Sommerville, I., Software Engineering, Pearson Education.</w:t>
+      </w:r>
+    </w:p>
+    <w:p>
+      <w:pPr>
+        <w:keepNext xmlns:a="http://schemas.openxmlformats.org/drawingml/2006/main" xmlns:pic="http://schemas.openxmlformats.org/drawingml/2006/picture"/>
+        <w:pageBreakBefore/>
+        <w:jc w:val="center"/>
+      </w:pPr>
+      <w:r>
+        <w:rPr>
+          <w:rFonts w:ascii="Times New Roman" w:hAnsi="Times New Roman"/>
+          <w:b/>
+          <w:sz w:val="28"/>
+        </w:rPr>
+        <w:lastRenderedPageBreak/>
+        <w:t>APPENDICES</w:t>
+      </w:r>
+    </w:p>
+    <w:p>
+      <w:pPr>
+        <w:keepNext xmlns:a="http://schemas.openxmlformats.org/drawingml/2006/main" xmlns:pic="http://schemas.openxmlformats.org/drawingml/2006/picture"/>
+        <w:jc w:val="both"/>
+      </w:pPr>
+      <w:r>
+        <w:rPr>
+          <w:rFonts w:ascii="Times New Roman" w:hAnsi="Times New Roman"/>
+          <w:b/>
+          <w:sz w:val="28"/>
+        </w:rPr>
+        <w:t>Appendix A - Internship Certificate</w:t>
+      </w:r>
+    </w:p>
+    <w:p>
+      <w:pPr>
+        <w:jc w:val="both"/>
+      </w:pPr>
+      <w:r>
+        <w:rPr>
+          <w:rFonts w:ascii="Times New Roman" w:hAnsi="Times New Roman"/>
+          <w:sz w:val="28"/>
+        </w:rPr>
+        <w:t xml:space="preserve">This is to certify that Renuka S (Register Number 922123243043) completed an internship in AI/ML at Pyntree Technologies from 01 July 2026 to 01 September 2026, working on RAG Chatbot - An AI Knowledge Assistant under Karthikeyan, Software Developer. Company address: 1st Floor, SMA Complex, Mendonsa Colony, Nagal Nagar, Dindigul, Tamil Nadu - 624003. The completion certificate is reproduced in full on page 30, at the end of the report.</w:t>
+      </w:r>
+      <w:proofErr w:type="spellStart"/>
+      <w:r>
+        <w:rPr>
+          <w:rFonts w:ascii="Times New Roman" w:hAnsi="Times New Roman"/>
+          <w:sz w:val="28"/>
+        </w:rPr>
+        <w:t/>
+      </w:r>
+      <w:proofErr w:type="spellEnd"/>
+      <w:r>
+        <w:rPr>
+          <w:rFonts w:ascii="Times New Roman" w:hAnsi="Times New Roman"/>
+          <w:sz w:val="28"/>
+        </w:rPr>
+        <w:t xml:space="preserve"/>
+      </w:r>
+      <w:proofErr w:type="spellStart"/>
+      <w:r>
+        <w:rPr>
+          <w:rFonts w:ascii="Times New Roman" w:hAnsi="Times New Roman"/>
+          <w:sz w:val="28"/>
+        </w:rPr>
+        <w:t/>
+      </w:r>
+      <w:proofErr w:type="spellEnd"/>
+      <w:r>
+        <w:rPr>
+          <w:rFonts w:ascii="Times New Roman" w:hAnsi="Times New Roman"/>
+          <w:sz w:val="28"/>
+        </w:rPr>
+        <w:t/>
+      </w:r>
+    </w:p>
+    <w:p>
+      <w:pPr>
+        <w:keepNext xmlns:a="http://schemas.openxmlformats.org/drawingml/2006/main" xmlns:pic="http://schemas.openxmlformats.org/drawingml/2006/picture"/>
+        <w:jc w:val="both"/>
+      </w:pPr>
+      <w:r>
+        <w:rPr>
+          <w:rFonts w:ascii="Times New Roman" w:hAnsi="Times New Roman"/>
+          <w:b/>
+          <w:sz w:val="28"/>
+        </w:rPr>
+        <w:t>Appendix B - Internship Offer / Permission Letter</w:t>
+      </w:r>
+    </w:p>
+    <w:p>
+      <w:pPr>
+        <w:jc w:val="both"/>
+      </w:pPr>
+      <w:r>
+        <w:rPr>
+          <w:rFonts w:ascii="Times New Roman" w:hAnsi="Times New Roman"/>
+          <w:sz w:val="28"/>
+        </w:rPr>
+        <w:t xml:space="preserve">Internship engagement in AI/ML at Pyntree Technologies from 01 July 2026 to 01 September 2026 as AI/ML Intern, covering AI/ML model development, data preprocessing and analysis, model evaluation, and REST API integration with Python, PyTorch, TensorFlow, Scikit-Learn and Git/GitHub, under developer mentorship with review meeting dated 17.08.2026. A copy of the offer letter is reproduced in full on page 3, after the Bonafide Certificate.</w:t>
+      </w:r>
+      <w:proofErr w:type="spellStart"/>
+      <w:r>
+        <w:rPr>
+          <w:rFonts w:ascii="Times New Roman" w:hAnsi="Times New Roman"/>
+          <w:sz w:val="28"/>
+        </w:rPr>
+        <w:t/>
+      </w:r>
+      <w:proofErr w:type="spellEnd"/>
+      <w:r>
+        <w:rPr>
+          <w:rFonts w:ascii="Times New Roman" w:hAnsi="Times New Roman"/>
+          <w:sz w:val="28"/>
+        </w:rPr>
+        <w:t xml:space="preserve"/>
+      </w:r>
+      <w:proofErr w:type="spellStart"/>
+      <w:r>
+        <w:rPr>
+          <w:rFonts w:ascii="Times New Roman" w:hAnsi="Times New Roman"/>
+          <w:sz w:val="28"/>
+        </w:rPr>
+        <w:t/>
+      </w:r>
+      <w:proofErr w:type="spellEnd"/>
+      <w:r>
+        <w:rPr>
+          <w:rFonts w:ascii="Times New Roman" w:hAnsi="Times New Roman"/>
+          <w:sz w:val="28"/>
+        </w:rPr>
+        <w:t/>
+      </w:r>
+    </w:p>
+    <w:p>
+      <w:pPr>
+        <w:keepNext xmlns:a="http://schemas.openxmlformats.org/drawingml/2006/main" xmlns:pic="http://schemas.openxmlformats.org/drawingml/2006/picture"/>
+        <w:jc w:val="both"/>
+      </w:pPr>
+      <w:r>
+        <w:rPr>
+          <w:rFonts w:ascii="Times New Roman" w:hAnsi="Times New Roman"/>
+          <w:b/>
+          <w:sz w:val="28"/>
+        </w:rPr>
+        <w:t>Appendix C - Weekly Internship Logbook</w:t>
+      </w:r>
+    </w:p>
+    <w:p>
+      <w:pPr>
+        <w:jc w:val="both"/>
+      </w:pPr>
+      <w:r>
+        <w:rPr>
+          <w:rFonts w:ascii="Times New Roman" w:hAnsi="Times New Roman"/>
+          <w:sz w:val="28"/>
+        </w:rPr>
+        <w:t xml:space="preserve">Month 1: foundations, data and models - product and codebase understanding, environment and Git/GitHub setup, cleaning, preprocessing and exploratory analysis, building, fine-tuning and evaluation with </w:t>
+      </w:r>
+      <w:proofErr w:type="spellStart"/>
+      <w:r>
+        <w:rPr>
+          <w:rFonts w:ascii="Times New Roman" w:hAnsi="Times New Roman"/>
+          <w:sz w:val="28"/>
+        </w:rPr>
+        <w:t>PyTorch</w:t>
+      </w:r>
+      <w:proofErr w:type="spellEnd"/>
+      <w:r>
+        <w:rPr>
+          <w:rFonts w:ascii="Times New Roman" w:hAnsi="Times New Roman"/>
+          <w:sz w:val="28"/>
+        </w:rPr>
+        <w:t>, TensorFlow and Scikit-Learn. Month 2: retrieval, generation and integration - chunking, embeddings and retrieval, grounded generation with citations, REST API integration, testing and quality improvement.</w:t>
+      </w:r>
+    </w:p>
+    <w:p>
+      <w:pPr>
+        <w:jc w:val="center"/>
+      </w:pPr>
+      <w:r>
+        <w:rPr>
+          <w:rFonts w:ascii="Times New Roman" w:hAnsi="Times New Roman"/>
+          <w:i/>
+          <w:sz w:val="24"/>
+        </w:rPr>
+        <w:t>Table 2: Weekly internship logbook</w:t>
+      </w:r>
+    </w:p>
+    <w:tbl>
+      <w:tblPr>
+        <w:tblStyle w:val="TableGrid"/>
+        <w:tblW w:w="0" w:type="auto"/>
+        <w:jc w:val="center"/>
+        <w:tblLayout w:type="fixed"/>
+        <w:tblLook w:val="04A0" w:firstRow="1" w:lastRow="0" w:firstColumn="1" w:lastColumn="0" w:noHBand="0" w:noVBand="1"/>
+      </w:tblPr>
+      <w:tblGrid>
+        <w:gridCol w:w="850"/>
+        <w:gridCol w:w="2608"/>
+        <w:gridCol w:w="5386"/>
+      </w:tblGrid>
+      <w:tr>
+        <w:trPr>
+          <w:cantSplit/>
+          <w:tblHeader/>
+          <w:jc w:val="center"/>
+        </w:trPr>
+        <w:tc>
+          <w:tcPr>
+            <w:tcW w:w="850" w:type="dxa"/>
+            <w:shd w:val="clear" w:color="auto" w:fill="D9D9D9"/>
+          </w:tcPr>
+          <w:p>
+            <w:pPr>
+              <w:spacing w:before="40" w:after="40"/>
+              <w:jc w:val="center"/>
+            </w:pPr>
+            <w:r>
+              <w:rPr>
+                <w:rFonts w:ascii="Times New Roman" w:hAnsi="Times New Roman"/>
+                <w:b/>
+              </w:rPr>
+              <w:t>Week</w:t>
+            </w:r>
+          </w:p>
+        </w:tc>
+        <w:tc>
+          <w:tcPr>
+            <w:tcW w:w="2608" w:type="dxa"/>
+            <w:shd w:val="clear" w:color="auto" w:fill="D9D9D9"/>
+          </w:tcPr>
+          <w:p>
+            <w:pPr>
+              <w:spacing w:before="40" w:after="40"/>
+              <w:jc w:val="center"/>
+            </w:pPr>
+            <w:r>
+              <w:rPr>
+                <w:rFonts w:ascii="Times New Roman" w:hAnsi="Times New Roman"/>
+                <w:b/>
+              </w:rPr>
+              <w:t>Period</w:t>
+            </w:r>
+          </w:p>
+        </w:tc>
+        <w:tc>
+          <w:tcPr>
+            <w:tcW w:w="5386" w:type="dxa"/>
+            <w:shd w:val="clear" w:color="auto" w:fill="D9D9D9"/>
+          </w:tcPr>
+          <w:p>
+            <w:pPr>
+              <w:spacing w:before="40" w:after="40"/>
+              <w:jc w:val="center"/>
+            </w:pPr>
+            <w:r>
+              <w:rPr>
+                <w:rFonts w:ascii="Times New Roman" w:hAnsi="Times New Roman"/>
+                <w:b/>
+              </w:rPr>
+              <w:t>Activity</w:t>
+            </w:r>
+          </w:p>
+        </w:tc>
+      </w:tr>
+      <w:tr>
+        <w:trPr>
+          <w:cantSplit/>
+          <w:jc w:val="center"/>
+        </w:trPr>
+        <w:tc>
+          <w:tcPr>
+            <w:tcW w:w="850" w:type="dxa"/>
+          </w:tcPr>
+          <w:p>
+            <w:pPr>
+              <w:spacing w:before="40" w:after="40"/>
+              <w:jc w:val="center"/>
+            </w:pPr>
+            <w:r>
+              <w:rPr>
+                <w:rFonts w:ascii="Times New Roman" w:hAnsi="Times New Roman"/>
+              </w:rPr>
+              <w:t>1</w:t>
+            </w:r>
+          </w:p>
+        </w:tc>
+        <w:tc>
+          <w:tcPr>
+            <w:tcW w:w="2608" w:type="dxa"/>
+          </w:tcPr>
+          <w:p>
+            <w:pPr>
+              <w:spacing w:before="40" w:after="40"/>
+              <w:jc w:val="center"/>
+            </w:pPr>
+            <w:r>
+              <w:rPr>
+                <w:rFonts w:ascii="Times New Roman" w:hAnsi="Times New Roman"/>
+              </w:rPr>
+              <w:t>01 Jul - 07 Jul 2026</w:t>
+            </w:r>
+          </w:p>
+        </w:tc>
+        <w:tc>
+          <w:tcPr>
+            <w:tcW w:w="5386" w:type="dxa"/>
+          </w:tcPr>
+          <w:p>
+            <w:pPr>
+              <w:spacing w:before="40" w:after="40"/>
+            </w:pPr>
+            <w:r>
+              <w:rPr>
+                <w:rFonts w:ascii="Times New Roman" w:hAnsi="Times New Roman"/>
+              </w:rPr>
+              <w:t>Orientation to the product and codebase; development environment and Git/GitHub setup; data collection and cleaning.</w:t>
+            </w:r>
+          </w:p>
+        </w:tc>
+      </w:tr>
+      <w:tr>
+        <w:trPr>
+          <w:cantSplit/>
+          <w:jc w:val="center"/>
+        </w:trPr>
+        <w:tc>
+          <w:tcPr>
+            <w:tcW w:w="850" w:type="dxa"/>
+          </w:tcPr>
+          <w:p>
+            <w:pPr>
+              <w:spacing w:before="40" w:after="40"/>
+              <w:jc w:val="center"/>
+            </w:pPr>
+            <w:r>
+              <w:rPr>
+                <w:rFonts w:ascii="Times New Roman" w:hAnsi="Times New Roman"/>
+              </w:rPr>
+              <w:t>2</w:t>
+            </w:r>
+          </w:p>
+        </w:tc>
+        <w:tc>
+          <w:tcPr>
+            <w:tcW w:w="2608" w:type="dxa"/>
+          </w:tcPr>
+          <w:p>
+            <w:pPr>
+              <w:spacing w:before="40" w:after="40"/>
+              <w:jc w:val="center"/>
+            </w:pPr>
+            <w:r>
+              <w:rPr>
+                <w:rFonts w:ascii="Times New Roman" w:hAnsi="Times New Roman"/>
+              </w:rPr>
+              <w:t>08 Jul - 14 Jul 2026</w:t>
+            </w:r>
+          </w:p>
+        </w:tc>
+        <w:tc>
+          <w:tcPr>
+            <w:tcW w:w="5386" w:type="dxa"/>
+          </w:tcPr>
+          <w:p>
+            <w:pPr>
+              <w:spacing w:before="40" w:after="40"/>
+            </w:pPr>
+            <w:r>
+              <w:rPr>
+                <w:rFonts w:ascii="Times New Roman" w:hAnsi="Times New Roman"/>
+              </w:rPr>
+              <w:t>Data preprocessing, exploratory analysis and feature engineering; baseline models with Scikit-Learn.</w:t>
+            </w:r>
+          </w:p>
+        </w:tc>
+      </w:tr>
+      <w:tr>
+        <w:trPr>
+          <w:cantSplit/>
+          <w:jc w:val="center"/>
+        </w:trPr>
+        <w:tc>
+          <w:tcPr>
+            <w:tcW w:w="850" w:type="dxa"/>
+          </w:tcPr>
+          <w:p>
+            <w:pPr>
+              <w:spacing w:before="40" w:after="40"/>
+              <w:jc w:val="center"/>
+            </w:pPr>
+            <w:r>
+              <w:rPr>
+                <w:rFonts w:ascii="Times New Roman" w:hAnsi="Times New Roman"/>
+              </w:rPr>
+              <w:t>3</w:t>
+            </w:r>
+          </w:p>
+        </w:tc>
+        <w:tc>
+          <w:tcPr>
+            <w:tcW w:w="2608" w:type="dxa"/>
+          </w:tcPr>
+          <w:p>
+            <w:pPr>
+              <w:spacing w:before="40" w:after="40"/>
+              <w:jc w:val="center"/>
+            </w:pPr>
+            <w:r>
+              <w:rPr>
+                <w:rFonts w:ascii="Times New Roman" w:hAnsi="Times New Roman"/>
+              </w:rPr>
+              <w:t>15 Jul - 21 Jul 2026</w:t>
+            </w:r>
+          </w:p>
+        </w:tc>
+        <w:tc>
+          <w:tcPr>
+            <w:tcW w:w="5386" w:type="dxa"/>
+          </w:tcPr>
+          <w:p>
+            <w:pPr>
+              <w:spacing w:before="40" w:after="40"/>
+            </w:pPr>
+            <w:r>
+              <w:rPr>
+                <w:rFonts w:ascii="Times New Roman" w:hAnsi="Times New Roman"/>
+              </w:rPr>
+              <w:t xml:space="preserve">Model building and training with </w:t>
+            </w:r>
+            <w:proofErr w:type="spellStart"/>
+            <w:r>
+              <w:rPr>
+                <w:rFonts w:ascii="Times New Roman" w:hAnsi="Times New Roman"/>
+              </w:rPr>
+              <w:t>PyTorch</w:t>
+            </w:r>
+            <w:proofErr w:type="spellEnd"/>
+            <w:r>
+              <w:rPr>
+                <w:rFonts w:ascii="Times New Roman" w:hAnsi="Times New Roman"/>
+              </w:rPr>
+              <w:t xml:space="preserve"> and TensorFlow.</w:t>
+            </w:r>
+          </w:p>
+        </w:tc>
+      </w:tr>
+      <w:tr>
+        <w:trPr>
+          <w:cantSplit/>
+          <w:jc w:val="center"/>
+        </w:trPr>
+        <w:tc>
+          <w:tcPr>
+            <w:tcW w:w="850" w:type="dxa"/>
+          </w:tcPr>
+          <w:p>
+            <w:pPr>
+              <w:spacing w:before="40" w:after="40"/>
+              <w:jc w:val="center"/>
+            </w:pPr>
+            <w:r>
+              <w:rPr>
+                <w:rFonts w:ascii="Times New Roman" w:hAnsi="Times New Roman"/>
+              </w:rPr>
+              <w:t>4</w:t>
+            </w:r>
+          </w:p>
+        </w:tc>
+        <w:tc>
+          <w:tcPr>
+            <w:tcW w:w="2608" w:type="dxa"/>
+          </w:tcPr>
+          <w:p>
+            <w:pPr>
+              <w:spacing w:before="40" w:after="40"/>
+              <w:jc w:val="center"/>
+            </w:pPr>
+            <w:r>
+              <w:rPr>
+                <w:rFonts w:ascii="Times New Roman" w:hAnsi="Times New Roman"/>
+              </w:rPr>
+              <w:t>22 Jul - 28 Jul 2026</w:t>
+            </w:r>
+          </w:p>
+        </w:tc>
+        <w:tc>
+          <w:tcPr>
+            <w:tcW w:w="5386" w:type="dxa"/>
+          </w:tcPr>
+          <w:p>
+            <w:pPr>
+              <w:spacing w:before="40" w:after="40"/>
+            </w:pPr>
+            <w:r>
+              <w:rPr>
+                <w:rFonts w:ascii="Times New Roman" w:hAnsi="Times New Roman"/>
+              </w:rPr>
+              <w:t>Fine-tuning, hyperparameter optimisation and evaluation on held-out data.</w:t>
+            </w:r>
+          </w:p>
+        </w:tc>
+      </w:tr>
+      <w:tr>
+        <w:trPr>
+          <w:cantSplit/>
+          <w:jc w:val="center"/>
+        </w:trPr>
+        <w:tc>
+          <w:tcPr>
+            <w:tcW w:w="850" w:type="dxa"/>
+          </w:tcPr>
+          <w:p>
+            <w:pPr>
+              <w:spacing w:before="40" w:after="40"/>
+              <w:jc w:val="center"/>
+            </w:pPr>
+            <w:r>
+              <w:rPr>
+                <w:rFonts w:ascii="Times New Roman" w:hAnsi="Times New Roman"/>
+              </w:rPr>
+              <w:t>5</w:t>
+            </w:r>
+          </w:p>
+        </w:tc>
+        <w:tc>
+          <w:tcPr>
+            <w:tcW w:w="2608" w:type="dxa"/>
+          </w:tcPr>
+          <w:p>
+            <w:pPr>
+              <w:spacing w:before="40" w:after="40"/>
+              <w:jc w:val="center"/>
+            </w:pPr>
+            <w:r>
+              <w:rPr>
+                <w:rFonts w:ascii="Times New Roman" w:hAnsi="Times New Roman"/>
+              </w:rPr>
+              <w:t>29 Jul - 04 Aug 2026</w:t>
+            </w:r>
+          </w:p>
+        </w:tc>
+        <w:tc>
+          <w:tcPr>
+            <w:tcW w:w="5386" w:type="dxa"/>
+          </w:tcPr>
+          <w:p>
+            <w:pPr>
+              <w:spacing w:before="40" w:after="40"/>
+            </w:pPr>
+            <w:r>
+              <w:rPr>
+                <w:rFonts w:ascii="Times New Roman" w:hAnsi="Times New Roman"/>
+              </w:rPr>
+              <w:t>Document loading, cleaning and chunking for the RAG pipeline.</w:t>
+            </w:r>
+          </w:p>
+        </w:tc>
+      </w:tr>
+      <w:tr>
+        <w:trPr>
+          <w:cantSplit/>
+          <w:jc w:val="center"/>
+        </w:trPr>
+        <w:tc>
+          <w:tcPr>
+            <w:tcW w:w="850" w:type="dxa"/>
+          </w:tcPr>
+          <w:p>
+            <w:pPr>
+              <w:spacing w:before="40" w:after="40"/>
+              <w:jc w:val="center"/>
+            </w:pPr>
+            <w:r>
+              <w:rPr>
+                <w:rFonts w:ascii="Times New Roman" w:hAnsi="Times New Roman"/>
+              </w:rPr>
+              <w:t>6</w:t>
+            </w:r>
+          </w:p>
+        </w:tc>
+        <w:tc>
+          <w:tcPr>
+            <w:tcW w:w="2608" w:type="dxa"/>
+          </w:tcPr>
+          <w:p>
+            <w:pPr>
+              <w:spacing w:before="40" w:after="40"/>
+              <w:jc w:val="center"/>
+            </w:pPr>
+            <w:r>
+              <w:rPr>
+                <w:rFonts w:ascii="Times New Roman" w:hAnsi="Times New Roman"/>
+              </w:rPr>
+              <w:t>05 Aug - 11 Aug 2026</w:t>
+            </w:r>
+          </w:p>
+        </w:tc>
+        <w:tc>
+          <w:tcPr>
+            <w:tcW w:w="5386" w:type="dxa"/>
+          </w:tcPr>
+          <w:p>
+            <w:pPr>
+              <w:spacing w:before="40" w:after="40"/>
+            </w:pPr>
+            <w:r>
+              <w:rPr>
+                <w:rFonts w:ascii="Times New Roman" w:hAnsi="Times New Roman"/>
+              </w:rPr>
+              <w:t>Embedding of passages and queries; indexing into the vector store.</w:t>
+            </w:r>
+          </w:p>
+        </w:tc>
+      </w:tr>
+      <w:tr>
+        <w:trPr>
+          <w:cantSplit/>
+          <w:jc w:val="center"/>
+        </w:trPr>
+        <w:tc>
+          <w:tcPr>
+            <w:tcW w:w="850" w:type="dxa"/>
+          </w:tcPr>
+          <w:p>
+            <w:pPr>
+              <w:spacing w:before="40" w:after="40"/>
+              <w:jc w:val="center"/>
+            </w:pPr>
+            <w:r>
+              <w:rPr>
+                <w:rFonts w:ascii="Times New Roman" w:hAnsi="Times New Roman"/>
+              </w:rPr>
+              <w:t>7</w:t>
+            </w:r>
+          </w:p>
+        </w:tc>
+        <w:tc>
+          <w:tcPr>
+            <w:tcW w:w="2608" w:type="dxa"/>
+          </w:tcPr>
+          <w:p>
+            <w:pPr>
+              <w:spacing w:before="40" w:after="40"/>
+              <w:jc w:val="center"/>
+            </w:pPr>
+            <w:r>
+              <w:rPr>
+                <w:rFonts w:ascii="Times New Roman" w:hAnsi="Times New Roman"/>
+              </w:rPr>
+              <w:t>12 Aug - 18 Aug 2026</w:t>
+            </w:r>
+          </w:p>
+        </w:tc>
+        <w:tc>
+          <w:tcPr>
+            <w:tcW w:w="5386" w:type="dxa"/>
+          </w:tcPr>
+          <w:p>
+            <w:pPr>
+              <w:spacing w:before="40" w:after="40"/>
+            </w:pPr>
+            <w:r>
+              <w:rPr>
+                <w:rFonts w:ascii="Times New Roman" w:hAnsi="Times New Roman"/>
+              </w:rPr>
+              <w:t>Semantic retrieval with top-k search and reranking; prompt assembly.</w:t>
+            </w:r>
+          </w:p>
+        </w:tc>
+      </w:tr>
+      <w:tr>
+        <w:trPr>
+          <w:cantSplit/>
+          <w:jc w:val="center"/>
+        </w:trPr>
+        <w:tc>
+          <w:tcPr>
+            <w:tcW w:w="850" w:type="dxa"/>
+          </w:tcPr>
+          <w:p>
+            <w:pPr>
+              <w:spacing w:before="40" w:after="40"/>
+              <w:jc w:val="center"/>
+            </w:pPr>
+            <w:r>
+              <w:rPr>
+                <w:rFonts w:ascii="Times New Roman" w:hAnsi="Times New Roman"/>
+              </w:rPr>
+              <w:t>8</w:t>
+            </w:r>
+          </w:p>
+        </w:tc>
+        <w:tc>
+          <w:tcPr>
+            <w:tcW w:w="2608" w:type="dxa"/>
+          </w:tcPr>
+          <w:p>
+            <w:pPr>
+              <w:spacing w:before="40" w:after="40"/>
+              <w:jc w:val="center"/>
+            </w:pPr>
+            <w:r>
+              <w:rPr>
+                <w:rFonts w:ascii="Times New Roman" w:hAnsi="Times New Roman"/>
+              </w:rPr>
+              <w:t>19 Aug - 25 Aug 2026</w:t>
+            </w:r>
+          </w:p>
+        </w:tc>
+        <w:tc>
+          <w:tcPr>
+            <w:tcW w:w="5386" w:type="dxa"/>
+          </w:tcPr>
+          <w:p>
+            <w:pPr>
+              <w:spacing w:before="40" w:after="40"/>
+            </w:pPr>
+            <w:r>
+              <w:rPr>
+                <w:rFonts w:ascii="Times New Roman" w:hAnsi="Times New Roman"/>
+              </w:rPr>
+              <w:t>Grounded answer generation with citations; REST API integration with the chat orchestrator.</w:t>
+            </w:r>
+          </w:p>
+        </w:tc>
+      </w:tr>
+      <w:tr>
+        <w:trPr>
+          <w:cantSplit/>
+          <w:jc w:val="center"/>
+        </w:trPr>
+        <w:tc>
+          <w:tcPr>
+            <w:tcW w:w="850" w:type="dxa"/>
+          </w:tcPr>
+          <w:p>
+            <w:pPr>
+              <w:spacing w:before="40" w:after="40"/>
+              <w:jc w:val="center"/>
+            </w:pPr>
+            <w:r>
+              <w:rPr>
+                <w:rFonts w:ascii="Times New Roman" w:hAnsi="Times New Roman"/>
+              </w:rPr>
+              <w:t>9</w:t>
+            </w:r>
+          </w:p>
+        </w:tc>
+        <w:tc>
+          <w:tcPr>
+            <w:tcW w:w="2608" w:type="dxa"/>
+          </w:tcPr>
+          <w:p>
+            <w:pPr>
+              <w:spacing w:before="40" w:after="40"/>
+              <w:jc w:val="center"/>
+            </w:pPr>
+            <w:r>
+              <w:rPr>
+                <w:rFonts w:ascii="Times New Roman" w:hAnsi="Times New Roman"/>
+              </w:rPr>
+              <w:t>26 Aug - 01 Sep 2026</w:t>
+            </w:r>
+          </w:p>
+        </w:tc>
+        <w:tc>
+          <w:tcPr>
+            <w:tcW w:w="5386" w:type="dxa"/>
+          </w:tcPr>
+          <w:p>
+            <w:pPr>
+              <w:spacing w:before="40" w:after="40"/>
+            </w:pPr>
+            <w:r>
+              <w:rPr>
+                <w:rFonts w:ascii="Times New Roman" w:hAnsi="Times New Roman"/>
+              </w:rPr>
+              <w:t>Testing, retrieval-quality improvement, feedback and logging, and final handover of work.</w:t>
+            </w:r>
+          </w:p>
+        </w:tc>
+      </w:tr>
+    </w:tbl>
+    <w:p>
+      <w:pPr>
+        <w:spacing w:after="0"/>
+        <w:jc w:val="both"/>
+      </w:pPr>
+    </w:p>
+    <w:p>
+      <w:pPr>
+        <w:keepNext xmlns:a="http://schemas.openxmlformats.org/drawingml/2006/main" xmlns:pic="http://schemas.openxmlformats.org/drawingml/2006/picture"/>
+        <w:jc w:val="both"/>
+      </w:pPr>
+      <w:r>
+        <w:rPr>
+          <w:rFonts w:ascii="Times New Roman" w:hAnsi="Times New Roman"/>
+          <w:b/>
+          <w:sz w:val="28"/>
+        </w:rPr>
+        <w:t>Appendix D - Industry Mentor Evaluation</w:t>
+      </w:r>
+    </w:p>
+    <w:p>
+      <w:pPr>
+        <w:jc w:val="both"/>
+      </w:pPr>
+      <w:r>
+        <w:rPr>
+          <w:rFonts w:ascii="Times New Roman" w:hAnsi="Times New Roman"/>
+          <w:sz w:val="28"/>
+        </w:rPr>
+        <w:lastRenderedPageBreak/>
+        <w:t>Industry mentor Karthikeyan, Software Developer, guided requirement understanding, technical problem approaches and implementation quality, with interaction for technical clarification, code-related guidance and project feedback.</w:t>
+      </w:r>
+    </w:p>
+    <w:p>
+      <w:pPr>
+        <w:jc w:val="center"/>
+      </w:pPr>
+      <w:r>
+        <w:rPr>
+          <w:rFonts w:ascii="Times New Roman" w:hAnsi="Times New Roman"/>
+          <w:i/>
+          <w:sz w:val="24"/>
+        </w:rPr>
+        <w:t>Table 3: Areas of guidance from the industry mentor</w:t>
+      </w:r>
+    </w:p>
+    <w:tbl>
+      <w:tblPr>
+        <w:tblStyle w:val="TableGrid"/>
+        <w:tblW w:w="0" w:type="auto"/>
+        <w:jc w:val="center"/>
+        <w:tblLayout w:type="fixed"/>
+        <w:tblLook w:val="04A0" w:firstRow="1" w:lastRow="0" w:firstColumn="1" w:lastColumn="0" w:noHBand="0" w:noVBand="1"/>
+      </w:tblPr>
+      <w:tblGrid>
+        <w:gridCol w:w="2835"/>
+        <w:gridCol w:w="6009"/>
+      </w:tblGrid>
+      <w:tr>
+        <w:trPr>
+          <w:cantSplit/>
+          <w:tblHeader/>
+          <w:jc w:val="center"/>
+        </w:trPr>
+        <w:tc>
+          <w:tcPr>
+            <w:tcW w:w="2835" w:type="dxa"/>
+            <w:shd w:val="clear" w:color="auto" w:fill="D9D9D9"/>
+          </w:tcPr>
+          <w:p>
+            <w:pPr>
+              <w:spacing w:before="40" w:after="40"/>
+              <w:jc w:val="center"/>
+            </w:pPr>
+            <w:r>
+              <w:rPr>
+                <w:rFonts w:ascii="Times New Roman" w:hAnsi="Times New Roman"/>
+                <w:b/>
+                <w:sz w:val="22"/>
+              </w:rPr>
+              <w:t>Area</w:t>
+            </w:r>
+          </w:p>
+        </w:tc>
+        <w:tc>
+          <w:tcPr>
+            <w:tcW w:w="6009" w:type="dxa"/>
+            <w:shd w:val="clear" w:color="auto" w:fill="D9D9D9"/>
+          </w:tcPr>
+          <w:p>
+            <w:pPr>
+              <w:spacing w:before="40" w:after="40"/>
+              <w:jc w:val="center"/>
+            </w:pPr>
+            <w:r>
+              <w:rPr>
+                <w:rFonts w:ascii="Times New Roman" w:hAnsi="Times New Roman"/>
+                <w:b/>
+                <w:sz w:val="22"/>
+              </w:rPr>
+              <w:t>Guidance received</w:t>
+            </w:r>
+          </w:p>
+        </w:tc>
+      </w:tr>
+      <w:tr>
+        <w:trPr>
+          <w:cantSplit/>
+          <w:jc w:val="center"/>
+        </w:trPr>
+        <w:tc>
+          <w:tcPr>
+            <w:tcW w:w="2835" w:type="dxa"/>
+          </w:tcPr>
+          <w:p>
+            <w:pPr>
+              <w:spacing w:before="40" w:after="40"/>
+            </w:pPr>
+            <w:r>
+              <w:rPr>
+                <w:rFonts w:ascii="Times New Roman" w:hAnsi="Times New Roman"/>
+                <w:sz w:val="22"/>
+              </w:rPr>
+              <w:t>Understanding of requirements</w:t>
+            </w:r>
+          </w:p>
+        </w:tc>
+        <w:tc>
+          <w:tcPr>
+            <w:tcW w:w="6009" w:type="dxa"/>
+          </w:tcPr>
+          <w:p>
+            <w:pPr>
+              <w:spacing w:before="40" w:after="40"/>
+            </w:pPr>
+            <w:r>
+              <w:rPr>
+                <w:rFonts w:ascii="Times New Roman" w:hAnsi="Times New Roman"/>
+                <w:sz w:val="22"/>
+              </w:rPr>
+              <w:t>Guided the student in reading the product requirements and breaking them into reviewable units of work.</w:t>
+            </w:r>
+          </w:p>
+        </w:tc>
+      </w:tr>
+      <w:tr>
+        <w:trPr>
+          <w:cantSplit/>
+          <w:jc w:val="center"/>
+        </w:trPr>
+        <w:tc>
+          <w:tcPr>
+            <w:tcW w:w="2835" w:type="dxa"/>
+          </w:tcPr>
+          <w:p>
+            <w:pPr>
+              <w:spacing w:before="40" w:after="40"/>
+            </w:pPr>
+            <w:r>
+              <w:rPr>
+                <w:rFonts w:ascii="Times New Roman" w:hAnsi="Times New Roman"/>
+                <w:sz w:val="22"/>
+              </w:rPr>
+              <w:t>Technical problem approaches</w:t>
+            </w:r>
+          </w:p>
+        </w:tc>
+        <w:tc>
+          <w:tcPr>
+            <w:tcW w:w="6009" w:type="dxa"/>
+          </w:tcPr>
+          <w:p>
+            <w:pPr>
+              <w:spacing w:before="40" w:after="40"/>
+            </w:pPr>
+            <w:r>
+              <w:rPr>
+                <w:rFonts w:ascii="Times New Roman" w:hAnsi="Times New Roman"/>
+                <w:sz w:val="22"/>
+              </w:rPr>
+              <w:t>Advised on approaches to retrieval quality, chunking, embeddings and ranking, and on structuring model experiments.</w:t>
+            </w:r>
+          </w:p>
+        </w:tc>
+      </w:tr>
+      <w:tr>
+        <w:trPr>
+          <w:cantSplit/>
+          <w:jc w:val="center"/>
+        </w:trPr>
+        <w:tc>
+          <w:tcPr>
+            <w:tcW w:w="2835" w:type="dxa"/>
+          </w:tcPr>
+          <w:p>
+            <w:pPr>
+              <w:spacing w:before="40" w:after="40"/>
+            </w:pPr>
+            <w:r>
+              <w:rPr>
+                <w:rFonts w:ascii="Times New Roman" w:hAnsi="Times New Roman"/>
+                <w:sz w:val="22"/>
+              </w:rPr>
+              <w:t>Implementation quality</w:t>
+            </w:r>
+          </w:p>
+        </w:tc>
+        <w:tc>
+          <w:tcPr>
+            <w:tcW w:w="6009" w:type="dxa"/>
+          </w:tcPr>
+          <w:p>
+            <w:pPr>
+              <w:spacing w:before="40" w:after="40"/>
+            </w:pPr>
+            <w:r>
+              <w:rPr>
+                <w:rFonts w:ascii="Times New Roman" w:hAnsi="Times New Roman"/>
+                <w:sz w:val="22"/>
+              </w:rPr>
+              <w:t>Reviewed code before merge and gave feedback on structure, readability and error handling.</w:t>
+            </w:r>
+          </w:p>
+        </w:tc>
+      </w:tr>
+      <w:tr>
+        <w:trPr>
+          <w:cantSplit/>
+          <w:jc w:val="center"/>
+        </w:trPr>
+        <w:tc>
+          <w:tcPr>
+            <w:tcW w:w="2835" w:type="dxa"/>
+          </w:tcPr>
+          <w:p>
+            <w:pPr>
+              <w:spacing w:before="40" w:after="40"/>
+            </w:pPr>
+            <w:r>
+              <w:rPr>
+                <w:rFonts w:ascii="Times New Roman" w:hAnsi="Times New Roman"/>
+                <w:sz w:val="22"/>
+              </w:rPr>
+              <w:t>Technical clarification</w:t>
+            </w:r>
+          </w:p>
+        </w:tc>
+        <w:tc>
+          <w:tcPr>
+            <w:tcW w:w="6009" w:type="dxa"/>
+          </w:tcPr>
+          <w:p>
+            <w:pPr>
+              <w:spacing w:before="40" w:after="40"/>
+            </w:pPr>
+            <w:r>
+              <w:rPr>
+                <w:rFonts w:ascii="Times New Roman" w:hAnsi="Times New Roman"/>
+                <w:sz w:val="22"/>
+              </w:rPr>
+              <w:t>Available for questions and clarification throughout the internship.</w:t>
+            </w:r>
+          </w:p>
+        </w:tc>
+      </w:tr>
+      <w:tr>
+        <w:trPr>
+          <w:cantSplit/>
+          <w:jc w:val="center"/>
+        </w:trPr>
+        <w:tc>
+          <w:tcPr>
+            <w:tcW w:w="2835" w:type="dxa"/>
+          </w:tcPr>
+          <w:p>
+            <w:pPr>
+              <w:spacing w:before="40" w:after="40"/>
+            </w:pPr>
+            <w:r>
+              <w:rPr>
+                <w:rFonts w:ascii="Times New Roman" w:hAnsi="Times New Roman"/>
+                <w:sz w:val="22"/>
+              </w:rPr>
+              <w:t>Code-related guidance</w:t>
+            </w:r>
+          </w:p>
+        </w:tc>
+        <w:tc>
+          <w:tcPr>
+            <w:tcW w:w="6009" w:type="dxa"/>
+          </w:tcPr>
+          <w:p>
+            <w:pPr>
+              <w:spacing w:before="40" w:after="40"/>
+            </w:pPr>
+            <w:r>
+              <w:rPr>
+                <w:rFonts w:ascii="Times New Roman" w:hAnsi="Times New Roman"/>
+                <w:sz w:val="22"/>
+              </w:rPr>
+              <w:t>Guidance on Git and GitHub practice, branching, commits and review before merging.</w:t>
+            </w:r>
+          </w:p>
+        </w:tc>
+      </w:tr>
+      <w:tr>
+        <w:trPr>
+          <w:cantSplit/>
+          <w:jc w:val="center"/>
+        </w:trPr>
+        <w:tc>
+          <w:tcPr>
+            <w:tcW w:w="2835" w:type="dxa"/>
+          </w:tcPr>
+          <w:p>
+            <w:pPr>
+              <w:spacing w:before="40" w:after="40"/>
+            </w:pPr>
+            <w:r>
+              <w:rPr>
+                <w:rFonts w:ascii="Times New Roman" w:hAnsi="Times New Roman"/>
+                <w:sz w:val="22"/>
+              </w:rPr>
+              <w:t>Project feedback</w:t>
+            </w:r>
+          </w:p>
+        </w:tc>
+        <w:tc>
+          <w:tcPr>
+            <w:tcW w:w="6009" w:type="dxa"/>
+          </w:tcPr>
+          <w:p>
+            <w:pPr>
+              <w:spacing w:before="40" w:after="40"/>
+            </w:pPr>
+            <w:r>
+              <w:rPr>
+                <w:rFonts w:ascii="Times New Roman" w:hAnsi="Times New Roman"/>
+                <w:sz w:val="22"/>
+              </w:rPr>
+              <w:t>Regular feedback on progress of the RAG chatbot work and on the quality of the outputs.</w:t>
+            </w:r>
+          </w:p>
+        </w:tc>
+      </w:tr>
+    </w:tbl>
+    <w:p>
+      <w:pPr>
+        <w:spacing w:after="0"/>
+        <w:jc w:val="both"/>
+      </w:pPr>
+    </w:p>
+    <w:p>
+      <w:r>
+        <w:rPr>
+          <w:rFonts w:ascii="Times New Roman" w:hAnsi="Times New Roman"/>
+          <w:sz w:val="24"/>
+        </w:rPr>
+        <w:t xml:space="preserve">Mentor: Karthikeyan, Software Developer, </w:t>
+      </w:r>
+      <w:proofErr w:type="spellStart"/>
+      <w:r>
+        <w:rPr>
+          <w:rFonts w:ascii="Times New Roman" w:hAnsi="Times New Roman"/>
+          <w:sz w:val="24"/>
+        </w:rPr>
+        <w:t>Pyntree</w:t>
+      </w:r>
+      <w:proofErr w:type="spellEnd"/>
+      <w:r>
+        <w:rPr>
+          <w:rFonts w:ascii="Times New Roman" w:hAnsi="Times New Roman"/>
+          <w:sz w:val="24"/>
+        </w:rPr>
+        <w:t xml:space="preserve"> Technologies.</w:t>
+      </w:r>
+    </w:p>
+    <w:p>
+      <w:pPr>
+        <w:keepNext xmlns:a="http://schemas.openxmlformats.org/drawingml/2006/main" xmlns:pic="http://schemas.openxmlformats.org/drawingml/2006/picture"/>
+        <w:jc w:val="both"/>
+      </w:pPr>
+      <w:r>
+        <w:rPr>
+          <w:rFonts w:ascii="Times New Roman" w:hAnsi="Times New Roman"/>
+          <w:b/>
+          <w:sz w:val="28"/>
+        </w:rPr>
+        <w:t>Appendix E - Final Internship Presentation / Viva Record</w:t>
+      </w:r>
+    </w:p>
+    <w:p>
+      <w:pPr>
+        <w:jc w:val="both"/>
+      </w:pPr>
+      <w:r>
+        <w:rPr>
+          <w:rFonts w:ascii="Times New Roman" w:hAnsi="Times New Roman"/>
+          <w:sz w:val="28"/>
+        </w:rPr>
+        <w:t>The review meeting collected and verified the internship details, AI/ML training, software-development responsibilities, project involvement and practical learning. The student was advised to maintain proper records and continue developing the RAG chatbot based on the technical experience gained.</w:t>
+      </w:r>
+    </w:p>
+    <w:p>
+      <w:pPr>
+        <w:keepNext xmlns:a="http://schemas.openxmlformats.org/drawingml/2006/main" xmlns:pic="http://schemas.openxmlformats.org/drawingml/2006/picture"/>
+        <w:jc w:val="both"/>
+      </w:pPr>
+      <w:r>
+        <w:rPr>
+          <w:rFonts w:ascii="Times New Roman" w:hAnsi="Times New Roman"/>
+          <w:b/>
+          <w:sz w:val="28"/>
+        </w:rPr>
+        <w:t>Appendix F - Photographs, Screenshots and Project Evidence</w:t>
+      </w:r>
+    </w:p>
+    <w:p>
+      <w:pPr>
+        <w:jc w:val="both"/>
+      </w:pPr>
+      <w:r>
+        <w:rPr>
+          <w:rFonts w:ascii="Times New Roman" w:hAnsi="Times New Roman"/>
+          <w:sz w:val="28"/>
+        </w:rPr>
+        <w:t>Project evidence figures are included in Chapter 4 of this report (architecture, workflow/lifecycle and mind map), sourced from the internship project record.</w:t>
+      </w:r>
+    </w:p>
+    <w:p>
+      <w:pPr>
+        <w:jc w:val="center"/>
+      </w:pPr>
+      <w:r>
+        <w:rPr>
+          <w:noProof/>
+        </w:rPr>
+        <w:drawing>
+          <wp:inline distT="0" distB="0" distL="0" distR="0" wp14:anchorId="6D85A2BD" wp14:editId="3AC111BD">
+            <wp:extent cx="2527200" cy="2067709"/>
+            <wp:effectExtent l="0" t="0" r="0" b="0"/>
+            <wp:docPr id="57" name="Picture 57"/>
+            <wp:cNvGraphicFramePr>
+              <a:graphicFrameLocks xmlns:a="http://schemas.openxmlformats.org/drawingml/2006/main" noChangeAspect="1"/>
+            </wp:cNvGraphicFramePr>
+            <a:graphic xmlns:a="http://schemas.openxmlformats.org/drawingml/2006/main">
+              <a:graphicData uri="http://schemas.openxmlformats.org/drawingml/2006/picture">
+                <pic:pic xmlns:pic="http://schemas.openxmlformats.org/drawingml/2006/picture">
+                  <pic:nvPicPr>
+                    <pic:cNvPr id="0" name="renuka_p8_x13.png"/>
+                    <pic:cNvPicPr/>
+                  </pic:nvPicPr>
+                  <pic:blipFill>
+                    <a:blip r:embed="rId10"/>
+                    <a:stretch>
+                      <a:fillRect/>
+                    </a:stretch>
+                  </pic:blipFill>
+                  <pic:spPr>
+                    <a:xfrm>
+                      <a:off x="0" y="0"/>
+                      <a:ext cx="2527200" cy="2067709"/>
+                    </a:xfrm>
+                    <a:prstGeom prst="rect">
+                      <a:avLst/>
+                    </a:prstGeom>
+                  </pic:spPr>
+                </pic:pic>
+              </a:graphicData>
+            </a:graphic>
+          </wp:inline>
+        </w:drawing>
+      </w:r>
+    </w:p>
+    <w:p>
+      <w:pPr>
+        <w:jc w:val="center"/>
+      </w:pPr>
+      <w:r>
+        <w:rPr>
+          <w:rFonts w:ascii="Times New Roman" w:hAnsi="Times New Roman"/>
+          <w:i/>
+          <w:sz w:val="24"/>
+        </w:rPr>
+        <w:t>Figure 1: System architecture of the RAG chatbot</w:t>
+      </w:r>
+    </w:p>
+    <w:p>
+      <w:pPr>
+        <w:jc w:val="center"/>
+      </w:pPr>
+      <w:r>
+        <w:rPr>
+          <w:noProof/>
+        </w:rPr>
+        <w:lastRenderedPageBreak/>
+        <w:drawing>
+          <wp:inline distT="0" distB="0" distL="0" distR="0" wp14:anchorId="1BD25ADA" wp14:editId="6FF412D7">
+            <wp:extent cx="3790800" cy="1137240"/>
+            <wp:effectExtent l="0" t="0" r="0" b="0"/>
+            <wp:docPr id="58" name="Picture 58"/>
+            <wp:cNvGraphicFramePr>
+              <a:graphicFrameLocks xmlns:a="http://schemas.openxmlformats.org/drawingml/2006/main" noChangeAspect="1"/>
+            </wp:cNvGraphicFramePr>
+            <a:graphic xmlns:a="http://schemas.openxmlformats.org/drawingml/2006/main">
+              <a:graphicData uri="http://schemas.openxmlformats.org/drawingml/2006/picture">
+                <pic:pic xmlns:pic="http://schemas.openxmlformats.org/drawingml/2006/picture">
+                  <pic:nvPicPr>
+                    <pic:cNvPr id="0" name="renuka_p9_x16.png"/>
+                    <pic:cNvPicPr/>
+                  </pic:nvPicPr>
+                  <pic:blipFill>
+                    <a:blip r:embed="rId11"/>
+                    <a:stretch>
+                      <a:fillRect/>
+                    </a:stretch>
+                  </pic:blipFill>
+                  <pic:spPr>
+                    <a:xfrm>
+                      <a:off x="0" y="0"/>
+                      <a:ext cx="3790800" cy="1137240"/>
+                    </a:xfrm>
+                    <a:prstGeom prst="rect">
+                      <a:avLst/>
+                    </a:prstGeom>
+                  </pic:spPr>
+                </pic:pic>
+              </a:graphicData>
+            </a:graphic>
+          </wp:inline>
+        </w:drawing>
+      </w:r>
+    </w:p>
+    <w:p>
+      <w:pPr>
+        <w:jc w:val="center"/>
+      </w:pPr>
+      <w:r>
+        <w:rPr>
+          <w:rFonts w:ascii="Times New Roman" w:hAnsi="Times New Roman"/>
+          <w:i/>
+          <w:sz w:val="24"/>
+        </w:rPr>
+        <w:t>Figure 2: Retrieval-augmented query lifecycle</w:t>
+      </w:r>
+    </w:p>
+    <w:p>
+      <w:pPr>
+        <w:jc w:val="center"/>
+      </w:pPr>
+      <w:r>
+        <w:rPr>
+          <w:noProof/>
+        </w:rPr>
+        <w:drawing>
+          <wp:inline distT="0" distB="0" distL="0" distR="0" wp14:anchorId="0183C469" wp14:editId="37129ED3">
+            <wp:extent cx="2414880" cy="2195345"/>
+            <wp:effectExtent l="0" t="0" r="0" b="0"/>
+            <wp:docPr id="59" name="Picture 59"/>
+            <wp:cNvGraphicFramePr>
+              <a:graphicFrameLocks xmlns:a="http://schemas.openxmlformats.org/drawingml/2006/main" noChangeAspect="1"/>
+            </wp:cNvGraphicFramePr>
+            <a:graphic xmlns:a="http://schemas.openxmlformats.org/drawingml/2006/main">
+              <a:graphicData uri="http://schemas.openxmlformats.org/drawingml/2006/picture">
+                <pic:pic xmlns:pic="http://schemas.openxmlformats.org/drawingml/2006/picture">
+                  <pic:nvPicPr>
+                    <pic:cNvPr id="0" name="renuka_p10_x19.png"/>
+                    <pic:cNvPicPr/>
+                  </pic:nvPicPr>
+                  <pic:blipFill>
+                    <a:blip r:embed="rId12"/>
+                    <a:stretch>
+                      <a:fillRect/>
+                    </a:stretch>
+                  </pic:blipFill>
+                  <pic:spPr>
+                    <a:xfrm>
+                      <a:off x="0" y="0"/>
+                      <a:ext cx="2414880" cy="2195345"/>
+                    </a:xfrm>
+                    <a:prstGeom prst="rect">
+                      <a:avLst/>
+                    </a:prstGeom>
+                  </pic:spPr>
+                </pic:pic>
+              </a:graphicData>
+            </a:graphic>
+          </wp:inline>
+        </w:drawing>
+      </w:r>
+    </w:p>
+    <w:p>
+      <w:pPr>
+        <w:jc w:val="center"/>
+      </w:pPr>
+      <w:r>
+        <w:rPr>
+          <w:rFonts w:ascii="Times New Roman" w:hAnsi="Times New Roman"/>
+          <w:i/>
+          <w:sz w:val="24"/>
+        </w:rPr>
+        <w:t>Figure 3: Mind map of internship activities and learning</w:t>
+      </w:r>
+    </w:p>
     <w:p xmlns:a="http://schemas.openxmlformats.org/drawingml/2006/main" xmlns:pic="http://schemas.openxmlformats.org/drawingml/2006/picture">
       <w:pPr>
         <w:keepNext/>
@@ -11503,1573 +13070,6 @@
             </a:graphic>
           </wp:inline>
         </w:drawing>
-      </w:r>
-    </w:p>
-    <w:p>
-      <w:pPr>
-        <w:keepNext xmlns:a="http://schemas.openxmlformats.org/drawingml/2006/main" xmlns:pic="http://schemas.openxmlformats.org/drawingml/2006/picture"/>
-        <w:pageBreakBefore/>
-        <w:jc w:val="center"/>
-      </w:pPr>
-      <w:r>
-        <w:rPr>
-          <w:rFonts w:ascii="Times New Roman" w:hAnsi="Times New Roman"/>
-          <w:b/>
-          <w:sz w:val="28"/>
-        </w:rPr>
-        <w:lastRenderedPageBreak/>
-        <w:t>REFERENCES</w:t>
-      </w:r>
-    </w:p>
-    <w:p>
-      <w:pPr>
-        <w:jc w:val="both"/>
-      </w:pPr>
-      <w:r>
-        <w:rPr>
-          <w:rFonts w:ascii="Times New Roman" w:hAnsi="Times New Roman"/>
-          <w:sz w:val="28"/>
-        </w:rPr>
-        <w:t>IV-Year Project First Review Meeting Report, Department of Artificial Intelligence and Data Science, review meeting dated 17.08.2026, Academic Year 2026-2027.</w:t>
-      </w:r>
-    </w:p>
-    <w:p>
-      <w:pPr>
-        <w:jc w:val="both"/>
-      </w:pPr>
-      <w:r>
-        <w:rPr>
-          <w:rFonts w:ascii="Times New Roman" w:hAnsi="Times New Roman"/>
-          <w:sz w:val="28"/>
-        </w:rPr>
-        <w:t xml:space="preserve">Project documentation and development records, RAG chatbot, </w:t>
-      </w:r>
-      <w:proofErr w:type="spellStart"/>
-      <w:r>
-        <w:rPr>
-          <w:rFonts w:ascii="Times New Roman" w:hAnsi="Times New Roman"/>
-          <w:sz w:val="28"/>
-        </w:rPr>
-        <w:t>Pyntree</w:t>
-      </w:r>
-      <w:proofErr w:type="spellEnd"/>
-      <w:r>
-        <w:rPr>
-          <w:rFonts w:ascii="Times New Roman" w:hAnsi="Times New Roman"/>
-          <w:sz w:val="28"/>
-        </w:rPr>
-        <w:t xml:space="preserve"> Technologies (internal, not reproduced).</w:t>
-      </w:r>
-    </w:p>
-    <w:p>
-      <w:pPr>
-        <w:jc w:val="both"/>
-      </w:pPr>
-      <w:r>
-        <w:rPr>
-          <w:rFonts w:ascii="Times New Roman" w:hAnsi="Times New Roman"/>
-          <w:sz w:val="28"/>
-        </w:rPr>
-        <w:t>Technical guidance and code review notes from the industry mentor, Karthikeyan, Software Developer.</w:t>
-      </w:r>
-    </w:p>
-    <w:p>
-      <w:pPr>
-        <w:jc w:val="both"/>
-      </w:pPr>
-      <w:r>
-        <w:rPr>
-          <w:rFonts w:ascii="Times New Roman" w:hAnsi="Times New Roman"/>
-          <w:sz w:val="28"/>
-        </w:rPr>
-        <w:t xml:space="preserve">Python machine learning frameworks used during the internship: </w:t>
-      </w:r>
-      <w:proofErr w:type="spellStart"/>
-      <w:r>
-        <w:rPr>
-          <w:rFonts w:ascii="Times New Roman" w:hAnsi="Times New Roman"/>
-          <w:sz w:val="28"/>
-        </w:rPr>
-        <w:t>PyTorch</w:t>
-      </w:r>
-      <w:proofErr w:type="spellEnd"/>
-      <w:r>
-        <w:rPr>
-          <w:rFonts w:ascii="Times New Roman" w:hAnsi="Times New Roman"/>
-          <w:sz w:val="28"/>
-        </w:rPr>
-        <w:t>, TensorFlow and Scikit-Learn.</w:t>
-      </w:r>
-    </w:p>
-    <w:p xmlns:a="http://schemas.openxmlformats.org/drawingml/2006/main" xmlns:pic="http://schemas.openxmlformats.org/drawingml/2006/picture">
-      <w:pPr>
-        <w:jc w:val="both"/>
-      </w:pPr>
-      <w:r>
-        <w:rPr>
-          <w:rFonts w:ascii="Times New Roman" w:hAnsi="Times New Roman"/>
-          <w:sz w:val="28"/>
-        </w:rPr>
-        <w:t xml:space="preserve">Lewis, P. et al., Retrieval-Augmented Generation for Knowledge-Intensive NLP Tasks, Advances in Neural Information Processing Systems (NeurIPS), 2020.</w:t>
-      </w:r>
-    </w:p>
-    <w:p xmlns:a="http://schemas.openxmlformats.org/drawingml/2006/main" xmlns:pic="http://schemas.openxmlformats.org/drawingml/2006/picture">
-      <w:pPr>
-        <w:jc w:val="both"/>
-      </w:pPr>
-      <w:r>
-        <w:rPr>
-          <w:rFonts w:ascii="Times New Roman" w:hAnsi="Times New Roman"/>
-          <w:sz w:val="28"/>
-        </w:rPr>
-        <w:t xml:space="preserve">Vaswani, A. et al., Attention Is All You Need, Advances in Neural Information Processing Systems (NeurIPS), 2017.</w:t>
-      </w:r>
-    </w:p>
-    <w:p xmlns:a="http://schemas.openxmlformats.org/drawingml/2006/main" xmlns:pic="http://schemas.openxmlformats.org/drawingml/2006/picture">
-      <w:pPr>
-        <w:jc w:val="both"/>
-      </w:pPr>
-      <w:r>
-        <w:rPr>
-          <w:rFonts w:ascii="Times New Roman" w:hAnsi="Times New Roman"/>
-          <w:sz w:val="28"/>
-        </w:rPr>
-        <w:t xml:space="preserve">Pedregosa, F. et al., Scikit-learn: Machine Learning in Python, Journal of Machine Learning Research, vol. 12, 2011.</w:t>
-      </w:r>
-    </w:p>
-    <w:p xmlns:a="http://schemas.openxmlformats.org/drawingml/2006/main" xmlns:pic="http://schemas.openxmlformats.org/drawingml/2006/picture">
-      <w:pPr>
-        <w:jc w:val="both"/>
-      </w:pPr>
-      <w:r>
-        <w:rPr>
-          <w:rFonts w:ascii="Times New Roman" w:hAnsi="Times New Roman"/>
-          <w:sz w:val="28"/>
-        </w:rPr>
-        <w:t xml:space="preserve">Paszke, A. et al., PyTorch: An Imperative Style, High-Performance Deep Learning Library, Advances in Neural Information Processing Systems (NeurIPS), 2019.</w:t>
-      </w:r>
-    </w:p>
-    <w:p xmlns:a="http://schemas.openxmlformats.org/drawingml/2006/main" xmlns:pic="http://schemas.openxmlformats.org/drawingml/2006/picture">
-      <w:pPr>
-        <w:jc w:val="both"/>
-      </w:pPr>
-      <w:r>
-        <w:rPr>
-          <w:rFonts w:ascii="Times New Roman" w:hAnsi="Times New Roman"/>
-          <w:sz w:val="28"/>
-        </w:rPr>
-        <w:t xml:space="preserve">Abadi, M. et al., TensorFlow: A System for Large-Scale Machine Learning, USENIX OSDI, 2016.</w:t>
-      </w:r>
-    </w:p>
-    <w:p xmlns:a="http://schemas.openxmlformats.org/drawingml/2006/main" xmlns:pic="http://schemas.openxmlformats.org/drawingml/2006/picture">
-      <w:pPr>
-        <w:jc w:val="both"/>
-      </w:pPr>
-      <w:r>
-        <w:rPr>
-          <w:rFonts w:ascii="Times New Roman" w:hAnsi="Times New Roman"/>
-          <w:sz w:val="28"/>
-        </w:rPr>
-        <w:t xml:space="preserve">Chacon, S. and Straub, B., Pro Git, Apress (available at git-scm.com).</w:t>
-      </w:r>
-    </w:p>
-    <w:p xmlns:a="http://schemas.openxmlformats.org/drawingml/2006/main" xmlns:pic="http://schemas.openxmlformats.org/drawingml/2006/picture">
-      <w:pPr>
-        <w:jc w:val="both"/>
-      </w:pPr>
-      <w:r>
-        <w:rPr>
-          <w:rFonts w:ascii="Times New Roman" w:hAnsi="Times New Roman"/>
-          <w:sz w:val="28"/>
-        </w:rPr>
-        <w:t xml:space="preserve">Sommerville, I., Software Engineering, Pearson Education.</w:t>
-      </w:r>
-    </w:p>
-    <w:p>
-      <w:pPr>
-        <w:keepNext xmlns:a="http://schemas.openxmlformats.org/drawingml/2006/main" xmlns:pic="http://schemas.openxmlformats.org/drawingml/2006/picture"/>
-        <w:pageBreakBefore/>
-        <w:jc w:val="center"/>
-      </w:pPr>
-      <w:r>
-        <w:rPr>
-          <w:rFonts w:ascii="Times New Roman" w:hAnsi="Times New Roman"/>
-          <w:b/>
-          <w:sz w:val="28"/>
-        </w:rPr>
-        <w:lastRenderedPageBreak/>
-        <w:t>APPENDICES</w:t>
-      </w:r>
-    </w:p>
-    <w:p>
-      <w:pPr>
-        <w:keepNext xmlns:a="http://schemas.openxmlformats.org/drawingml/2006/main" xmlns:pic="http://schemas.openxmlformats.org/drawingml/2006/picture"/>
-        <w:jc w:val="both"/>
-      </w:pPr>
-      <w:r>
-        <w:rPr>
-          <w:rFonts w:ascii="Times New Roman" w:hAnsi="Times New Roman"/>
-          <w:b/>
-          <w:sz w:val="28"/>
-        </w:rPr>
-        <w:t>Appendix A - Internship Certificate</w:t>
-      </w:r>
-    </w:p>
-    <w:p>
-      <w:pPr>
-        <w:jc w:val="both"/>
-      </w:pPr>
-      <w:r>
-        <w:rPr>
-          <w:rFonts w:ascii="Times New Roman" w:hAnsi="Times New Roman"/>
-          <w:sz w:val="28"/>
-        </w:rPr>
-        <w:t xml:space="preserve">This is to certify that Renuka S (Register Number 922123243043) completed an internship in AI/ML at Pyntree Technologies from 01 July 2026 to 01 September 2026, working on RAG Chatbot - An AI Knowledge Assistant under Karthikeyan, Software Developer. Company address: 1st Floor, SMA Complex, Mendonsa Colony, Nagal Nagar, Dindigul, Tamil Nadu - 624003. The completion certificate is reproduced in full on page 26, before the References.</w:t>
-      </w:r>
-      <w:proofErr w:type="spellStart"/>
-      <w:r>
-        <w:rPr>
-          <w:rFonts w:ascii="Times New Roman" w:hAnsi="Times New Roman"/>
-          <w:sz w:val="28"/>
-        </w:rPr>
-        <w:t/>
-      </w:r>
-      <w:proofErr w:type="spellEnd"/>
-      <w:r>
-        <w:rPr>
-          <w:rFonts w:ascii="Times New Roman" w:hAnsi="Times New Roman"/>
-          <w:sz w:val="28"/>
-        </w:rPr>
-        <w:t xml:space="preserve"/>
-      </w:r>
-      <w:proofErr w:type="spellStart"/>
-      <w:r>
-        <w:rPr>
-          <w:rFonts w:ascii="Times New Roman" w:hAnsi="Times New Roman"/>
-          <w:sz w:val="28"/>
-        </w:rPr>
-        <w:t/>
-      </w:r>
-      <w:proofErr w:type="spellEnd"/>
-      <w:r>
-        <w:rPr>
-          <w:rFonts w:ascii="Times New Roman" w:hAnsi="Times New Roman"/>
-          <w:sz w:val="28"/>
-        </w:rPr>
-        <w:t/>
-      </w:r>
-    </w:p>
-    <w:p>
-      <w:pPr>
-        <w:keepNext xmlns:a="http://schemas.openxmlformats.org/drawingml/2006/main" xmlns:pic="http://schemas.openxmlformats.org/drawingml/2006/picture"/>
-        <w:jc w:val="both"/>
-      </w:pPr>
-      <w:r>
-        <w:rPr>
-          <w:rFonts w:ascii="Times New Roman" w:hAnsi="Times New Roman"/>
-          <w:b/>
-          <w:sz w:val="28"/>
-        </w:rPr>
-        <w:t>Appendix B - Internship Offer / Permission Letter</w:t>
-      </w:r>
-    </w:p>
-    <w:p>
-      <w:pPr>
-        <w:jc w:val="both"/>
-      </w:pPr>
-      <w:r>
-        <w:rPr>
-          <w:rFonts w:ascii="Times New Roman" w:hAnsi="Times New Roman"/>
-          <w:sz w:val="28"/>
-        </w:rPr>
-        <w:t xml:space="preserve">Internship engagement in AI/ML at Pyntree Technologies from 01 July 2026 to 01 September 2026 as AI/ML Intern, covering AI/ML model development, data preprocessing and analysis, model evaluation, and REST API integration with Python, PyTorch, TensorFlow, Scikit-Learn and Git/GitHub, under developer mentorship with review meeting dated 17.08.2026. A copy of the offer letter is reproduced in full on page 3, after the Bonafide Certificate.</w:t>
-      </w:r>
-      <w:proofErr w:type="spellStart"/>
-      <w:r>
-        <w:rPr>
-          <w:rFonts w:ascii="Times New Roman" w:hAnsi="Times New Roman"/>
-          <w:sz w:val="28"/>
-        </w:rPr>
-        <w:t/>
-      </w:r>
-      <w:proofErr w:type="spellEnd"/>
-      <w:r>
-        <w:rPr>
-          <w:rFonts w:ascii="Times New Roman" w:hAnsi="Times New Roman"/>
-          <w:sz w:val="28"/>
-        </w:rPr>
-        <w:t xml:space="preserve"/>
-      </w:r>
-      <w:proofErr w:type="spellStart"/>
-      <w:r>
-        <w:rPr>
-          <w:rFonts w:ascii="Times New Roman" w:hAnsi="Times New Roman"/>
-          <w:sz w:val="28"/>
-        </w:rPr>
-        <w:t/>
-      </w:r>
-      <w:proofErr w:type="spellEnd"/>
-      <w:r>
-        <w:rPr>
-          <w:rFonts w:ascii="Times New Roman" w:hAnsi="Times New Roman"/>
-          <w:sz w:val="28"/>
-        </w:rPr>
-        <w:t/>
-      </w:r>
-    </w:p>
-    <w:p>
-      <w:pPr>
-        <w:keepNext xmlns:a="http://schemas.openxmlformats.org/drawingml/2006/main" xmlns:pic="http://schemas.openxmlformats.org/drawingml/2006/picture"/>
-        <w:jc w:val="both"/>
-      </w:pPr>
-      <w:r>
-        <w:rPr>
-          <w:rFonts w:ascii="Times New Roman" w:hAnsi="Times New Roman"/>
-          <w:b/>
-          <w:sz w:val="28"/>
-        </w:rPr>
-        <w:t>Appendix C - Weekly Internship Logbook</w:t>
-      </w:r>
-    </w:p>
-    <w:p>
-      <w:pPr>
-        <w:jc w:val="both"/>
-      </w:pPr>
-      <w:r>
-        <w:rPr>
-          <w:rFonts w:ascii="Times New Roman" w:hAnsi="Times New Roman"/>
-          <w:sz w:val="28"/>
-        </w:rPr>
-        <w:t xml:space="preserve">Month 1: foundations, data and models - product and codebase understanding, environment and Git/GitHub setup, cleaning, preprocessing and exploratory analysis, building, fine-tuning and evaluation with </w:t>
-      </w:r>
-      <w:proofErr w:type="spellStart"/>
-      <w:r>
-        <w:rPr>
-          <w:rFonts w:ascii="Times New Roman" w:hAnsi="Times New Roman"/>
-          <w:sz w:val="28"/>
-        </w:rPr>
-        <w:t>PyTorch</w:t>
-      </w:r>
-      <w:proofErr w:type="spellEnd"/>
-      <w:r>
-        <w:rPr>
-          <w:rFonts w:ascii="Times New Roman" w:hAnsi="Times New Roman"/>
-          <w:sz w:val="28"/>
-        </w:rPr>
-        <w:t>, TensorFlow and Scikit-Learn. Month 2: retrieval, generation and integration - chunking, embeddings and retrieval, grounded generation with citations, REST API integration, testing and quality improvement.</w:t>
-      </w:r>
-    </w:p>
-    <w:p>
-      <w:pPr>
-        <w:jc w:val="center"/>
-      </w:pPr>
-      <w:r>
-        <w:rPr>
-          <w:rFonts w:ascii="Times New Roman" w:hAnsi="Times New Roman"/>
-          <w:i/>
-          <w:sz w:val="24"/>
-        </w:rPr>
-        <w:t>Table 2: Weekly internship logbook</w:t>
-      </w:r>
-    </w:p>
-    <w:tbl>
-      <w:tblPr>
-        <w:tblStyle w:val="TableGrid"/>
-        <w:tblW w:w="0" w:type="auto"/>
-        <w:jc w:val="center"/>
-        <w:tblLayout w:type="fixed"/>
-        <w:tblLook w:val="04A0" w:firstRow="1" w:lastRow="0" w:firstColumn="1" w:lastColumn="0" w:noHBand="0" w:noVBand="1"/>
-      </w:tblPr>
-      <w:tblGrid>
-        <w:gridCol w:w="850"/>
-        <w:gridCol w:w="2608"/>
-        <w:gridCol w:w="5386"/>
-      </w:tblGrid>
-      <w:tr>
-        <w:trPr>
-          <w:cantSplit/>
-          <w:tblHeader/>
-          <w:jc w:val="center"/>
-        </w:trPr>
-        <w:tc>
-          <w:tcPr>
-            <w:tcW w:w="850" w:type="dxa"/>
-            <w:shd w:val="clear" w:color="auto" w:fill="D9D9D9"/>
-          </w:tcPr>
-          <w:p>
-            <w:pPr>
-              <w:spacing w:before="40" w:after="40"/>
-              <w:jc w:val="center"/>
-            </w:pPr>
-            <w:r>
-              <w:rPr>
-                <w:rFonts w:ascii="Times New Roman" w:hAnsi="Times New Roman"/>
-                <w:b/>
-              </w:rPr>
-              <w:t>Week</w:t>
-            </w:r>
-          </w:p>
-        </w:tc>
-        <w:tc>
-          <w:tcPr>
-            <w:tcW w:w="2608" w:type="dxa"/>
-            <w:shd w:val="clear" w:color="auto" w:fill="D9D9D9"/>
-          </w:tcPr>
-          <w:p>
-            <w:pPr>
-              <w:spacing w:before="40" w:after="40"/>
-              <w:jc w:val="center"/>
-            </w:pPr>
-            <w:r>
-              <w:rPr>
-                <w:rFonts w:ascii="Times New Roman" w:hAnsi="Times New Roman"/>
-                <w:b/>
-              </w:rPr>
-              <w:t>Period</w:t>
-            </w:r>
-          </w:p>
-        </w:tc>
-        <w:tc>
-          <w:tcPr>
-            <w:tcW w:w="5386" w:type="dxa"/>
-            <w:shd w:val="clear" w:color="auto" w:fill="D9D9D9"/>
-          </w:tcPr>
-          <w:p>
-            <w:pPr>
-              <w:spacing w:before="40" w:after="40"/>
-              <w:jc w:val="center"/>
-            </w:pPr>
-            <w:r>
-              <w:rPr>
-                <w:rFonts w:ascii="Times New Roman" w:hAnsi="Times New Roman"/>
-                <w:b/>
-              </w:rPr>
-              <w:t>Activity</w:t>
-            </w:r>
-          </w:p>
-        </w:tc>
-      </w:tr>
-      <w:tr>
-        <w:trPr>
-          <w:cantSplit/>
-          <w:jc w:val="center"/>
-        </w:trPr>
-        <w:tc>
-          <w:tcPr>
-            <w:tcW w:w="850" w:type="dxa"/>
-          </w:tcPr>
-          <w:p>
-            <w:pPr>
-              <w:spacing w:before="40" w:after="40"/>
-              <w:jc w:val="center"/>
-            </w:pPr>
-            <w:r>
-              <w:rPr>
-                <w:rFonts w:ascii="Times New Roman" w:hAnsi="Times New Roman"/>
-              </w:rPr>
-              <w:t>1</w:t>
-            </w:r>
-          </w:p>
-        </w:tc>
-        <w:tc>
-          <w:tcPr>
-            <w:tcW w:w="2608" w:type="dxa"/>
-          </w:tcPr>
-          <w:p>
-            <w:pPr>
-              <w:spacing w:before="40" w:after="40"/>
-              <w:jc w:val="center"/>
-            </w:pPr>
-            <w:r>
-              <w:rPr>
-                <w:rFonts w:ascii="Times New Roman" w:hAnsi="Times New Roman"/>
-              </w:rPr>
-              <w:t>01 Jul - 07 Jul 2026</w:t>
-            </w:r>
-          </w:p>
-        </w:tc>
-        <w:tc>
-          <w:tcPr>
-            <w:tcW w:w="5386" w:type="dxa"/>
-          </w:tcPr>
-          <w:p>
-            <w:pPr>
-              <w:spacing w:before="40" w:after="40"/>
-            </w:pPr>
-            <w:r>
-              <w:rPr>
-                <w:rFonts w:ascii="Times New Roman" w:hAnsi="Times New Roman"/>
-              </w:rPr>
-              <w:t>Orientation to the product and codebase; development environment and Git/GitHub setup; data collection and cleaning.</w:t>
-            </w:r>
-          </w:p>
-        </w:tc>
-      </w:tr>
-      <w:tr>
-        <w:trPr>
-          <w:cantSplit/>
-          <w:jc w:val="center"/>
-        </w:trPr>
-        <w:tc>
-          <w:tcPr>
-            <w:tcW w:w="850" w:type="dxa"/>
-          </w:tcPr>
-          <w:p>
-            <w:pPr>
-              <w:spacing w:before="40" w:after="40"/>
-              <w:jc w:val="center"/>
-            </w:pPr>
-            <w:r>
-              <w:rPr>
-                <w:rFonts w:ascii="Times New Roman" w:hAnsi="Times New Roman"/>
-              </w:rPr>
-              <w:t>2</w:t>
-            </w:r>
-          </w:p>
-        </w:tc>
-        <w:tc>
-          <w:tcPr>
-            <w:tcW w:w="2608" w:type="dxa"/>
-          </w:tcPr>
-          <w:p>
-            <w:pPr>
-              <w:spacing w:before="40" w:after="40"/>
-              <w:jc w:val="center"/>
-            </w:pPr>
-            <w:r>
-              <w:rPr>
-                <w:rFonts w:ascii="Times New Roman" w:hAnsi="Times New Roman"/>
-              </w:rPr>
-              <w:t>08 Jul - 14 Jul 2026</w:t>
-            </w:r>
-          </w:p>
-        </w:tc>
-        <w:tc>
-          <w:tcPr>
-            <w:tcW w:w="5386" w:type="dxa"/>
-          </w:tcPr>
-          <w:p>
-            <w:pPr>
-              <w:spacing w:before="40" w:after="40"/>
-            </w:pPr>
-            <w:r>
-              <w:rPr>
-                <w:rFonts w:ascii="Times New Roman" w:hAnsi="Times New Roman"/>
-              </w:rPr>
-              <w:t>Data preprocessing, exploratory analysis and feature engineering; baseline models with Scikit-Learn.</w:t>
-            </w:r>
-          </w:p>
-        </w:tc>
-      </w:tr>
-      <w:tr>
-        <w:trPr>
-          <w:cantSplit/>
-          <w:jc w:val="center"/>
-        </w:trPr>
-        <w:tc>
-          <w:tcPr>
-            <w:tcW w:w="850" w:type="dxa"/>
-          </w:tcPr>
-          <w:p>
-            <w:pPr>
-              <w:spacing w:before="40" w:after="40"/>
-              <w:jc w:val="center"/>
-            </w:pPr>
-            <w:r>
-              <w:rPr>
-                <w:rFonts w:ascii="Times New Roman" w:hAnsi="Times New Roman"/>
-              </w:rPr>
-              <w:t>3</w:t>
-            </w:r>
-          </w:p>
-        </w:tc>
-        <w:tc>
-          <w:tcPr>
-            <w:tcW w:w="2608" w:type="dxa"/>
-          </w:tcPr>
-          <w:p>
-            <w:pPr>
-              <w:spacing w:before="40" w:after="40"/>
-              <w:jc w:val="center"/>
-            </w:pPr>
-            <w:r>
-              <w:rPr>
-                <w:rFonts w:ascii="Times New Roman" w:hAnsi="Times New Roman"/>
-              </w:rPr>
-              <w:t>15 Jul - 21 Jul 2026</w:t>
-            </w:r>
-          </w:p>
-        </w:tc>
-        <w:tc>
-          <w:tcPr>
-            <w:tcW w:w="5386" w:type="dxa"/>
-          </w:tcPr>
-          <w:p>
-            <w:pPr>
-              <w:spacing w:before="40" w:after="40"/>
-            </w:pPr>
-            <w:r>
-              <w:rPr>
-                <w:rFonts w:ascii="Times New Roman" w:hAnsi="Times New Roman"/>
-              </w:rPr>
-              <w:t xml:space="preserve">Model building and training with </w:t>
-            </w:r>
-            <w:proofErr w:type="spellStart"/>
-            <w:r>
-              <w:rPr>
-                <w:rFonts w:ascii="Times New Roman" w:hAnsi="Times New Roman"/>
-              </w:rPr>
-              <w:t>PyTorch</w:t>
-            </w:r>
-            <w:proofErr w:type="spellEnd"/>
-            <w:r>
-              <w:rPr>
-                <w:rFonts w:ascii="Times New Roman" w:hAnsi="Times New Roman"/>
-              </w:rPr>
-              <w:t xml:space="preserve"> and TensorFlow.</w:t>
-            </w:r>
-          </w:p>
-        </w:tc>
-      </w:tr>
-      <w:tr>
-        <w:trPr>
-          <w:cantSplit/>
-          <w:jc w:val="center"/>
-        </w:trPr>
-        <w:tc>
-          <w:tcPr>
-            <w:tcW w:w="850" w:type="dxa"/>
-          </w:tcPr>
-          <w:p>
-            <w:pPr>
-              <w:spacing w:before="40" w:after="40"/>
-              <w:jc w:val="center"/>
-            </w:pPr>
-            <w:r>
-              <w:rPr>
-                <w:rFonts w:ascii="Times New Roman" w:hAnsi="Times New Roman"/>
-              </w:rPr>
-              <w:t>4</w:t>
-            </w:r>
-          </w:p>
-        </w:tc>
-        <w:tc>
-          <w:tcPr>
-            <w:tcW w:w="2608" w:type="dxa"/>
-          </w:tcPr>
-          <w:p>
-            <w:pPr>
-              <w:spacing w:before="40" w:after="40"/>
-              <w:jc w:val="center"/>
-            </w:pPr>
-            <w:r>
-              <w:rPr>
-                <w:rFonts w:ascii="Times New Roman" w:hAnsi="Times New Roman"/>
-              </w:rPr>
-              <w:t>22 Jul - 28 Jul 2026</w:t>
-            </w:r>
-          </w:p>
-        </w:tc>
-        <w:tc>
-          <w:tcPr>
-            <w:tcW w:w="5386" w:type="dxa"/>
-          </w:tcPr>
-          <w:p>
-            <w:pPr>
-              <w:spacing w:before="40" w:after="40"/>
-            </w:pPr>
-            <w:r>
-              <w:rPr>
-                <w:rFonts w:ascii="Times New Roman" w:hAnsi="Times New Roman"/>
-              </w:rPr>
-              <w:t>Fine-tuning, hyperparameter optimisation and evaluation on held-out data.</w:t>
-            </w:r>
-          </w:p>
-        </w:tc>
-      </w:tr>
-      <w:tr>
-        <w:trPr>
-          <w:cantSplit/>
-          <w:jc w:val="center"/>
-        </w:trPr>
-        <w:tc>
-          <w:tcPr>
-            <w:tcW w:w="850" w:type="dxa"/>
-          </w:tcPr>
-          <w:p>
-            <w:pPr>
-              <w:spacing w:before="40" w:after="40"/>
-              <w:jc w:val="center"/>
-            </w:pPr>
-            <w:r>
-              <w:rPr>
-                <w:rFonts w:ascii="Times New Roman" w:hAnsi="Times New Roman"/>
-              </w:rPr>
-              <w:t>5</w:t>
-            </w:r>
-          </w:p>
-        </w:tc>
-        <w:tc>
-          <w:tcPr>
-            <w:tcW w:w="2608" w:type="dxa"/>
-          </w:tcPr>
-          <w:p>
-            <w:pPr>
-              <w:spacing w:before="40" w:after="40"/>
-              <w:jc w:val="center"/>
-            </w:pPr>
-            <w:r>
-              <w:rPr>
-                <w:rFonts w:ascii="Times New Roman" w:hAnsi="Times New Roman"/>
-              </w:rPr>
-              <w:t>29 Jul - 04 Aug 2026</w:t>
-            </w:r>
-          </w:p>
-        </w:tc>
-        <w:tc>
-          <w:tcPr>
-            <w:tcW w:w="5386" w:type="dxa"/>
-          </w:tcPr>
-          <w:p>
-            <w:pPr>
-              <w:spacing w:before="40" w:after="40"/>
-            </w:pPr>
-            <w:r>
-              <w:rPr>
-                <w:rFonts w:ascii="Times New Roman" w:hAnsi="Times New Roman"/>
-              </w:rPr>
-              <w:t>Document loading, cleaning and chunking for the RAG pipeline.</w:t>
-            </w:r>
-          </w:p>
-        </w:tc>
-      </w:tr>
-      <w:tr>
-        <w:trPr>
-          <w:cantSplit/>
-          <w:jc w:val="center"/>
-        </w:trPr>
-        <w:tc>
-          <w:tcPr>
-            <w:tcW w:w="850" w:type="dxa"/>
-          </w:tcPr>
-          <w:p>
-            <w:pPr>
-              <w:spacing w:before="40" w:after="40"/>
-              <w:jc w:val="center"/>
-            </w:pPr>
-            <w:r>
-              <w:rPr>
-                <w:rFonts w:ascii="Times New Roman" w:hAnsi="Times New Roman"/>
-              </w:rPr>
-              <w:t>6</w:t>
-            </w:r>
-          </w:p>
-        </w:tc>
-        <w:tc>
-          <w:tcPr>
-            <w:tcW w:w="2608" w:type="dxa"/>
-          </w:tcPr>
-          <w:p>
-            <w:pPr>
-              <w:spacing w:before="40" w:after="40"/>
-              <w:jc w:val="center"/>
-            </w:pPr>
-            <w:r>
-              <w:rPr>
-                <w:rFonts w:ascii="Times New Roman" w:hAnsi="Times New Roman"/>
-              </w:rPr>
-              <w:t>05 Aug - 11 Aug 2026</w:t>
-            </w:r>
-          </w:p>
-        </w:tc>
-        <w:tc>
-          <w:tcPr>
-            <w:tcW w:w="5386" w:type="dxa"/>
-          </w:tcPr>
-          <w:p>
-            <w:pPr>
-              <w:spacing w:before="40" w:after="40"/>
-            </w:pPr>
-            <w:r>
-              <w:rPr>
-                <w:rFonts w:ascii="Times New Roman" w:hAnsi="Times New Roman"/>
-              </w:rPr>
-              <w:t>Embedding of passages and queries; indexing into the vector store.</w:t>
-            </w:r>
-          </w:p>
-        </w:tc>
-      </w:tr>
-      <w:tr>
-        <w:trPr>
-          <w:cantSplit/>
-          <w:jc w:val="center"/>
-        </w:trPr>
-        <w:tc>
-          <w:tcPr>
-            <w:tcW w:w="850" w:type="dxa"/>
-          </w:tcPr>
-          <w:p>
-            <w:pPr>
-              <w:spacing w:before="40" w:after="40"/>
-              <w:jc w:val="center"/>
-            </w:pPr>
-            <w:r>
-              <w:rPr>
-                <w:rFonts w:ascii="Times New Roman" w:hAnsi="Times New Roman"/>
-              </w:rPr>
-              <w:t>7</w:t>
-            </w:r>
-          </w:p>
-        </w:tc>
-        <w:tc>
-          <w:tcPr>
-            <w:tcW w:w="2608" w:type="dxa"/>
-          </w:tcPr>
-          <w:p>
-            <w:pPr>
-              <w:spacing w:before="40" w:after="40"/>
-              <w:jc w:val="center"/>
-            </w:pPr>
-            <w:r>
-              <w:rPr>
-                <w:rFonts w:ascii="Times New Roman" w:hAnsi="Times New Roman"/>
-              </w:rPr>
-              <w:t>12 Aug - 18 Aug 2026</w:t>
-            </w:r>
-          </w:p>
-        </w:tc>
-        <w:tc>
-          <w:tcPr>
-            <w:tcW w:w="5386" w:type="dxa"/>
-          </w:tcPr>
-          <w:p>
-            <w:pPr>
-              <w:spacing w:before="40" w:after="40"/>
-            </w:pPr>
-            <w:r>
-              <w:rPr>
-                <w:rFonts w:ascii="Times New Roman" w:hAnsi="Times New Roman"/>
-              </w:rPr>
-              <w:t>Semantic retrieval with top-k search and reranking; prompt assembly.</w:t>
-            </w:r>
-          </w:p>
-        </w:tc>
-      </w:tr>
-      <w:tr>
-        <w:trPr>
-          <w:cantSplit/>
-          <w:jc w:val="center"/>
-        </w:trPr>
-        <w:tc>
-          <w:tcPr>
-            <w:tcW w:w="850" w:type="dxa"/>
-          </w:tcPr>
-          <w:p>
-            <w:pPr>
-              <w:spacing w:before="40" w:after="40"/>
-              <w:jc w:val="center"/>
-            </w:pPr>
-            <w:r>
-              <w:rPr>
-                <w:rFonts w:ascii="Times New Roman" w:hAnsi="Times New Roman"/>
-              </w:rPr>
-              <w:t>8</w:t>
-            </w:r>
-          </w:p>
-        </w:tc>
-        <w:tc>
-          <w:tcPr>
-            <w:tcW w:w="2608" w:type="dxa"/>
-          </w:tcPr>
-          <w:p>
-            <w:pPr>
-              <w:spacing w:before="40" w:after="40"/>
-              <w:jc w:val="center"/>
-            </w:pPr>
-            <w:r>
-              <w:rPr>
-                <w:rFonts w:ascii="Times New Roman" w:hAnsi="Times New Roman"/>
-              </w:rPr>
-              <w:t>19 Aug - 25 Aug 2026</w:t>
-            </w:r>
-          </w:p>
-        </w:tc>
-        <w:tc>
-          <w:tcPr>
-            <w:tcW w:w="5386" w:type="dxa"/>
-          </w:tcPr>
-          <w:p>
-            <w:pPr>
-              <w:spacing w:before="40" w:after="40"/>
-            </w:pPr>
-            <w:r>
-              <w:rPr>
-                <w:rFonts w:ascii="Times New Roman" w:hAnsi="Times New Roman"/>
-              </w:rPr>
-              <w:t>Grounded answer generation with citations; REST API integration with the chat orchestrator.</w:t>
-            </w:r>
-          </w:p>
-        </w:tc>
-      </w:tr>
-      <w:tr>
-        <w:trPr>
-          <w:cantSplit/>
-          <w:jc w:val="center"/>
-        </w:trPr>
-        <w:tc>
-          <w:tcPr>
-            <w:tcW w:w="850" w:type="dxa"/>
-          </w:tcPr>
-          <w:p>
-            <w:pPr>
-              <w:spacing w:before="40" w:after="40"/>
-              <w:jc w:val="center"/>
-            </w:pPr>
-            <w:r>
-              <w:rPr>
-                <w:rFonts w:ascii="Times New Roman" w:hAnsi="Times New Roman"/>
-              </w:rPr>
-              <w:t>9</w:t>
-            </w:r>
-          </w:p>
-        </w:tc>
-        <w:tc>
-          <w:tcPr>
-            <w:tcW w:w="2608" w:type="dxa"/>
-          </w:tcPr>
-          <w:p>
-            <w:pPr>
-              <w:spacing w:before="40" w:after="40"/>
-              <w:jc w:val="center"/>
-            </w:pPr>
-            <w:r>
-              <w:rPr>
-                <w:rFonts w:ascii="Times New Roman" w:hAnsi="Times New Roman"/>
-              </w:rPr>
-              <w:t>26 Aug - 01 Sep 2026</w:t>
-            </w:r>
-          </w:p>
-        </w:tc>
-        <w:tc>
-          <w:tcPr>
-            <w:tcW w:w="5386" w:type="dxa"/>
-          </w:tcPr>
-          <w:p>
-            <w:pPr>
-              <w:spacing w:before="40" w:after="40"/>
-            </w:pPr>
-            <w:r>
-              <w:rPr>
-                <w:rFonts w:ascii="Times New Roman" w:hAnsi="Times New Roman"/>
-              </w:rPr>
-              <w:t>Testing, retrieval-quality improvement, feedback and logging, and final handover of work.</w:t>
-            </w:r>
-          </w:p>
-        </w:tc>
-      </w:tr>
-    </w:tbl>
-    <w:p>
-      <w:pPr>
-        <w:spacing w:after="0"/>
-        <w:jc w:val="both"/>
-      </w:pPr>
-    </w:p>
-    <w:p>
-      <w:pPr>
-        <w:keepNext xmlns:a="http://schemas.openxmlformats.org/drawingml/2006/main" xmlns:pic="http://schemas.openxmlformats.org/drawingml/2006/picture"/>
-        <w:jc w:val="both"/>
-      </w:pPr>
-      <w:r>
-        <w:rPr>
-          <w:rFonts w:ascii="Times New Roman" w:hAnsi="Times New Roman"/>
-          <w:b/>
-          <w:sz w:val="28"/>
-        </w:rPr>
-        <w:t>Appendix D - Industry Mentor Evaluation</w:t>
-      </w:r>
-    </w:p>
-    <w:p>
-      <w:pPr>
-        <w:jc w:val="both"/>
-      </w:pPr>
-      <w:r>
-        <w:rPr>
-          <w:rFonts w:ascii="Times New Roman" w:hAnsi="Times New Roman"/>
-          <w:sz w:val="28"/>
-        </w:rPr>
-        <w:lastRenderedPageBreak/>
-        <w:t>Industry mentor Karthikeyan, Software Developer, guided requirement understanding, technical problem approaches and implementation quality, with interaction for technical clarification, code-related guidance and project feedback.</w:t>
-      </w:r>
-    </w:p>
-    <w:p>
-      <w:pPr>
-        <w:jc w:val="center"/>
-      </w:pPr>
-      <w:r>
-        <w:rPr>
-          <w:rFonts w:ascii="Times New Roman" w:hAnsi="Times New Roman"/>
-          <w:i/>
-          <w:sz w:val="24"/>
-        </w:rPr>
-        <w:t>Table 3: Areas of guidance from the industry mentor</w:t>
-      </w:r>
-    </w:p>
-    <w:tbl>
-      <w:tblPr>
-        <w:tblStyle w:val="TableGrid"/>
-        <w:tblW w:w="0" w:type="auto"/>
-        <w:jc w:val="center"/>
-        <w:tblLayout w:type="fixed"/>
-        <w:tblLook w:val="04A0" w:firstRow="1" w:lastRow="0" w:firstColumn="1" w:lastColumn="0" w:noHBand="0" w:noVBand="1"/>
-      </w:tblPr>
-      <w:tblGrid>
-        <w:gridCol w:w="2835"/>
-        <w:gridCol w:w="6009"/>
-      </w:tblGrid>
-      <w:tr>
-        <w:trPr>
-          <w:cantSplit/>
-          <w:tblHeader/>
-          <w:jc w:val="center"/>
-        </w:trPr>
-        <w:tc>
-          <w:tcPr>
-            <w:tcW w:w="2835" w:type="dxa"/>
-            <w:shd w:val="clear" w:color="auto" w:fill="D9D9D9"/>
-          </w:tcPr>
-          <w:p>
-            <w:pPr>
-              <w:spacing w:before="40" w:after="40"/>
-              <w:jc w:val="center"/>
-            </w:pPr>
-            <w:r>
-              <w:rPr>
-                <w:rFonts w:ascii="Times New Roman" w:hAnsi="Times New Roman"/>
-                <w:b/>
-                <w:sz w:val="22"/>
-              </w:rPr>
-              <w:t>Area</w:t>
-            </w:r>
-          </w:p>
-        </w:tc>
-        <w:tc>
-          <w:tcPr>
-            <w:tcW w:w="6009" w:type="dxa"/>
-            <w:shd w:val="clear" w:color="auto" w:fill="D9D9D9"/>
-          </w:tcPr>
-          <w:p>
-            <w:pPr>
-              <w:spacing w:before="40" w:after="40"/>
-              <w:jc w:val="center"/>
-            </w:pPr>
-            <w:r>
-              <w:rPr>
-                <w:rFonts w:ascii="Times New Roman" w:hAnsi="Times New Roman"/>
-                <w:b/>
-                <w:sz w:val="22"/>
-              </w:rPr>
-              <w:t>Guidance received</w:t>
-            </w:r>
-          </w:p>
-        </w:tc>
-      </w:tr>
-      <w:tr>
-        <w:trPr>
-          <w:cantSplit/>
-          <w:jc w:val="center"/>
-        </w:trPr>
-        <w:tc>
-          <w:tcPr>
-            <w:tcW w:w="2835" w:type="dxa"/>
-          </w:tcPr>
-          <w:p>
-            <w:pPr>
-              <w:spacing w:before="40" w:after="40"/>
-            </w:pPr>
-            <w:r>
-              <w:rPr>
-                <w:rFonts w:ascii="Times New Roman" w:hAnsi="Times New Roman"/>
-                <w:sz w:val="22"/>
-              </w:rPr>
-              <w:t>Understanding of requirements</w:t>
-            </w:r>
-          </w:p>
-        </w:tc>
-        <w:tc>
-          <w:tcPr>
-            <w:tcW w:w="6009" w:type="dxa"/>
-          </w:tcPr>
-          <w:p>
-            <w:pPr>
-              <w:spacing w:before="40" w:after="40"/>
-            </w:pPr>
-            <w:r>
-              <w:rPr>
-                <w:rFonts w:ascii="Times New Roman" w:hAnsi="Times New Roman"/>
-                <w:sz w:val="22"/>
-              </w:rPr>
-              <w:t>Guided the student in reading the product requirements and breaking them into reviewable units of work.</w:t>
-            </w:r>
-          </w:p>
-        </w:tc>
-      </w:tr>
-      <w:tr>
-        <w:trPr>
-          <w:cantSplit/>
-          <w:jc w:val="center"/>
-        </w:trPr>
-        <w:tc>
-          <w:tcPr>
-            <w:tcW w:w="2835" w:type="dxa"/>
-          </w:tcPr>
-          <w:p>
-            <w:pPr>
-              <w:spacing w:before="40" w:after="40"/>
-            </w:pPr>
-            <w:r>
-              <w:rPr>
-                <w:rFonts w:ascii="Times New Roman" w:hAnsi="Times New Roman"/>
-                <w:sz w:val="22"/>
-              </w:rPr>
-              <w:t>Technical problem approaches</w:t>
-            </w:r>
-          </w:p>
-        </w:tc>
-        <w:tc>
-          <w:tcPr>
-            <w:tcW w:w="6009" w:type="dxa"/>
-          </w:tcPr>
-          <w:p>
-            <w:pPr>
-              <w:spacing w:before="40" w:after="40"/>
-            </w:pPr>
-            <w:r>
-              <w:rPr>
-                <w:rFonts w:ascii="Times New Roman" w:hAnsi="Times New Roman"/>
-                <w:sz w:val="22"/>
-              </w:rPr>
-              <w:t>Advised on approaches to retrieval quality, chunking, embeddings and ranking, and on structuring model experiments.</w:t>
-            </w:r>
-          </w:p>
-        </w:tc>
-      </w:tr>
-      <w:tr>
-        <w:trPr>
-          <w:cantSplit/>
-          <w:jc w:val="center"/>
-        </w:trPr>
-        <w:tc>
-          <w:tcPr>
-            <w:tcW w:w="2835" w:type="dxa"/>
-          </w:tcPr>
-          <w:p>
-            <w:pPr>
-              <w:spacing w:before="40" w:after="40"/>
-            </w:pPr>
-            <w:r>
-              <w:rPr>
-                <w:rFonts w:ascii="Times New Roman" w:hAnsi="Times New Roman"/>
-                <w:sz w:val="22"/>
-              </w:rPr>
-              <w:t>Implementation quality</w:t>
-            </w:r>
-          </w:p>
-        </w:tc>
-        <w:tc>
-          <w:tcPr>
-            <w:tcW w:w="6009" w:type="dxa"/>
-          </w:tcPr>
-          <w:p>
-            <w:pPr>
-              <w:spacing w:before="40" w:after="40"/>
-            </w:pPr>
-            <w:r>
-              <w:rPr>
-                <w:rFonts w:ascii="Times New Roman" w:hAnsi="Times New Roman"/>
-                <w:sz w:val="22"/>
-              </w:rPr>
-              <w:t>Reviewed code before merge and gave feedback on structure, readability and error handling.</w:t>
-            </w:r>
-          </w:p>
-        </w:tc>
-      </w:tr>
-      <w:tr>
-        <w:trPr>
-          <w:cantSplit/>
-          <w:jc w:val="center"/>
-        </w:trPr>
-        <w:tc>
-          <w:tcPr>
-            <w:tcW w:w="2835" w:type="dxa"/>
-          </w:tcPr>
-          <w:p>
-            <w:pPr>
-              <w:spacing w:before="40" w:after="40"/>
-            </w:pPr>
-            <w:r>
-              <w:rPr>
-                <w:rFonts w:ascii="Times New Roman" w:hAnsi="Times New Roman"/>
-                <w:sz w:val="22"/>
-              </w:rPr>
-              <w:t>Technical clarification</w:t>
-            </w:r>
-          </w:p>
-        </w:tc>
-        <w:tc>
-          <w:tcPr>
-            <w:tcW w:w="6009" w:type="dxa"/>
-          </w:tcPr>
-          <w:p>
-            <w:pPr>
-              <w:spacing w:before="40" w:after="40"/>
-            </w:pPr>
-            <w:r>
-              <w:rPr>
-                <w:rFonts w:ascii="Times New Roman" w:hAnsi="Times New Roman"/>
-                <w:sz w:val="22"/>
-              </w:rPr>
-              <w:t>Available for questions and clarification throughout the internship.</w:t>
-            </w:r>
-          </w:p>
-        </w:tc>
-      </w:tr>
-      <w:tr>
-        <w:trPr>
-          <w:cantSplit/>
-          <w:jc w:val="center"/>
-        </w:trPr>
-        <w:tc>
-          <w:tcPr>
-            <w:tcW w:w="2835" w:type="dxa"/>
-          </w:tcPr>
-          <w:p>
-            <w:pPr>
-              <w:spacing w:before="40" w:after="40"/>
-            </w:pPr>
-            <w:r>
-              <w:rPr>
-                <w:rFonts w:ascii="Times New Roman" w:hAnsi="Times New Roman"/>
-                <w:sz w:val="22"/>
-              </w:rPr>
-              <w:t>Code-related guidance</w:t>
-            </w:r>
-          </w:p>
-        </w:tc>
-        <w:tc>
-          <w:tcPr>
-            <w:tcW w:w="6009" w:type="dxa"/>
-          </w:tcPr>
-          <w:p>
-            <w:pPr>
-              <w:spacing w:before="40" w:after="40"/>
-            </w:pPr>
-            <w:r>
-              <w:rPr>
-                <w:rFonts w:ascii="Times New Roman" w:hAnsi="Times New Roman"/>
-                <w:sz w:val="22"/>
-              </w:rPr>
-              <w:t>Guidance on Git and GitHub practice, branching, commits and review before merging.</w:t>
-            </w:r>
-          </w:p>
-        </w:tc>
-      </w:tr>
-      <w:tr>
-        <w:trPr>
-          <w:cantSplit/>
-          <w:jc w:val="center"/>
-        </w:trPr>
-        <w:tc>
-          <w:tcPr>
-            <w:tcW w:w="2835" w:type="dxa"/>
-          </w:tcPr>
-          <w:p>
-            <w:pPr>
-              <w:spacing w:before="40" w:after="40"/>
-            </w:pPr>
-            <w:r>
-              <w:rPr>
-                <w:rFonts w:ascii="Times New Roman" w:hAnsi="Times New Roman"/>
-                <w:sz w:val="22"/>
-              </w:rPr>
-              <w:t>Project feedback</w:t>
-            </w:r>
-          </w:p>
-        </w:tc>
-        <w:tc>
-          <w:tcPr>
-            <w:tcW w:w="6009" w:type="dxa"/>
-          </w:tcPr>
-          <w:p>
-            <w:pPr>
-              <w:spacing w:before="40" w:after="40"/>
-            </w:pPr>
-            <w:r>
-              <w:rPr>
-                <w:rFonts w:ascii="Times New Roman" w:hAnsi="Times New Roman"/>
-                <w:sz w:val="22"/>
-              </w:rPr>
-              <w:t>Regular feedback on progress of the RAG chatbot work and on the quality of the outputs.</w:t>
-            </w:r>
-          </w:p>
-        </w:tc>
-      </w:tr>
-    </w:tbl>
-    <w:p>
-      <w:pPr>
-        <w:spacing w:after="0"/>
-        <w:jc w:val="both"/>
-      </w:pPr>
-    </w:p>
-    <w:p>
-      <w:r>
-        <w:rPr>
-          <w:rFonts w:ascii="Times New Roman" w:hAnsi="Times New Roman"/>
-          <w:sz w:val="24"/>
-        </w:rPr>
-        <w:t xml:space="preserve">Mentor: Karthikeyan, Software Developer, </w:t>
-      </w:r>
-      <w:proofErr w:type="spellStart"/>
-      <w:r>
-        <w:rPr>
-          <w:rFonts w:ascii="Times New Roman" w:hAnsi="Times New Roman"/>
-          <w:sz w:val="24"/>
-        </w:rPr>
-        <w:t>Pyntree</w:t>
-      </w:r>
-      <w:proofErr w:type="spellEnd"/>
-      <w:r>
-        <w:rPr>
-          <w:rFonts w:ascii="Times New Roman" w:hAnsi="Times New Roman"/>
-          <w:sz w:val="24"/>
-        </w:rPr>
-        <w:t xml:space="preserve"> Technologies.</w:t>
-      </w:r>
-    </w:p>
-    <w:p>
-      <w:pPr>
-        <w:keepNext xmlns:a="http://schemas.openxmlformats.org/drawingml/2006/main" xmlns:pic="http://schemas.openxmlformats.org/drawingml/2006/picture"/>
-        <w:jc w:val="both"/>
-      </w:pPr>
-      <w:r>
-        <w:rPr>
-          <w:rFonts w:ascii="Times New Roman" w:hAnsi="Times New Roman"/>
-          <w:b/>
-          <w:sz w:val="28"/>
-        </w:rPr>
-        <w:t>Appendix E - Final Internship Presentation / Viva Record</w:t>
-      </w:r>
-    </w:p>
-    <w:p>
-      <w:pPr>
-        <w:jc w:val="both"/>
-      </w:pPr>
-      <w:r>
-        <w:rPr>
-          <w:rFonts w:ascii="Times New Roman" w:hAnsi="Times New Roman"/>
-          <w:sz w:val="28"/>
-        </w:rPr>
-        <w:t>The review meeting collected and verified the internship details, AI/ML training, software-development responsibilities, project involvement and practical learning. The student was advised to maintain proper records and continue developing the RAG chatbot based on the technical experience gained.</w:t>
-      </w:r>
-    </w:p>
-    <w:p>
-      <w:pPr>
-        <w:keepNext xmlns:a="http://schemas.openxmlformats.org/drawingml/2006/main" xmlns:pic="http://schemas.openxmlformats.org/drawingml/2006/picture"/>
-        <w:jc w:val="both"/>
-      </w:pPr>
-      <w:r>
-        <w:rPr>
-          <w:rFonts w:ascii="Times New Roman" w:hAnsi="Times New Roman"/>
-          <w:b/>
-          <w:sz w:val="28"/>
-        </w:rPr>
-        <w:t>Appendix F - Photographs, Screenshots and Project Evidence</w:t>
-      </w:r>
-    </w:p>
-    <w:p>
-      <w:pPr>
-        <w:jc w:val="both"/>
-      </w:pPr>
-      <w:r>
-        <w:rPr>
-          <w:rFonts w:ascii="Times New Roman" w:hAnsi="Times New Roman"/>
-          <w:sz w:val="28"/>
-        </w:rPr>
-        <w:t>Project evidence figures are included in Chapter 4 of this report (architecture, workflow/lifecycle and mind map), sourced from the internship project record.</w:t>
-      </w:r>
-    </w:p>
-    <w:p>
-      <w:pPr>
-        <w:jc w:val="center"/>
-      </w:pPr>
-      <w:r>
-        <w:rPr>
-          <w:noProof/>
-        </w:rPr>
-        <w:drawing>
-          <wp:inline distT="0" distB="0" distL="0" distR="0" wp14:anchorId="6D85A2BD" wp14:editId="3AC111BD">
-            <wp:extent cx="2527200" cy="2067709"/>
-            <wp:effectExtent l="0" t="0" r="0" b="0"/>
-            <wp:docPr id="57" name="Picture 57"/>
-            <wp:cNvGraphicFramePr>
-              <a:graphicFrameLocks xmlns:a="http://schemas.openxmlformats.org/drawingml/2006/main" noChangeAspect="1"/>
-            </wp:cNvGraphicFramePr>
-            <a:graphic xmlns:a="http://schemas.openxmlformats.org/drawingml/2006/main">
-              <a:graphicData uri="http://schemas.openxmlformats.org/drawingml/2006/picture">
-                <pic:pic xmlns:pic="http://schemas.openxmlformats.org/drawingml/2006/picture">
-                  <pic:nvPicPr>
-                    <pic:cNvPr id="0" name="renuka_p8_x13.png"/>
-                    <pic:cNvPicPr/>
-                  </pic:nvPicPr>
-                  <pic:blipFill>
-                    <a:blip r:embed="rId10"/>
-                    <a:stretch>
-                      <a:fillRect/>
-                    </a:stretch>
-                  </pic:blipFill>
-                  <pic:spPr>
-                    <a:xfrm>
-                      <a:off x="0" y="0"/>
-                      <a:ext cx="2527200" cy="2067709"/>
-                    </a:xfrm>
-                    <a:prstGeom prst="rect">
-                      <a:avLst/>
-                    </a:prstGeom>
-                  </pic:spPr>
-                </pic:pic>
-              </a:graphicData>
-            </a:graphic>
-          </wp:inline>
-        </w:drawing>
-      </w:r>
-    </w:p>
-    <w:p>
-      <w:pPr>
-        <w:jc w:val="center"/>
-      </w:pPr>
-      <w:r>
-        <w:rPr>
-          <w:rFonts w:ascii="Times New Roman" w:hAnsi="Times New Roman"/>
-          <w:i/>
-          <w:sz w:val="24"/>
-        </w:rPr>
-        <w:t>Figure 1: System architecture of the RAG chatbot</w:t>
-      </w:r>
-    </w:p>
-    <w:p>
-      <w:pPr>
-        <w:jc w:val="center"/>
-      </w:pPr>
-      <w:r>
-        <w:rPr>
-          <w:noProof/>
-        </w:rPr>
-        <w:lastRenderedPageBreak/>
-        <w:drawing>
-          <wp:inline distT="0" distB="0" distL="0" distR="0" wp14:anchorId="1BD25ADA" wp14:editId="6FF412D7">
-            <wp:extent cx="3790800" cy="1137240"/>
-            <wp:effectExtent l="0" t="0" r="0" b="0"/>
-            <wp:docPr id="58" name="Picture 58"/>
-            <wp:cNvGraphicFramePr>
-              <a:graphicFrameLocks xmlns:a="http://schemas.openxmlformats.org/drawingml/2006/main" noChangeAspect="1"/>
-            </wp:cNvGraphicFramePr>
-            <a:graphic xmlns:a="http://schemas.openxmlformats.org/drawingml/2006/main">
-              <a:graphicData uri="http://schemas.openxmlformats.org/drawingml/2006/picture">
-                <pic:pic xmlns:pic="http://schemas.openxmlformats.org/drawingml/2006/picture">
-                  <pic:nvPicPr>
-                    <pic:cNvPr id="0" name="renuka_p9_x16.png"/>
-                    <pic:cNvPicPr/>
-                  </pic:nvPicPr>
-                  <pic:blipFill>
-                    <a:blip r:embed="rId11"/>
-                    <a:stretch>
-                      <a:fillRect/>
-                    </a:stretch>
-                  </pic:blipFill>
-                  <pic:spPr>
-                    <a:xfrm>
-                      <a:off x="0" y="0"/>
-                      <a:ext cx="3790800" cy="1137240"/>
-                    </a:xfrm>
-                    <a:prstGeom prst="rect">
-                      <a:avLst/>
-                    </a:prstGeom>
-                  </pic:spPr>
-                </pic:pic>
-              </a:graphicData>
-            </a:graphic>
-          </wp:inline>
-        </w:drawing>
-      </w:r>
-    </w:p>
-    <w:p>
-      <w:pPr>
-        <w:jc w:val="center"/>
-      </w:pPr>
-      <w:r>
-        <w:rPr>
-          <w:rFonts w:ascii="Times New Roman" w:hAnsi="Times New Roman"/>
-          <w:i/>
-          <w:sz w:val="24"/>
-        </w:rPr>
-        <w:t>Figure 2: Retrieval-augmented query lifecycle</w:t>
-      </w:r>
-    </w:p>
-    <w:p>
-      <w:pPr>
-        <w:jc w:val="center"/>
-      </w:pPr>
-      <w:r>
-        <w:rPr>
-          <w:noProof/>
-        </w:rPr>
-        <w:drawing>
-          <wp:inline distT="0" distB="0" distL="0" distR="0" wp14:anchorId="0183C469" wp14:editId="37129ED3">
-            <wp:extent cx="2414880" cy="2195345"/>
-            <wp:effectExtent l="0" t="0" r="0" b="0"/>
-            <wp:docPr id="59" name="Picture 59"/>
-            <wp:cNvGraphicFramePr>
-              <a:graphicFrameLocks xmlns:a="http://schemas.openxmlformats.org/drawingml/2006/main" noChangeAspect="1"/>
-            </wp:cNvGraphicFramePr>
-            <a:graphic xmlns:a="http://schemas.openxmlformats.org/drawingml/2006/main">
-              <a:graphicData uri="http://schemas.openxmlformats.org/drawingml/2006/picture">
-                <pic:pic xmlns:pic="http://schemas.openxmlformats.org/drawingml/2006/picture">
-                  <pic:nvPicPr>
-                    <pic:cNvPr id="0" name="renuka_p10_x19.png"/>
-                    <pic:cNvPicPr/>
-                  </pic:nvPicPr>
-                  <pic:blipFill>
-                    <a:blip r:embed="rId12"/>
-                    <a:stretch>
-                      <a:fillRect/>
-                    </a:stretch>
-                  </pic:blipFill>
-                  <pic:spPr>
-                    <a:xfrm>
-                      <a:off x="0" y="0"/>
-                      <a:ext cx="2414880" cy="2195345"/>
-                    </a:xfrm>
-                    <a:prstGeom prst="rect">
-                      <a:avLst/>
-                    </a:prstGeom>
-                  </pic:spPr>
-                </pic:pic>
-              </a:graphicData>
-            </a:graphic>
-          </wp:inline>
-        </w:drawing>
-      </w:r>
-    </w:p>
-    <w:p>
-      <w:pPr>
-        <w:jc w:val="center"/>
-      </w:pPr>
-      <w:r>
-        <w:rPr>
-          <w:rFonts w:ascii="Times New Roman" w:hAnsi="Times New Roman"/>
-          <w:i/>
-          <w:sz w:val="24"/>
-        </w:rPr>
-        <w:t>Figure 3: Mind map of internship activities and learning</w:t>
       </w:r>
     </w:p>
     <w:sectPr>

</xml_diff>

<commit_message>
Remove Anna University cover line and Declaration page; renumber index
Co-Authored-By: Claude Sonnet 5.5 <noreply@anthropic.com>
Claude-Session: https://claude.ai/code/session_014qmguLz6rfSFg9e1TvRQwa
</commit_message>
<xml_diff>
--- a/Internship_Report_Renuka_S_RAG_Final.docx
+++ b/Internship_Report_Renuka_S_RAG_Final.docx
@@ -480,52 +480,6 @@
           <w:szCs w:val="28"/>
         </w:rPr>
         <w:t>DINDIGUL 624 002</w:t>
-      </w:r>
-    </w:p>
-    <w:p>
-      <w:pPr>
-        <w:keepNext xmlns:a="http://schemas.openxmlformats.org/drawingml/2006/main" xmlns:pic="http://schemas.openxmlformats.org/drawingml/2006/picture"/>
-        <w:spacing w:line="288" w:lineRule="auto"/>
-        <w:jc w:val="center"/>
-        <w:rPr>
-          <w:rFonts w:ascii="Times New Roman" w:hAnsi="Times New Roman" w:cs="Times New Roman"/>
-          <w:b/>
-          <w:bCs/>
-          <w:sz w:val="32"/>
-          <w:szCs w:val="32"/>
-        </w:rPr>
-      </w:pPr>
-      <w:r>
-        <w:rPr>
-          <w:rFonts w:ascii="Times New Roman" w:hAnsi="Times New Roman" w:cs="Times New Roman"/>
-          <w:b/>
-          <w:bCs/>
-          <w:sz w:val="32"/>
-          <w:szCs w:val="32"/>
-        </w:rPr>
-        <w:t xml:space="preserve">ANNA </w:t>
-      </w:r>
-      <w:proofErr w:type="gramStart"/>
-      <w:r>
-        <w:rPr>
-          <w:rFonts w:ascii="Times New Roman" w:hAnsi="Times New Roman" w:cs="Times New Roman"/>
-          <w:b/>
-          <w:bCs/>
-          <w:sz w:val="32"/>
-          <w:szCs w:val="32"/>
-        </w:rPr>
-        <w:t>UNIVERSITY::</w:t>
-      </w:r>
-      <w:proofErr w:type="gramEnd"/>
-      <w:r>
-        <w:rPr>
-          <w:rFonts w:ascii="Times New Roman" w:hAnsi="Times New Roman" w:cs="Times New Roman"/>
-          <w:b/>
-          <w:bCs/>
-          <w:sz w:val="32"/>
-          <w:szCs w:val="32"/>
-        </w:rPr>
-        <w:t>CHENNAI 600 025</w:t>
       </w:r>
     </w:p>
     <w:p>
@@ -1236,131 +1190,6 @@
       <w:pPr>
         <w:keepNext xmlns:a="http://schemas.openxmlformats.org/drawingml/2006/main" xmlns:pic="http://schemas.openxmlformats.org/drawingml/2006/picture"/>
         <w:pageBreakBefore/>
-        <w:jc w:val="center"/>
-      </w:pPr>
-      <w:r>
-        <w:rPr>
-          <w:rFonts w:ascii="Times New Roman" w:hAnsi="Times New Roman"/>
-          <w:b/>
-          <w:sz w:val="28"/>
-        </w:rPr>
-        <w:lastRenderedPageBreak/>
-        <w:t>DECLARATION</w:t>
-      </w:r>
-    </w:p>
-    <w:p>
-      <w:pPr>
-        <w:jc w:val="both"/>
-        <w:rPr>
-          <w:rFonts w:ascii="Times New Roman" w:hAnsi="Times New Roman"/>
-          <w:sz w:val="28"/>
-        </w:rPr>
-      </w:pPr>
-      <w:r>
-        <w:rPr>
-          <w:rFonts w:ascii="Times New Roman" w:hAnsi="Times New Roman"/>
-          <w:sz w:val="28"/>
-        </w:rPr>
-        <w:t xml:space="preserve">I, Renuka S, declare that the work presented in this report is an authentic record of the internship carried out by me at </w:t>
-      </w:r>
-      <w:proofErr w:type="spellStart"/>
-      <w:r>
-        <w:rPr>
-          <w:rFonts w:ascii="Times New Roman" w:hAnsi="Times New Roman"/>
-          <w:sz w:val="28"/>
-        </w:rPr>
-        <w:t>Pyntree</w:t>
-      </w:r>
-      <w:proofErr w:type="spellEnd"/>
-      <w:r>
-        <w:rPr>
-          <w:rFonts w:ascii="Times New Roman" w:hAnsi="Times New Roman"/>
-          <w:sz w:val="28"/>
-        </w:rPr>
-        <w:t xml:space="preserve"> Technologies between 01 July 2026 and 01 September 2026. The technical details, project description and learning outcomes described here reflect my own work and observations, and are consistent with the departmental review meeting record dated 17.08.2026. In keeping with the confidentiality expected of the engagement, no proprietary source code, model weights or internal dataset belonging to </w:t>
-      </w:r>
-      <w:proofErr w:type="spellStart"/>
-      <w:r>
-        <w:rPr>
-          <w:rFonts w:ascii="Times New Roman" w:hAnsi="Times New Roman"/>
-          <w:sz w:val="28"/>
-        </w:rPr>
-        <w:t>Pyntree</w:t>
-      </w:r>
-      <w:proofErr w:type="spellEnd"/>
-      <w:r>
-        <w:rPr>
-          <w:rFonts w:ascii="Times New Roman" w:hAnsi="Times New Roman"/>
-          <w:sz w:val="28"/>
-        </w:rPr>
-        <w:t xml:space="preserve"> Technologies has been reproduced in this report; the discussion is limited to design, architecture and learning.</w:t>
-      </w:r>
-    </w:p>
-    <w:p xmlns:a="http://schemas.openxmlformats.org/drawingml/2006/main" xmlns:pic="http://schemas.openxmlformats.org/drawingml/2006/picture">
-      <w:pPr>
-        <w:jc w:val="both"/>
-      </w:pPr>
-      <w:r>
-        <w:rPr>
-          <w:rFonts w:ascii="Times New Roman" w:hAnsi="Times New Roman"/>
-          <w:sz w:val="28"/>
-        </w:rPr>
-        <w:t xml:space="preserve">I further declare that this report has not been submitted, in whole or in part, to any other university or institution for the award of any degree, diploma or certificate. Wherever the ideas, figures or statements of other sources have been used, they have been acknowledged in the references. The report has been prepared in accordance with the format prescribed by the department for industry internship reports.</w:t>
-      </w:r>
-    </w:p>
-    <w:p>
-      <w:pPr>
-        <w:jc w:val="both"/>
-      </w:pPr>
-    </w:p>
-    <w:p>
-      <w:pPr>
-        <w:jc w:val="both"/>
-        <w:rPr>
-          <w:rFonts w:ascii="Times New Roman" w:hAnsi="Times New Roman"/>
-          <w:sz w:val="28"/>
-        </w:rPr>
-      </w:pPr>
-      <w:r>
-        <w:rPr>
-          <w:rFonts w:ascii="Times New Roman" w:hAnsi="Times New Roman"/>
-          <w:sz w:val="28"/>
-        </w:rPr>
-        <w:t xml:space="preserve">Place: </w:t>
-      </w:r>
-      <w:proofErr w:type="spellStart"/>
-      <w:r>
-        <w:rPr>
-          <w:rFonts w:ascii="Times New Roman" w:hAnsi="Times New Roman"/>
-          <w:sz w:val="28"/>
-        </w:rPr>
-        <w:t>Dindigul</w:t>
-      </w:r>
-      <w:proofErr w:type="spellEnd"/>
-      <w:r>
-        <w:rPr>
-          <w:rFonts w:ascii="Times New Roman" w:hAnsi="Times New Roman"/>
-          <w:sz w:val="28"/>
-        </w:rPr>
-        <w:t xml:space="preserve">    </w:t>
-      </w:r>
-    </w:p>
-    <w:p>
-      <w:pPr>
-        <w:jc w:val="both"/>
-      </w:pPr>
-      <w:r>
-        <w:rPr>
-          <w:rFonts w:ascii="Times New Roman" w:hAnsi="Times New Roman"/>
-          <w:sz w:val="28"/>
-        </w:rPr>
-        <w:t>Date: ____________________</w:t>
-      </w:r>
-    </w:p>
-    <w:p>
-      <w:pPr>
-        <w:keepNext xmlns:a="http://schemas.openxmlformats.org/drawingml/2006/main" xmlns:pic="http://schemas.openxmlformats.org/drawingml/2006/picture"/>
-        <w:pageBreakBefore/>
         <w:spacing w:line="360" w:lineRule="auto"/>
         <w:jc w:val="center"/>
         <w:rPr>
@@ -2040,7 +1869,7 @@
                 <w:sz w:val="28"/>
                 <w:szCs w:val="28"/>
               </w:rPr>
-              <w:t>3</w:t>
+              <w:t xml:space="preserve">3</w:t>
             </w:r>
           </w:p>
         </w:tc>
@@ -2064,7 +1893,7 @@
                 <w:sz w:val="28"/>
                 <w:szCs w:val="28"/>
               </w:rPr>
-              <w:t>Declaration</w:t>
+              <w:t>Acknowledgement</w:t>
             </w:r>
           </w:p>
         </w:tc>
@@ -2112,7 +1941,7 @@
                 <w:sz w:val="28"/>
                 <w:szCs w:val="28"/>
               </w:rPr>
-              <w:t>4</w:t>
+              <w:t xml:space="preserve">4</w:t>
             </w:r>
           </w:p>
         </w:tc>
@@ -2136,7 +1965,7 @@
                 <w:sz w:val="28"/>
                 <w:szCs w:val="28"/>
               </w:rPr>
-              <w:t>Acknowledgement</w:t>
+              <w:t>Executive Summary</w:t>
             </w:r>
           </w:p>
         </w:tc>
@@ -2154,7 +1983,7 @@
                 <w:rFonts w:ascii="Times New Roman" w:hAnsi="Times New Roman"/>
                 <w:sz w:val="28"/>
               </w:rPr>
-              <w:t xml:space="preserve">5</w:t>
+              <w:t xml:space="preserve">8</w:t>
             </w:r>
           </w:p>
         </w:tc>
@@ -2184,7 +2013,7 @@
                 <w:sz w:val="28"/>
                 <w:szCs w:val="28"/>
               </w:rPr>
-              <w:t>5</w:t>
+              <w:t xml:space="preserve">5</w:t>
             </w:r>
           </w:p>
         </w:tc>
@@ -2208,7 +2037,7 @@
                 <w:sz w:val="28"/>
                 <w:szCs w:val="28"/>
               </w:rPr>
-              <w:t>Executive Summary</w:t>
+              <w:t>List of Figures</w:t>
             </w:r>
           </w:p>
         </w:tc>
@@ -2256,7 +2085,7 @@
                 <w:sz w:val="28"/>
                 <w:szCs w:val="28"/>
               </w:rPr>
-              <w:t>6</w:t>
+              <w:t xml:space="preserve">6</w:t>
             </w:r>
           </w:p>
         </w:tc>
@@ -2280,7 +2109,7 @@
                 <w:sz w:val="28"/>
                 <w:szCs w:val="28"/>
               </w:rPr>
-              <w:t>List of Figures</w:t>
+              <w:t>List of Tables</w:t>
             </w:r>
           </w:p>
         </w:tc>
@@ -2298,7 +2127,7 @@
                 <w:rFonts w:ascii="Times New Roman" w:hAnsi="Times New Roman"/>
                 <w:sz w:val="28"/>
               </w:rPr>
-              <w:t xml:space="preserve">10</w:t>
+              <w:t xml:space="preserve">9</w:t>
             </w:r>
           </w:p>
         </w:tc>
@@ -2328,7 +2157,7 @@
                 <w:sz w:val="28"/>
                 <w:szCs w:val="28"/>
               </w:rPr>
-              <w:t>7</w:t>
+              <w:t xml:space="preserve">7</w:t>
             </w:r>
           </w:p>
         </w:tc>
@@ -2352,7 +2181,7 @@
                 <w:sz w:val="28"/>
                 <w:szCs w:val="28"/>
               </w:rPr>
-              <w:t>List of Tables</w:t>
+              <w:t>Abbreviations / Acronyms</w:t>
             </w:r>
           </w:p>
         </w:tc>
@@ -2370,7 +2199,7 @@
                 <w:rFonts w:ascii="Times New Roman" w:hAnsi="Times New Roman"/>
                 <w:sz w:val="28"/>
               </w:rPr>
-              <w:t xml:space="preserve">10</w:t>
+              <w:t xml:space="preserve">9</w:t>
             </w:r>
           </w:p>
         </w:tc>
@@ -2397,10 +2226,11 @@
             <w:r>
               <w:rPr>
                 <w:rFonts w:ascii="Times New Roman" w:hAnsi="Times New Roman" w:cs="Times New Roman"/>
-                <w:sz w:val="28"/>
-                <w:szCs w:val="28"/>
-              </w:rPr>
-              <w:t>8</w:t>
+                <w:b/>
+                <w:sz w:val="28"/>
+                <w:szCs w:val="28"/>
+              </w:rPr>
+              <w:t xml:space="preserve">8</w:t>
             </w:r>
           </w:p>
         </w:tc>
@@ -2420,11 +2250,12 @@
             </w:pPr>
             <w:r>
               <w:rPr>
-                <w:rFonts w:ascii="Times New Roman" w:hAnsi="Times New Roman" w:cs="Times New Roman"/>
-                <w:sz w:val="28"/>
-                <w:szCs w:val="28"/>
-              </w:rPr>
-              <w:t>Abbreviations / Acronyms</w:t>
+                <w:rStyle w:val="Strong"/>
+                <w:rFonts w:ascii="Times New Roman" w:hAnsi="Times New Roman" w:cs="Times New Roman"/>
+                <w:sz w:val="28"/>
+                <w:szCs w:val="28"/>
+              </w:rPr>
+              <w:t>Chapter 1 – Introduction</w:t>
             </w:r>
           </w:p>
         </w:tc>
@@ -2469,11 +2300,10 @@
             <w:r>
               <w:rPr>
                 <w:rFonts w:ascii="Times New Roman" w:hAnsi="Times New Roman" w:cs="Times New Roman"/>
-                <w:b/>
-                <w:sz w:val="28"/>
-                <w:szCs w:val="28"/>
-              </w:rPr>
-              <w:t>9</w:t>
+                <w:sz w:val="28"/>
+                <w:szCs w:val="28"/>
+              </w:rPr>
+              <w:t xml:space="preserve">8.1</w:t>
             </w:r>
           </w:p>
         </w:tc>
@@ -2493,12 +2323,11 @@
             </w:pPr>
             <w:r>
               <w:rPr>
-                <w:rStyle w:val="Strong"/>
-                <w:rFonts w:ascii="Times New Roman" w:hAnsi="Times New Roman" w:cs="Times New Roman"/>
-                <w:sz w:val="28"/>
-                <w:szCs w:val="28"/>
-              </w:rPr>
-              <w:t>Chapter 1 – Introduction</w:t>
+                <w:rFonts w:ascii="Times New Roman" w:hAnsi="Times New Roman" w:cs="Times New Roman"/>
+                <w:sz w:val="28"/>
+                <w:szCs w:val="28"/>
+              </w:rPr>
+              <w:t>Background</w:t>
             </w:r>
           </w:p>
         </w:tc>
@@ -2516,7 +2345,7 @@
                 <w:rFonts w:ascii="Times New Roman" w:hAnsi="Times New Roman"/>
                 <w:sz w:val="28"/>
               </w:rPr>
-              <w:t xml:space="preserve">11</w:t>
+              <w:t xml:space="preserve">10</w:t>
             </w:r>
           </w:p>
         </w:tc>
@@ -2546,7 +2375,7 @@
                 <w:sz w:val="28"/>
                 <w:szCs w:val="28"/>
               </w:rPr>
-              <w:t>9.1</w:t>
+              <w:t xml:space="preserve">8.2</w:t>
             </w:r>
           </w:p>
         </w:tc>
@@ -2570,7 +2399,7 @@
                 <w:sz w:val="28"/>
                 <w:szCs w:val="28"/>
               </w:rPr>
-              <w:t>Background</w:t>
+              <w:t>Internship Overview</w:t>
             </w:r>
           </w:p>
         </w:tc>
@@ -2588,7 +2417,7 @@
                 <w:rFonts w:ascii="Times New Roman" w:hAnsi="Times New Roman"/>
                 <w:sz w:val="28"/>
               </w:rPr>
-              <w:t xml:space="preserve">11</w:t>
+              <w:t xml:space="preserve">10</w:t>
             </w:r>
           </w:p>
         </w:tc>
@@ -2618,7 +2447,7 @@
                 <w:sz w:val="28"/>
                 <w:szCs w:val="28"/>
               </w:rPr>
-              <w:t>9.2</w:t>
+              <w:t xml:space="preserve">8.3</w:t>
             </w:r>
           </w:p>
         </w:tc>
@@ -2642,7 +2471,7 @@
                 <w:sz w:val="28"/>
                 <w:szCs w:val="28"/>
               </w:rPr>
-              <w:t>Internship Overview</w:t>
+              <w:t>Need and Purpose of the Internship</w:t>
             </w:r>
           </w:p>
         </w:tc>
@@ -2690,7 +2519,7 @@
                 <w:sz w:val="28"/>
                 <w:szCs w:val="28"/>
               </w:rPr>
-              <w:t>9.3</w:t>
+              <w:t xml:space="preserve">8.4</w:t>
             </w:r>
           </w:p>
         </w:tc>
@@ -2714,7 +2543,7 @@
                 <w:sz w:val="28"/>
                 <w:szCs w:val="28"/>
               </w:rPr>
-              <w:t>Need and Purpose of the Internship</w:t>
+              <w:t>Objectives of the Internship</w:t>
             </w:r>
           </w:p>
         </w:tc>
@@ -2762,7 +2591,7 @@
                 <w:sz w:val="28"/>
                 <w:szCs w:val="28"/>
               </w:rPr>
-              <w:t>9.4</w:t>
+              <w:t xml:space="preserve">8.5</w:t>
             </w:r>
           </w:p>
         </w:tc>
@@ -2786,7 +2615,7 @@
                 <w:sz w:val="28"/>
                 <w:szCs w:val="28"/>
               </w:rPr>
-              <w:t>Objectives of the Internship</w:t>
+              <w:t xml:space="preserve">Scope of the Report</w:t>
             </w:r>
           </w:p>
         </w:tc>
@@ -2831,10 +2660,11 @@
             <w:r>
               <w:rPr>
                 <w:rFonts w:ascii="Times New Roman" w:hAnsi="Times New Roman" w:cs="Times New Roman"/>
-                <w:sz w:val="28"/>
-                <w:szCs w:val="28"/>
-              </w:rPr>
-              <w:t>9.5</w:t>
+                <w:b/>
+                <w:sz w:val="28"/>
+                <w:szCs w:val="28"/>
+              </w:rPr>
+              <w:t xml:space="preserve">9</w:t>
             </w:r>
           </w:p>
         </w:tc>
@@ -2854,11 +2684,12 @@
             </w:pPr>
             <w:r>
               <w:rPr>
-                <w:rFonts w:ascii="Times New Roman" w:hAnsi="Times New Roman" w:cs="Times New Roman"/>
-                <w:sz w:val="28"/>
-                <w:szCs w:val="28"/>
-              </w:rPr>
-              <w:t xml:space="preserve">Scope of the Report</w:t>
+                <w:rStyle w:val="Strong"/>
+                <w:rFonts w:ascii="Times New Roman" w:hAnsi="Times New Roman" w:cs="Times New Roman"/>
+                <w:sz w:val="28"/>
+                <w:szCs w:val="28"/>
+              </w:rPr>
+              <w:t>Chapter 2 – Company Profile</w:t>
             </w:r>
           </w:p>
         </w:tc>
@@ -2876,7 +2707,7 @@
                 <w:rFonts w:ascii="Times New Roman" w:hAnsi="Times New Roman"/>
                 <w:sz w:val="28"/>
               </w:rPr>
-              <w:t xml:space="preserve">11</w:t>
+              <w:t xml:space="preserve">12</w:t>
             </w:r>
           </w:p>
         </w:tc>
@@ -2903,11 +2734,10 @@
             <w:r>
               <w:rPr>
                 <w:rFonts w:ascii="Times New Roman" w:hAnsi="Times New Roman" w:cs="Times New Roman"/>
-                <w:b/>
-                <w:sz w:val="28"/>
-                <w:szCs w:val="28"/>
-              </w:rPr>
-              <w:t>10</w:t>
+                <w:sz w:val="28"/>
+                <w:szCs w:val="28"/>
+              </w:rPr>
+              <w:t xml:space="preserve">9.1</w:t>
             </w:r>
           </w:p>
         </w:tc>
@@ -2927,12 +2757,11 @@
             </w:pPr>
             <w:r>
               <w:rPr>
-                <w:rStyle w:val="Strong"/>
-                <w:rFonts w:ascii="Times New Roman" w:hAnsi="Times New Roman" w:cs="Times New Roman"/>
-                <w:sz w:val="28"/>
-                <w:szCs w:val="28"/>
-              </w:rPr>
-              <w:t>Chapter 2 – Company Profile</w:t>
+                <w:rFonts w:ascii="Times New Roman" w:hAnsi="Times New Roman" w:cs="Times New Roman"/>
+                <w:sz w:val="28"/>
+                <w:szCs w:val="28"/>
+              </w:rPr>
+              <w:t>Company Introduction</w:t>
             </w:r>
           </w:p>
         </w:tc>
@@ -2980,7 +2809,7 @@
                 <w:sz w:val="28"/>
                 <w:szCs w:val="28"/>
               </w:rPr>
-              <w:t>10.1</w:t>
+              <w:t xml:space="preserve">9.2</w:t>
             </w:r>
           </w:p>
         </w:tc>
@@ -3004,7 +2833,7 @@
                 <w:sz w:val="28"/>
                 <w:szCs w:val="28"/>
               </w:rPr>
-              <w:t>Company Introduction</w:t>
+              <w:t>Vision and Mission</w:t>
             </w:r>
           </w:p>
         </w:tc>
@@ -3052,7 +2881,7 @@
                 <w:sz w:val="28"/>
                 <w:szCs w:val="28"/>
               </w:rPr>
-              <w:t>10.2</w:t>
+              <w:t xml:space="preserve">9.3</w:t>
             </w:r>
           </w:p>
         </w:tc>
@@ -3076,7 +2905,7 @@
                 <w:sz w:val="28"/>
                 <w:szCs w:val="28"/>
               </w:rPr>
-              <w:t>Vision and Mission</w:t>
+              <w:t>Products / Services</w:t>
             </w:r>
           </w:p>
         </w:tc>
@@ -3124,7 +2953,7 @@
                 <w:sz w:val="28"/>
                 <w:szCs w:val="28"/>
               </w:rPr>
-              <w:t>10.3</w:t>
+              <w:t xml:space="preserve">9.4</w:t>
             </w:r>
           </w:p>
         </w:tc>
@@ -3148,7 +2977,7 @@
                 <w:sz w:val="28"/>
                 <w:szCs w:val="28"/>
               </w:rPr>
-              <w:t>Products / Services</w:t>
+              <w:t>Industry Domain</w:t>
             </w:r>
           </w:p>
         </w:tc>
@@ -3196,7 +3025,7 @@
                 <w:sz w:val="28"/>
                 <w:szCs w:val="28"/>
               </w:rPr>
-              <w:t>10.4</w:t>
+              <w:t xml:space="preserve">9.5</w:t>
             </w:r>
           </w:p>
         </w:tc>
@@ -3220,7 +3049,7 @@
                 <w:sz w:val="28"/>
                 <w:szCs w:val="28"/>
               </w:rPr>
-              <w:t>Industry Domain</w:t>
+              <w:t>Department / Team Assigned</w:t>
             </w:r>
           </w:p>
         </w:tc>
@@ -3265,10 +3094,11 @@
             <w:r>
               <w:rPr>
                 <w:rFonts w:ascii="Times New Roman" w:hAnsi="Times New Roman" w:cs="Times New Roman"/>
-                <w:sz w:val="28"/>
-                <w:szCs w:val="28"/>
-              </w:rPr>
-              <w:t>10.5</w:t>
+                <w:b/>
+                <w:sz w:val="28"/>
+                <w:szCs w:val="28"/>
+              </w:rPr>
+              <w:t xml:space="preserve">10</w:t>
             </w:r>
           </w:p>
         </w:tc>
@@ -3288,11 +3118,12 @@
             </w:pPr>
             <w:r>
               <w:rPr>
-                <w:rFonts w:ascii="Times New Roman" w:hAnsi="Times New Roman" w:cs="Times New Roman"/>
-                <w:sz w:val="28"/>
-                <w:szCs w:val="28"/>
-              </w:rPr>
-              <w:t>Department / Team Assigned</w:t>
+                <w:rStyle w:val="Strong"/>
+                <w:rFonts w:ascii="Times New Roman" w:hAnsi="Times New Roman" w:cs="Times New Roman"/>
+                <w:sz w:val="28"/>
+                <w:szCs w:val="28"/>
+              </w:rPr>
+              <w:t>Chapter 3 – Internship Activities</w:t>
             </w:r>
           </w:p>
         </w:tc>
@@ -3310,7 +3141,7 @@
                 <w:rFonts w:ascii="Times New Roman" w:hAnsi="Times New Roman"/>
                 <w:sz w:val="28"/>
               </w:rPr>
-              <w:t xml:space="preserve">12</w:t>
+              <w:t xml:space="preserve">13</w:t>
             </w:r>
           </w:p>
         </w:tc>
@@ -3337,11 +3168,10 @@
             <w:r>
               <w:rPr>
                 <w:rFonts w:ascii="Times New Roman" w:hAnsi="Times New Roman" w:cs="Times New Roman"/>
-                <w:b/>
-                <w:sz w:val="28"/>
-                <w:szCs w:val="28"/>
-              </w:rPr>
-              <w:t>11</w:t>
+                <w:sz w:val="28"/>
+                <w:szCs w:val="28"/>
+              </w:rPr>
+              <w:t xml:space="preserve">10.1</w:t>
             </w:r>
           </w:p>
         </w:tc>
@@ -3361,12 +3191,11 @@
             </w:pPr>
             <w:r>
               <w:rPr>
-                <w:rStyle w:val="Strong"/>
-                <w:rFonts w:ascii="Times New Roman" w:hAnsi="Times New Roman" w:cs="Times New Roman"/>
-                <w:sz w:val="28"/>
-                <w:szCs w:val="28"/>
-              </w:rPr>
-              <w:t>Chapter 3 – Internship Activities</w:t>
+                <w:rFonts w:ascii="Times New Roman" w:hAnsi="Times New Roman" w:cs="Times New Roman"/>
+                <w:sz w:val="28"/>
+                <w:szCs w:val="28"/>
+              </w:rPr>
+              <w:t>Internship Plan</w:t>
             </w:r>
           </w:p>
         </w:tc>
@@ -3414,7 +3243,7 @@
                 <w:sz w:val="28"/>
                 <w:szCs w:val="28"/>
               </w:rPr>
-              <w:t>11.1</w:t>
+              <w:t xml:space="preserve">10.2</w:t>
             </w:r>
           </w:p>
         </w:tc>
@@ -3438,7 +3267,7 @@
                 <w:sz w:val="28"/>
                 <w:szCs w:val="28"/>
               </w:rPr>
-              <w:t>Internship Plan</w:t>
+              <w:t>Training Received</w:t>
             </w:r>
           </w:p>
         </w:tc>
@@ -3486,7 +3315,7 @@
                 <w:sz w:val="28"/>
                 <w:szCs w:val="28"/>
               </w:rPr>
-              <w:t>11.2</w:t>
+              <w:t xml:space="preserve">10.3</w:t>
             </w:r>
           </w:p>
         </w:tc>
@@ -3510,7 +3339,7 @@
                 <w:sz w:val="28"/>
                 <w:szCs w:val="28"/>
               </w:rPr>
-              <w:t>Training Received</w:t>
+              <w:t>Tasks and Responsibilities</w:t>
             </w:r>
           </w:p>
         </w:tc>
@@ -3558,7 +3387,8 @@
                 <w:sz w:val="28"/>
                 <w:szCs w:val="28"/>
               </w:rPr>
-              <w:t>11.3</w:t>
+              <w:lastRenderedPageBreak/>
+              <w:t xml:space="preserve">10.4</w:t>
             </w:r>
           </w:p>
         </w:tc>
@@ -3582,7 +3412,7 @@
                 <w:sz w:val="28"/>
                 <w:szCs w:val="28"/>
               </w:rPr>
-              <w:t>Tasks and Responsibilities</w:t>
+              <w:t>Technologies and Tools Used</w:t>
             </w:r>
           </w:p>
         </w:tc>
@@ -3600,7 +3430,7 @@
                 <w:rFonts w:ascii="Times New Roman" w:hAnsi="Times New Roman"/>
                 <w:sz w:val="28"/>
               </w:rPr>
-              <w:t xml:space="preserve">13</w:t>
+              <w:t xml:space="preserve">14</w:t>
             </w:r>
           </w:p>
         </w:tc>
@@ -3630,8 +3460,7 @@
                 <w:sz w:val="28"/>
                 <w:szCs w:val="28"/>
               </w:rPr>
-              <w:lastRenderedPageBreak/>
-              <w:t>11.4</w:t>
+              <w:t xml:space="preserve">10.5</w:t>
             </w:r>
           </w:p>
         </w:tc>
@@ -3655,7 +3484,7 @@
                 <w:sz w:val="28"/>
                 <w:szCs w:val="28"/>
               </w:rPr>
-              <w:t>Technologies and Tools Used</w:t>
+              <w:t>Weekly / Phase-wise Activities</w:t>
             </w:r>
           </w:p>
         </w:tc>
@@ -3703,7 +3532,7 @@
                 <w:sz w:val="28"/>
                 <w:szCs w:val="28"/>
               </w:rPr>
-              <w:t>11.5</w:t>
+              <w:t xml:space="preserve">10.6</w:t>
             </w:r>
           </w:p>
         </w:tc>
@@ -3727,7 +3556,7 @@
                 <w:sz w:val="28"/>
                 <w:szCs w:val="28"/>
               </w:rPr>
-              <w:t>Weekly / Phase-wise Activities</w:t>
+              <w:t>Team Collaboration</w:t>
             </w:r>
           </w:p>
         </w:tc>
@@ -3772,10 +3601,11 @@
             <w:r>
               <w:rPr>
                 <w:rFonts w:ascii="Times New Roman" w:hAnsi="Times New Roman" w:cs="Times New Roman"/>
-                <w:sz w:val="28"/>
-                <w:szCs w:val="28"/>
-              </w:rPr>
-              <w:t>11.6</w:t>
+                <w:b/>
+                <w:sz w:val="28"/>
+                <w:szCs w:val="28"/>
+              </w:rPr>
+              <w:t xml:space="preserve">11</w:t>
             </w:r>
           </w:p>
         </w:tc>
@@ -3795,11 +3625,12 @@
             </w:pPr>
             <w:r>
               <w:rPr>
-                <w:rFonts w:ascii="Times New Roman" w:hAnsi="Times New Roman" w:cs="Times New Roman"/>
-                <w:sz w:val="28"/>
-                <w:szCs w:val="28"/>
-              </w:rPr>
-              <w:t>Team Collaboration</w:t>
+                <w:rStyle w:val="Strong"/>
+                <w:rFonts w:ascii="Times New Roman" w:hAnsi="Times New Roman" w:cs="Times New Roman"/>
+                <w:sz w:val="28"/>
+                <w:szCs w:val="28"/>
+              </w:rPr>
+              <w:t>Chapter 4 – Major Project / Work Undertaken</w:t>
             </w:r>
           </w:p>
         </w:tc>
@@ -3817,7 +3648,7 @@
                 <w:rFonts w:ascii="Times New Roman" w:hAnsi="Times New Roman"/>
                 <w:sz w:val="28"/>
               </w:rPr>
-              <w:t xml:space="preserve">14</w:t>
+              <w:t xml:space="preserve">15</w:t>
             </w:r>
           </w:p>
         </w:tc>
@@ -3844,11 +3675,10 @@
             <w:r>
               <w:rPr>
                 <w:rFonts w:ascii="Times New Roman" w:hAnsi="Times New Roman" w:cs="Times New Roman"/>
-                <w:b/>
-                <w:sz w:val="28"/>
-                <w:szCs w:val="28"/>
-              </w:rPr>
-              <w:t>12</w:t>
+                <w:sz w:val="28"/>
+                <w:szCs w:val="28"/>
+              </w:rPr>
+              <w:t xml:space="preserve">11.1</w:t>
             </w:r>
           </w:p>
         </w:tc>
@@ -3868,12 +3698,11 @@
             </w:pPr>
             <w:r>
               <w:rPr>
-                <w:rStyle w:val="Strong"/>
-                <w:rFonts w:ascii="Times New Roman" w:hAnsi="Times New Roman" w:cs="Times New Roman"/>
-                <w:sz w:val="28"/>
-                <w:szCs w:val="28"/>
-              </w:rPr>
-              <w:t>Chapter 4 – Major Project / Work Undertaken</w:t>
+                <w:rFonts w:ascii="Times New Roman" w:hAnsi="Times New Roman" w:cs="Times New Roman"/>
+                <w:sz w:val="28"/>
+                <w:szCs w:val="28"/>
+              </w:rPr>
+              <w:t>Project Title</w:t>
             </w:r>
           </w:p>
         </w:tc>
@@ -3921,7 +3750,7 @@
                 <w:sz w:val="28"/>
                 <w:szCs w:val="28"/>
               </w:rPr>
-              <w:t>12.1</w:t>
+              <w:t xml:space="preserve">11.2</w:t>
             </w:r>
           </w:p>
         </w:tc>
@@ -3945,7 +3774,7 @@
                 <w:sz w:val="28"/>
                 <w:szCs w:val="28"/>
               </w:rPr>
-              <w:t>Project Title</w:t>
+              <w:t>Problem Statement</w:t>
             </w:r>
           </w:p>
         </w:tc>
@@ -3993,7 +3822,7 @@
                 <w:sz w:val="28"/>
                 <w:szCs w:val="28"/>
               </w:rPr>
-              <w:t>12.2</w:t>
+              <w:t xml:space="preserve">11.3</w:t>
             </w:r>
           </w:p>
         </w:tc>
@@ -4017,7 +3846,7 @@
                 <w:sz w:val="28"/>
                 <w:szCs w:val="28"/>
               </w:rPr>
-              <w:t>Problem Statement</w:t>
+              <w:t>Objectives</w:t>
             </w:r>
           </w:p>
         </w:tc>
@@ -4065,7 +3894,7 @@
                 <w:sz w:val="28"/>
                 <w:szCs w:val="28"/>
               </w:rPr>
-              <w:t>12.3</w:t>
+              <w:t xml:space="preserve">11.4</w:t>
             </w:r>
           </w:p>
         </w:tc>
@@ -4089,7 +3918,7 @@
                 <w:sz w:val="28"/>
                 <w:szCs w:val="28"/>
               </w:rPr>
-              <w:t>Objectives</w:t>
+              <w:t>Requirements</w:t>
             </w:r>
           </w:p>
         </w:tc>
@@ -4137,7 +3966,7 @@
                 <w:sz w:val="28"/>
                 <w:szCs w:val="28"/>
               </w:rPr>
-              <w:t>12.4</w:t>
+              <w:t xml:space="preserve">11.5</w:t>
             </w:r>
           </w:p>
         </w:tc>
@@ -4161,7 +3990,7 @@
                 <w:sz w:val="28"/>
                 <w:szCs w:val="28"/>
               </w:rPr>
-              <w:t>Requirements</w:t>
+              <w:t>Existing System / Approach</w:t>
             </w:r>
           </w:p>
         </w:tc>
@@ -4209,7 +4038,7 @@
                 <w:sz w:val="28"/>
                 <w:szCs w:val="28"/>
               </w:rPr>
-              <w:t>12.5</w:t>
+              <w:t xml:space="preserve">11.6</w:t>
             </w:r>
           </w:p>
         </w:tc>
@@ -4233,7 +4062,7 @@
                 <w:sz w:val="28"/>
                 <w:szCs w:val="28"/>
               </w:rPr>
-              <w:t>Existing System / Approach</w:t>
+              <w:t>Proposed Solution</w:t>
             </w:r>
           </w:p>
         </w:tc>
@@ -4281,7 +4110,7 @@
                 <w:sz w:val="28"/>
                 <w:szCs w:val="28"/>
               </w:rPr>
-              <w:t>12.6</w:t>
+              <w:t xml:space="preserve">11.7</w:t>
             </w:r>
           </w:p>
         </w:tc>
@@ -4305,7 +4134,7 @@
                 <w:sz w:val="28"/>
                 <w:szCs w:val="28"/>
               </w:rPr>
-              <w:t>Proposed Solution</w:t>
+              <w:t>Methodology</w:t>
             </w:r>
           </w:p>
         </w:tc>
@@ -4353,7 +4182,7 @@
                 <w:sz w:val="28"/>
                 <w:szCs w:val="28"/>
               </w:rPr>
-              <w:t>12.7</w:t>
+              <w:t xml:space="preserve">11.8</w:t>
             </w:r>
           </w:p>
         </w:tc>
@@ -4377,7 +4206,7 @@
                 <w:sz w:val="28"/>
                 <w:szCs w:val="28"/>
               </w:rPr>
-              <w:t>Methodology</w:t>
+              <w:t>System Architecture / Workflow</w:t>
             </w:r>
           </w:p>
         </w:tc>
@@ -4395,7 +4224,7 @@
                 <w:rFonts w:ascii="Times New Roman" w:hAnsi="Times New Roman"/>
                 <w:sz w:val="28"/>
               </w:rPr>
-              <w:t xml:space="preserve">15</w:t>
+              <w:t xml:space="preserve">16</w:t>
             </w:r>
           </w:p>
         </w:tc>
@@ -4425,7 +4254,7 @@
                 <w:sz w:val="28"/>
                 <w:szCs w:val="28"/>
               </w:rPr>
-              <w:t>12.8</w:t>
+              <w:t xml:space="preserve">11.9</w:t>
             </w:r>
           </w:p>
         </w:tc>
@@ -4449,7 +4278,7 @@
                 <w:sz w:val="28"/>
                 <w:szCs w:val="28"/>
               </w:rPr>
-              <w:t>System Architecture / Workflow</w:t>
+              <w:t>Modules / Components</w:t>
             </w:r>
           </w:p>
         </w:tc>
@@ -4467,7 +4296,7 @@
                 <w:rFonts w:ascii="Times New Roman" w:hAnsi="Times New Roman"/>
                 <w:sz w:val="28"/>
               </w:rPr>
-              <w:t xml:space="preserve">16</w:t>
+              <w:t xml:space="preserve">17</w:t>
             </w:r>
           </w:p>
         </w:tc>
@@ -4497,7 +4326,7 @@
                 <w:sz w:val="28"/>
                 <w:szCs w:val="28"/>
               </w:rPr>
-              <w:t>12.9</w:t>
+              <w:t xml:space="preserve">11.10</w:t>
             </w:r>
           </w:p>
         </w:tc>
@@ -4521,7 +4350,7 @@
                 <w:sz w:val="28"/>
                 <w:szCs w:val="28"/>
               </w:rPr>
-              <w:t>Modules / Components</w:t>
+              <w:t>Implementation</w:t>
             </w:r>
           </w:p>
         </w:tc>
@@ -4569,7 +4398,7 @@
                 <w:sz w:val="28"/>
                 <w:szCs w:val="28"/>
               </w:rPr>
-              <w:t>12.10</w:t>
+              <w:t xml:space="preserve">11.11</w:t>
             </w:r>
           </w:p>
         </w:tc>
@@ -4593,7 +4422,7 @@
                 <w:sz w:val="28"/>
                 <w:szCs w:val="28"/>
               </w:rPr>
-              <w:t>Implementation</w:t>
+              <w:t>Results and Outputs</w:t>
             </w:r>
           </w:p>
         </w:tc>
@@ -4641,7 +4470,7 @@
                 <w:sz w:val="28"/>
                 <w:szCs w:val="28"/>
               </w:rPr>
-              <w:t>12.11</w:t>
+              <w:t xml:space="preserve">11.12</w:t>
             </w:r>
           </w:p>
         </w:tc>
@@ -4665,7 +4494,7 @@
                 <w:sz w:val="28"/>
                 <w:szCs w:val="28"/>
               </w:rPr>
-              <w:t>Results and Outputs</w:t>
+              <w:t>Screenshots / Demonstration Evidence</w:t>
             </w:r>
           </w:p>
         </w:tc>
@@ -4683,7 +4512,7 @@
                 <w:rFonts w:ascii="Times New Roman" w:hAnsi="Times New Roman"/>
                 <w:sz w:val="28"/>
               </w:rPr>
-              <w:t xml:space="preserve">17</w:t>
+              <w:t xml:space="preserve">18</w:t>
             </w:r>
           </w:p>
         </w:tc>
@@ -4713,7 +4542,7 @@
                 <w:sz w:val="28"/>
                 <w:szCs w:val="28"/>
               </w:rPr>
-              <w:t>12.12</w:t>
+              <w:t xml:space="preserve">11.13</w:t>
             </w:r>
           </w:p>
         </w:tc>
@@ -4737,8 +4566,18 @@
                 <w:sz w:val="28"/>
                 <w:szCs w:val="28"/>
               </w:rPr>
-              <w:t>Screenshots / Demonstration Evidence</w:t>
-            </w:r>
+              <w:t xml:space="preserve">Additional Project for Reference: </w:t>
+            </w:r>
+            <w:proofErr w:type="spellStart"/>
+            <w:r>
+              <w:rPr>
+                <w:rFonts w:ascii="Times New Roman" w:hAnsi="Times New Roman" w:cs="Times New Roman"/>
+                <w:sz w:val="28"/>
+                <w:szCs w:val="28"/>
+              </w:rPr>
+              <w:t>LearnLock</w:t>
+            </w:r>
+            <w:proofErr w:type="spellEnd"/>
           </w:p>
         </w:tc>
         <w:tc>
@@ -4785,7 +4624,7 @@
                 <w:sz w:val="28"/>
                 <w:szCs w:val="28"/>
               </w:rPr>
-              <w:t>12.13</w:t>
+              <w:t xml:space="preserve">11.14</w:t>
             </w:r>
           </w:p>
         </w:tc>
@@ -4809,7 +4648,7 @@
                 <w:sz w:val="28"/>
                 <w:szCs w:val="28"/>
               </w:rPr>
-              <w:t xml:space="preserve">Additional Project for Reference: </w:t>
+              <w:t xml:space="preserve">Testing and Validation Approach</w:t>
             </w:r>
             <w:proofErr w:type="spellStart"/>
             <w:r>
@@ -4818,7 +4657,7 @@
                 <w:sz w:val="28"/>
                 <w:szCs w:val="28"/>
               </w:rPr>
-              <w:t>LearnLock</w:t>
+              <w:t/>
             </w:r>
             <w:proofErr w:type="spellEnd"/>
           </w:p>
@@ -4837,7 +4676,7 @@
                 <w:rFonts w:ascii="Times New Roman" w:hAnsi="Times New Roman"/>
                 <w:sz w:val="28"/>
               </w:rPr>
-              <w:t xml:space="preserve">18</w:t>
+              <w:t xml:space="preserve">21</w:t>
             </w:r>
           </w:p>
         </w:tc>
@@ -4864,10 +4703,11 @@
             <w:r>
               <w:rPr>
                 <w:rFonts w:ascii="Times New Roman" w:hAnsi="Times New Roman" w:cs="Times New Roman"/>
-                <w:sz w:val="28"/>
-                <w:szCs w:val="28"/>
-              </w:rPr>
-              <w:t xml:space="preserve">12.14</w:t>
+                <w:b/>
+                <w:sz w:val="28"/>
+                <w:szCs w:val="28"/>
+              </w:rPr>
+              <w:t xml:space="preserve">12</w:t>
             </w:r>
           </w:p>
         </w:tc>
@@ -4887,22 +4727,13 @@
             </w:pPr>
             <w:r>
               <w:rPr>
-                <w:rFonts w:ascii="Times New Roman" w:hAnsi="Times New Roman" w:cs="Times New Roman"/>
-                <w:sz w:val="28"/>
-                <w:szCs w:val="28"/>
-              </w:rPr>
-              <w:t xml:space="preserve">Testing and Validation Approach</w:t>
-            </w:r>
-            <w:proofErr w:type="spellStart"/>
-            <w:r>
-              <w:rPr>
-                <w:rFonts w:ascii="Times New Roman" w:hAnsi="Times New Roman" w:cs="Times New Roman"/>
-                <w:sz w:val="28"/>
-                <w:szCs w:val="28"/>
-              </w:rPr>
-              <w:t/>
-            </w:r>
-            <w:proofErr w:type="spellEnd"/>
+                <w:rStyle w:val="Strong"/>
+                <w:rFonts w:ascii="Times New Roman" w:hAnsi="Times New Roman" w:cs="Times New Roman"/>
+                <w:sz w:val="28"/>
+                <w:szCs w:val="28"/>
+              </w:rPr>
+              <w:t>Chapter 5 – Skills and Learning Outcomes</w:t>
+            </w:r>
           </w:p>
         </w:tc>
         <w:tc>
@@ -4919,7 +4750,7 @@
                 <w:rFonts w:ascii="Times New Roman" w:hAnsi="Times New Roman"/>
                 <w:sz w:val="28"/>
               </w:rPr>
-              <w:t xml:space="preserve">21</w:t>
+              <w:t xml:space="preserve">22</w:t>
             </w:r>
           </w:p>
         </w:tc>
@@ -4946,11 +4777,10 @@
             <w:r>
               <w:rPr>
                 <w:rFonts w:ascii="Times New Roman" w:hAnsi="Times New Roman" w:cs="Times New Roman"/>
-                <w:b/>
-                <w:sz w:val="28"/>
-                <w:szCs w:val="28"/>
-              </w:rPr>
-              <w:t>13</w:t>
+                <w:sz w:val="28"/>
+                <w:szCs w:val="28"/>
+              </w:rPr>
+              <w:t xml:space="preserve">12.1</w:t>
             </w:r>
           </w:p>
         </w:tc>
@@ -4970,12 +4800,11 @@
             </w:pPr>
             <w:r>
               <w:rPr>
-                <w:rStyle w:val="Strong"/>
-                <w:rFonts w:ascii="Times New Roman" w:hAnsi="Times New Roman" w:cs="Times New Roman"/>
-                <w:sz w:val="28"/>
-                <w:szCs w:val="28"/>
-              </w:rPr>
-              <w:t>Chapter 5 – Skills and Learning Outcomes</w:t>
+                <w:rFonts w:ascii="Times New Roman" w:hAnsi="Times New Roman" w:cs="Times New Roman"/>
+                <w:sz w:val="28"/>
+                <w:szCs w:val="28"/>
+              </w:rPr>
+              <w:t>Technical Skills</w:t>
             </w:r>
           </w:p>
         </w:tc>
@@ -5023,7 +4852,7 @@
                 <w:sz w:val="28"/>
                 <w:szCs w:val="28"/>
               </w:rPr>
-              <w:t>13.1</w:t>
+              <w:t xml:space="preserve">12.2</w:t>
             </w:r>
           </w:p>
         </w:tc>
@@ -5047,7 +4876,7 @@
                 <w:sz w:val="28"/>
                 <w:szCs w:val="28"/>
               </w:rPr>
-              <w:t>Technical Skills</w:t>
+              <w:t>Software / Tools / Platforms</w:t>
             </w:r>
           </w:p>
         </w:tc>
@@ -5095,7 +4924,7 @@
                 <w:sz w:val="28"/>
                 <w:szCs w:val="28"/>
               </w:rPr>
-              <w:t>13.2</w:t>
+              <w:t xml:space="preserve">12.3</w:t>
             </w:r>
           </w:p>
         </w:tc>
@@ -5119,7 +4948,7 @@
                 <w:sz w:val="28"/>
                 <w:szCs w:val="28"/>
               </w:rPr>
-              <w:t>Software / Tools / Platforms</w:t>
+              <w:t>AI / Cloud / Data Skills</w:t>
             </w:r>
           </w:p>
         </w:tc>
@@ -5167,7 +4996,7 @@
                 <w:sz w:val="28"/>
                 <w:szCs w:val="28"/>
               </w:rPr>
-              <w:t>13.3</w:t>
+              <w:t xml:space="preserve">12.4</w:t>
             </w:r>
           </w:p>
         </w:tc>
@@ -5191,7 +5020,7 @@
                 <w:sz w:val="28"/>
                 <w:szCs w:val="28"/>
               </w:rPr>
-              <w:t>AI / Cloud / Data Skills</w:t>
+              <w:t>Communication and Teamwork</w:t>
             </w:r>
           </w:p>
         </w:tc>
@@ -5239,7 +5068,7 @@
                 <w:sz w:val="28"/>
                 <w:szCs w:val="28"/>
               </w:rPr>
-              <w:t>13.4</w:t>
+              <w:t xml:space="preserve">12.5</w:t>
             </w:r>
           </w:p>
         </w:tc>
@@ -5263,7 +5092,7 @@
                 <w:sz w:val="28"/>
                 <w:szCs w:val="28"/>
               </w:rPr>
-              <w:t>Communication and Teamwork</w:t>
+              <w:t>Problem-Solving Skills</w:t>
             </w:r>
           </w:p>
         </w:tc>
@@ -5311,7 +5140,7 @@
                 <w:sz w:val="28"/>
                 <w:szCs w:val="28"/>
               </w:rPr>
-              <w:t>13.5</w:t>
+              <w:t xml:space="preserve">12.6</w:t>
             </w:r>
           </w:p>
         </w:tc>
@@ -5335,7 +5164,7 @@
                 <w:sz w:val="28"/>
                 <w:szCs w:val="28"/>
               </w:rPr>
-              <w:t>Problem-Solving Skills</w:t>
+              <w:t>Professional Learning</w:t>
             </w:r>
           </w:p>
         </w:tc>
@@ -5380,10 +5209,11 @@
             <w:r>
               <w:rPr>
                 <w:rFonts w:ascii="Times New Roman" w:hAnsi="Times New Roman" w:cs="Times New Roman"/>
-                <w:sz w:val="28"/>
-                <w:szCs w:val="28"/>
-              </w:rPr>
-              <w:t>13.6</w:t>
+                <w:b/>
+                <w:sz w:val="28"/>
+                <w:szCs w:val="28"/>
+              </w:rPr>
+              <w:t xml:space="preserve">13</w:t>
             </w:r>
           </w:p>
         </w:tc>
@@ -5403,11 +5233,12 @@
             </w:pPr>
             <w:r>
               <w:rPr>
-                <w:rFonts w:ascii="Times New Roman" w:hAnsi="Times New Roman" w:cs="Times New Roman"/>
-                <w:sz w:val="28"/>
-                <w:szCs w:val="28"/>
-              </w:rPr>
-              <w:t>Professional Learning</w:t>
+                <w:rStyle w:val="Strong"/>
+                <w:rFonts w:ascii="Times New Roman" w:hAnsi="Times New Roman" w:cs="Times New Roman"/>
+                <w:sz w:val="28"/>
+                <w:szCs w:val="28"/>
+              </w:rPr>
+              <w:t>Chapter 6 – Challenges and Solutions</w:t>
             </w:r>
           </w:p>
         </w:tc>
@@ -5425,7 +5256,7 @@
                 <w:rFonts w:ascii="Times New Roman" w:hAnsi="Times New Roman"/>
                 <w:sz w:val="28"/>
               </w:rPr>
-              <w:t xml:space="preserve">22</w:t>
+              <w:t xml:space="preserve">23</w:t>
             </w:r>
           </w:p>
         </w:tc>
@@ -5452,11 +5283,10 @@
             <w:r>
               <w:rPr>
                 <w:rFonts w:ascii="Times New Roman" w:hAnsi="Times New Roman" w:cs="Times New Roman"/>
-                <w:b/>
-                <w:sz w:val="28"/>
-                <w:szCs w:val="28"/>
-              </w:rPr>
-              <w:t>14</w:t>
+                <w:sz w:val="28"/>
+                <w:szCs w:val="28"/>
+              </w:rPr>
+              <w:t xml:space="preserve">13.1</w:t>
             </w:r>
           </w:p>
         </w:tc>
@@ -5476,12 +5306,11 @@
             </w:pPr>
             <w:r>
               <w:rPr>
-                <w:rStyle w:val="Strong"/>
-                <w:rFonts w:ascii="Times New Roman" w:hAnsi="Times New Roman" w:cs="Times New Roman"/>
-                <w:sz w:val="28"/>
-                <w:szCs w:val="28"/>
-              </w:rPr>
-              <w:t>Chapter 6 – Challenges and Solutions</w:t>
+                <w:rFonts w:ascii="Times New Roman" w:hAnsi="Times New Roman" w:cs="Times New Roman"/>
+                <w:sz w:val="28"/>
+                <w:szCs w:val="28"/>
+              </w:rPr>
+              <w:t>Technical Challenges</w:t>
             </w:r>
           </w:p>
         </w:tc>
@@ -5529,7 +5358,8 @@
                 <w:sz w:val="28"/>
                 <w:szCs w:val="28"/>
               </w:rPr>
-              <w:t>14.1</w:t>
+              <w:lastRenderedPageBreak/>
+              <w:t xml:space="preserve">13.2</w:t>
             </w:r>
           </w:p>
         </w:tc>
@@ -5553,7 +5383,7 @@
                 <w:sz w:val="28"/>
                 <w:szCs w:val="28"/>
               </w:rPr>
-              <w:t>Technical Challenges</w:t>
+              <w:t>Organizational / Team Challenges</w:t>
             </w:r>
           </w:p>
         </w:tc>
@@ -5601,8 +5431,7 @@
                 <w:sz w:val="28"/>
                 <w:szCs w:val="28"/>
               </w:rPr>
-              <w:lastRenderedPageBreak/>
-              <w:t>14.2</w:t>
+              <w:t xml:space="preserve">13.3</w:t>
             </w:r>
           </w:p>
         </w:tc>
@@ -5626,7 +5455,7 @@
                 <w:sz w:val="28"/>
                 <w:szCs w:val="28"/>
               </w:rPr>
-              <w:t>Organizational / Team Challenges</w:t>
+              <w:t>Solutions Adopted</w:t>
             </w:r>
           </w:p>
         </w:tc>
@@ -5674,7 +5503,7 @@
                 <w:sz w:val="28"/>
                 <w:szCs w:val="28"/>
               </w:rPr>
-              <w:t>14.3</w:t>
+              <w:t xml:space="preserve">13.4</w:t>
             </w:r>
           </w:p>
         </w:tc>
@@ -5698,7 +5527,7 @@
                 <w:sz w:val="28"/>
                 <w:szCs w:val="28"/>
               </w:rPr>
-              <w:t>Solutions Adopted</w:t>
+              <w:t>Key Lessons Learned</w:t>
             </w:r>
           </w:p>
         </w:tc>
@@ -5743,10 +5572,11 @@
             <w:r>
               <w:rPr>
                 <w:rFonts w:ascii="Times New Roman" w:hAnsi="Times New Roman" w:cs="Times New Roman"/>
-                <w:sz w:val="28"/>
-                <w:szCs w:val="28"/>
-              </w:rPr>
-              <w:t>14.4</w:t>
+                <w:b/>
+                <w:sz w:val="28"/>
+                <w:szCs w:val="28"/>
+              </w:rPr>
+              <w:t xml:space="preserve">14</w:t>
             </w:r>
           </w:p>
         </w:tc>
@@ -5766,11 +5596,12 @@
             </w:pPr>
             <w:r>
               <w:rPr>
-                <w:rFonts w:ascii="Times New Roman" w:hAnsi="Times New Roman" w:cs="Times New Roman"/>
-                <w:sz w:val="28"/>
-                <w:szCs w:val="28"/>
-              </w:rPr>
-              <w:t>Key Lessons Learned</w:t>
+                <w:rStyle w:val="Strong"/>
+                <w:rFonts w:ascii="Times New Roman" w:hAnsi="Times New Roman" w:cs="Times New Roman"/>
+                <w:sz w:val="28"/>
+                <w:szCs w:val="28"/>
+              </w:rPr>
+              <w:t>Chapter 7 – Professional Experience</w:t>
             </w:r>
           </w:p>
         </w:tc>
@@ -5788,7 +5619,7 @@
                 <w:rFonts w:ascii="Times New Roman" w:hAnsi="Times New Roman"/>
                 <w:sz w:val="28"/>
               </w:rPr>
-              <w:t xml:space="preserve">23</w:t>
+              <w:t xml:space="preserve">24</w:t>
             </w:r>
           </w:p>
         </w:tc>
@@ -5815,11 +5646,10 @@
             <w:r>
               <w:rPr>
                 <w:rFonts w:ascii="Times New Roman" w:hAnsi="Times New Roman" w:cs="Times New Roman"/>
-                <w:b/>
-                <w:sz w:val="28"/>
-                <w:szCs w:val="28"/>
-              </w:rPr>
-              <w:t>15</w:t>
+                <w:sz w:val="28"/>
+                <w:szCs w:val="28"/>
+              </w:rPr>
+              <w:t xml:space="preserve">14.1</w:t>
             </w:r>
           </w:p>
         </w:tc>
@@ -5839,12 +5669,11 @@
             </w:pPr>
             <w:r>
               <w:rPr>
-                <w:rStyle w:val="Strong"/>
-                <w:rFonts w:ascii="Times New Roman" w:hAnsi="Times New Roman" w:cs="Times New Roman"/>
-                <w:sz w:val="28"/>
-                <w:szCs w:val="28"/>
-              </w:rPr>
-              <w:t>Chapter 7 – Professional Experience</w:t>
+                <w:rFonts w:ascii="Times New Roman" w:hAnsi="Times New Roman" w:cs="Times New Roman"/>
+                <w:sz w:val="28"/>
+                <w:szCs w:val="28"/>
+              </w:rPr>
+              <w:t>Workplace Practices</w:t>
             </w:r>
           </w:p>
         </w:tc>
@@ -5892,7 +5721,7 @@
                 <w:sz w:val="28"/>
                 <w:szCs w:val="28"/>
               </w:rPr>
-              <w:t>15.1</w:t>
+              <w:t xml:space="preserve">14.2</w:t>
             </w:r>
           </w:p>
         </w:tc>
@@ -5916,7 +5745,7 @@
                 <w:sz w:val="28"/>
                 <w:szCs w:val="28"/>
               </w:rPr>
-              <w:t>Workplace Practices</w:t>
+              <w:t>Industry Standards</w:t>
             </w:r>
           </w:p>
         </w:tc>
@@ -5964,7 +5793,7 @@
                 <w:sz w:val="28"/>
                 <w:szCs w:val="28"/>
               </w:rPr>
-              <w:t>15.2</w:t>
+              <w:t xml:space="preserve">14.3</w:t>
             </w:r>
           </w:p>
         </w:tc>
@@ -5988,7 +5817,7 @@
                 <w:sz w:val="28"/>
                 <w:szCs w:val="28"/>
               </w:rPr>
-              <w:t>Industry Standards</w:t>
+              <w:t>Professional Ethics</w:t>
             </w:r>
           </w:p>
         </w:tc>
@@ -6036,7 +5865,7 @@
                 <w:sz w:val="28"/>
                 <w:szCs w:val="28"/>
               </w:rPr>
-              <w:t>15.3</w:t>
+              <w:t xml:space="preserve">14.4</w:t>
             </w:r>
           </w:p>
         </w:tc>
@@ -6060,7 +5889,7 @@
                 <w:sz w:val="28"/>
                 <w:szCs w:val="28"/>
               </w:rPr>
-              <w:t>Professional Ethics</w:t>
+              <w:t>Safety, Security and Data Practices</w:t>
             </w:r>
           </w:p>
         </w:tc>
@@ -6105,10 +5934,11 @@
             <w:r>
               <w:rPr>
                 <w:rFonts w:ascii="Times New Roman" w:hAnsi="Times New Roman" w:cs="Times New Roman"/>
-                <w:sz w:val="28"/>
-                <w:szCs w:val="28"/>
-              </w:rPr>
-              <w:t>15.4</w:t>
+                <w:b/>
+                <w:sz w:val="28"/>
+                <w:szCs w:val="28"/>
+              </w:rPr>
+              <w:t xml:space="preserve">15</w:t>
             </w:r>
           </w:p>
         </w:tc>
@@ -6128,11 +5958,12 @@
             </w:pPr>
             <w:r>
               <w:rPr>
-                <w:rFonts w:ascii="Times New Roman" w:hAnsi="Times New Roman" w:cs="Times New Roman"/>
-                <w:sz w:val="28"/>
-                <w:szCs w:val="28"/>
-              </w:rPr>
-              <w:t>Safety, Security and Data Practices</w:t>
+                <w:rStyle w:val="Strong"/>
+                <w:rFonts w:ascii="Times New Roman" w:hAnsi="Times New Roman" w:cs="Times New Roman"/>
+                <w:sz w:val="28"/>
+                <w:szCs w:val="28"/>
+              </w:rPr>
+              <w:t>Chapter 8 – Conclusion and Future Scope</w:t>
             </w:r>
           </w:p>
         </w:tc>
@@ -6150,7 +5981,7 @@
                 <w:rFonts w:ascii="Times New Roman" w:hAnsi="Times New Roman"/>
                 <w:sz w:val="28"/>
               </w:rPr>
-              <w:t xml:space="preserve">24</w:t>
+              <w:t xml:space="preserve">25</w:t>
             </w:r>
           </w:p>
         </w:tc>
@@ -6177,11 +6008,10 @@
             <w:r>
               <w:rPr>
                 <w:rFonts w:ascii="Times New Roman" w:hAnsi="Times New Roman" w:cs="Times New Roman"/>
-                <w:b/>
-                <w:sz w:val="28"/>
-                <w:szCs w:val="28"/>
-              </w:rPr>
-              <w:t>16</w:t>
+                <w:sz w:val="28"/>
+                <w:szCs w:val="28"/>
+              </w:rPr>
+              <w:t xml:space="preserve">15.1</w:t>
             </w:r>
           </w:p>
         </w:tc>
@@ -6201,12 +6031,11 @@
             </w:pPr>
             <w:r>
               <w:rPr>
-                <w:rStyle w:val="Strong"/>
-                <w:rFonts w:ascii="Times New Roman" w:hAnsi="Times New Roman" w:cs="Times New Roman"/>
-                <w:sz w:val="28"/>
-                <w:szCs w:val="28"/>
-              </w:rPr>
-              <w:t>Chapter 8 – Conclusion and Future Scope</w:t>
+                <w:rFonts w:ascii="Times New Roman" w:hAnsi="Times New Roman" w:cs="Times New Roman"/>
+                <w:sz w:val="28"/>
+                <w:szCs w:val="28"/>
+              </w:rPr>
+              <w:t>Conclusion</w:t>
             </w:r>
           </w:p>
         </w:tc>
@@ -6254,7 +6083,7 @@
                 <w:sz w:val="28"/>
                 <w:szCs w:val="28"/>
               </w:rPr>
-              <w:t>16.1</w:t>
+              <w:t xml:space="preserve">15.2</w:t>
             </w:r>
           </w:p>
         </w:tc>
@@ -6278,7 +6107,7 @@
                 <w:sz w:val="28"/>
                 <w:szCs w:val="28"/>
               </w:rPr>
-              <w:t>Conclusion</w:t>
+              <w:t>Achievement of Objectives</w:t>
             </w:r>
           </w:p>
         </w:tc>
@@ -6326,7 +6155,7 @@
                 <w:sz w:val="28"/>
                 <w:szCs w:val="28"/>
               </w:rPr>
-              <w:t>16.2</w:t>
+              <w:t xml:space="preserve">15.3</w:t>
             </w:r>
           </w:p>
         </w:tc>
@@ -6350,7 +6179,7 @@
                 <w:sz w:val="28"/>
                 <w:szCs w:val="28"/>
               </w:rPr>
-              <w:t>Achievement of Objectives</w:t>
+              <w:t>Career Relevance</w:t>
             </w:r>
           </w:p>
         </w:tc>
@@ -6398,7 +6227,7 @@
                 <w:sz w:val="28"/>
                 <w:szCs w:val="28"/>
               </w:rPr>
-              <w:t>16.3</w:t>
+              <w:t xml:space="preserve">15.4</w:t>
             </w:r>
           </w:p>
         </w:tc>
@@ -6422,7 +6251,7 @@
                 <w:sz w:val="28"/>
                 <w:szCs w:val="28"/>
               </w:rPr>
-              <w:t>Career Relevance</w:t>
+              <w:t>Future Scope / Recommendations</w:t>
             </w:r>
           </w:p>
         </w:tc>
@@ -6470,7 +6299,7 @@
                 <w:sz w:val="28"/>
                 <w:szCs w:val="28"/>
               </w:rPr>
-              <w:t>16.4</w:t>
+              <w:t xml:space="preserve">16</w:t>
             </w:r>
           </w:p>
         </w:tc>
@@ -6494,7 +6323,7 @@
                 <w:sz w:val="28"/>
                 <w:szCs w:val="28"/>
               </w:rPr>
-              <w:t>Future Scope / Recommendations</w:t>
+              <w:t>References</w:t>
             </w:r>
           </w:p>
         </w:tc>
@@ -6512,7 +6341,7 @@
                 <w:rFonts w:ascii="Times New Roman" w:hAnsi="Times New Roman"/>
                 <w:sz w:val="28"/>
               </w:rPr>
-              <w:t xml:space="preserve">25</w:t>
+              <w:t xml:space="preserve">26</w:t>
             </w:r>
           </w:p>
         </w:tc>
@@ -6542,7 +6371,7 @@
                 <w:sz w:val="28"/>
                 <w:szCs w:val="28"/>
               </w:rPr>
-              <w:t>17</w:t>
+              <w:t xml:space="preserve">17</w:t>
             </w:r>
           </w:p>
         </w:tc>
@@ -6562,11 +6391,13 @@
             </w:pPr>
             <w:r>
               <w:rPr>
-                <w:rFonts w:ascii="Times New Roman" w:hAnsi="Times New Roman" w:cs="Times New Roman"/>
-                <w:sz w:val="28"/>
-                <w:szCs w:val="28"/>
-              </w:rPr>
-              <w:t>References</w:t>
+                <w:rStyle w:val="Strong"/>
+                <w:rFonts w:ascii="Times New Roman" w:hAnsi="Times New Roman" w:cs="Times New Roman"/>
+                <w:b w:val="0"/>
+                <w:sz w:val="28"/>
+                <w:szCs w:val="28"/>
+              </w:rPr>
+              <w:t>Appendices</w:t>
             </w:r>
           </w:p>
         </w:tc>
@@ -6584,7 +6415,7 @@
                 <w:rFonts w:ascii="Times New Roman" w:hAnsi="Times New Roman"/>
                 <w:sz w:val="28"/>
               </w:rPr>
-              <w:t xml:space="preserve">26</w:t>
+              <w:t xml:space="preserve">27</w:t>
             </w:r>
           </w:p>
         </w:tc>
@@ -6614,7 +6445,7 @@
                 <w:sz w:val="28"/>
                 <w:szCs w:val="28"/>
               </w:rPr>
-              <w:t>18</w:t>
+              <w:t xml:space="preserve">17.1</w:t>
             </w:r>
           </w:p>
         </w:tc>
@@ -6634,13 +6465,11 @@
             </w:pPr>
             <w:r>
               <w:rPr>
-                <w:rStyle w:val="Strong"/>
-                <w:rFonts w:ascii="Times New Roman" w:hAnsi="Times New Roman" w:cs="Times New Roman"/>
-                <w:b w:val="0"/>
-                <w:sz w:val="28"/>
-                <w:szCs w:val="28"/>
-              </w:rPr>
-              <w:t>Appendices</w:t>
+                <w:rFonts w:ascii="Times New Roman" w:hAnsi="Times New Roman" w:cs="Times New Roman"/>
+                <w:sz w:val="28"/>
+                <w:szCs w:val="28"/>
+              </w:rPr>
+              <w:t>Appendix A – Internship Certificate</w:t>
             </w:r>
           </w:p>
         </w:tc>
@@ -6688,7 +6517,7 @@
                 <w:sz w:val="28"/>
                 <w:szCs w:val="28"/>
               </w:rPr>
-              <w:t>18.1</w:t>
+              <w:t xml:space="preserve">17.2</w:t>
             </w:r>
           </w:p>
         </w:tc>
@@ -6712,7 +6541,7 @@
                 <w:sz w:val="28"/>
                 <w:szCs w:val="28"/>
               </w:rPr>
-              <w:t>Appendix A – Internship Certificate</w:t>
+              <w:t>Appendix B – Internship Offer / Permission Letter</w:t>
             </w:r>
           </w:p>
         </w:tc>
@@ -6760,7 +6589,7 @@
                 <w:sz w:val="28"/>
                 <w:szCs w:val="28"/>
               </w:rPr>
-              <w:t>18.2</w:t>
+              <w:t xml:space="preserve">17.3</w:t>
             </w:r>
           </w:p>
         </w:tc>
@@ -6784,7 +6613,7 @@
                 <w:sz w:val="28"/>
                 <w:szCs w:val="28"/>
               </w:rPr>
-              <w:t>Appendix B – Internship Offer / Permission Letter</w:t>
+              <w:t>Appendix C – Weekly Internship Logbook</w:t>
             </w:r>
           </w:p>
         </w:tc>
@@ -6832,7 +6661,7 @@
                 <w:sz w:val="28"/>
                 <w:szCs w:val="28"/>
               </w:rPr>
-              <w:t>18.3</w:t>
+              <w:t xml:space="preserve">17.4</w:t>
             </w:r>
           </w:p>
         </w:tc>
@@ -6856,7 +6685,7 @@
                 <w:sz w:val="28"/>
                 <w:szCs w:val="28"/>
               </w:rPr>
-              <w:t>Appendix C – Weekly Internship Logbook</w:t>
+              <w:t>Appendix D – Industry Mentor Evaluation</w:t>
             </w:r>
           </w:p>
         </w:tc>
@@ -6874,7 +6703,7 @@
                 <w:rFonts w:ascii="Times New Roman" w:hAnsi="Times New Roman"/>
                 <w:sz w:val="28"/>
               </w:rPr>
-              <w:t xml:space="preserve">27</w:t>
+              <w:t xml:space="preserve">28</w:t>
             </w:r>
           </w:p>
         </w:tc>
@@ -6904,7 +6733,7 @@
                 <w:sz w:val="28"/>
                 <w:szCs w:val="28"/>
               </w:rPr>
-              <w:t>18.4</w:t>
+              <w:t xml:space="preserve">17.5</w:t>
             </w:r>
           </w:p>
         </w:tc>
@@ -6928,7 +6757,7 @@
                 <w:sz w:val="28"/>
                 <w:szCs w:val="28"/>
               </w:rPr>
-              <w:t>Appendix D – Industry Mentor Evaluation</w:t>
+              <w:t>Appendix E – Final Internship Presentation / Viva Record</w:t>
             </w:r>
           </w:p>
         </w:tc>
@@ -6976,7 +6805,7 @@
                 <w:sz w:val="28"/>
                 <w:szCs w:val="28"/>
               </w:rPr>
-              <w:t>18.5</w:t>
+              <w:t xml:space="preserve">17.6</w:t>
             </w:r>
           </w:p>
         </w:tc>
@@ -7000,7 +6829,7 @@
                 <w:sz w:val="28"/>
                 <w:szCs w:val="28"/>
               </w:rPr>
-              <w:t>Appendix E – Final Internship Presentation / Viva Record</w:t>
+              <w:t>Appendix F – Photographs, Screenshots and Project Evidence</w:t>
             </w:r>
           </w:p>
         </w:tc>
@@ -7048,79 +6877,7 @@
                 <w:sz w:val="28"/>
                 <w:szCs w:val="28"/>
               </w:rPr>
-              <w:t>18.6</w:t>
-            </w:r>
-          </w:p>
-        </w:tc>
-        <w:tc>
-          <w:tcPr>
-            <w:tcW w:w="6360" w:type="dxa"/>
-            <w:hideMark/>
-          </w:tcPr>
-          <w:p>
-            <w:pPr>
-              <w:spacing w:after="40" w:line="360" w:lineRule="auto"/>
-              <w:rPr>
-                <w:rFonts w:ascii="Times New Roman" w:hAnsi="Times New Roman" w:cs="Times New Roman"/>
-                <w:sz w:val="28"/>
-                <w:szCs w:val="28"/>
-              </w:rPr>
-            </w:pPr>
-            <w:r>
-              <w:rPr>
-                <w:rFonts w:ascii="Times New Roman" w:hAnsi="Times New Roman" w:cs="Times New Roman"/>
-                <w:sz w:val="28"/>
-                <w:szCs w:val="28"/>
-              </w:rPr>
-              <w:t>Appendix F – Photographs, Screenshots and Project Evidence</w:t>
-            </w:r>
-          </w:p>
-        </w:tc>
-        <w:tc>
-          <w:tcPr>
-            <w:tcW w:w="1700" w:type="dxa"/>
-            <w:hideMark/>
-          </w:tcPr>
-          <w:p>
-            <w:pPr>
-              <w:jc w:val="center"/>
-            </w:pPr>
-            <w:r>
-              <w:rPr>
-                <w:rFonts w:ascii="Times New Roman" w:hAnsi="Times New Roman"/>
-                <w:sz w:val="28"/>
-              </w:rPr>
-              <w:t xml:space="preserve">28</w:t>
-            </w:r>
-          </w:p>
-        </w:tc>
-      </w:tr>
-      <w:tr>
-        <w:trPr>
-          <w:jc w:val="center"/>
-        </w:trPr>
-        <w:tc>
-          <w:tcPr>
-            <w:tcW w:w="960" w:type="dxa"/>
-            <w:hideMark/>
-          </w:tcPr>
-          <w:p>
-            <w:pPr>
-              <w:spacing w:after="40" w:line="360" w:lineRule="auto"/>
-              <w:jc w:val="center"/>
-              <w:rPr>
-                <w:rFonts w:ascii="Times New Roman" w:hAnsi="Times New Roman" w:cs="Times New Roman"/>
-                <w:sz w:val="28"/>
-                <w:szCs w:val="28"/>
-              </w:rPr>
-            </w:pPr>
-            <w:r>
-              <w:rPr>
-                <w:rFonts w:ascii="Times New Roman" w:hAnsi="Times New Roman" w:cs="Times New Roman"/>
-                <w:sz w:val="28"/>
-                <w:szCs w:val="28"/>
-              </w:rPr>
-              <w:t xml:space="preserve">19</w:t>
+              <w:t xml:space="preserve">18</w:t>
             </w:r>
           </w:p>
         </w:tc>
@@ -8185,6 +7942,18 @@
     </w:p>
     <w:p>
       <w:pPr>
+        <w:jc w:val="both"/>
+      </w:pPr>
+      <w:r>
+        <w:rPr>
+          <w:rFonts w:ascii="Times New Roman" w:hAnsi="Times New Roman"/>
+          <w:sz w:val="28"/>
+        </w:rPr>
+        <w:t>Classroom study of artificial intelligence usually stops at the model: a dataset is cleaned, an algorithm is trained, and an accuracy figure is reported. Industry practice begins where that exercise ends. A model earns its value only once it is wrapped in a service, fed by a reliable data path, deployed behind an interface and maintained as requirements change. This internship was undertaken to work on that second half of the problem, applied to a language-model application.</w:t>
+      </w:r>
+    </w:p>
+    <w:p>
+      <w:pPr>
         <w:keepNext xmlns:a="http://schemas.openxmlformats.org/drawingml/2006/main" xmlns:pic="http://schemas.openxmlformats.org/drawingml/2006/picture"/>
         <w:jc w:val="both"/>
       </w:pPr>
@@ -8209,6 +7978,18 @@
         <w:t>Classroom study of artificial intelligence usually stops at the model: a dataset is cleaned, an algorithm is trained, and an accuracy figure is reported. Industry practice begins where that exercise ends. A model earns its value only once it is wrapped in a service, fed by a reliable data path, deployed behind an interface and maintained as requirements change. This internship was undertaken to work on that second half of the problem, applied to a language-model application.</w:t>
       </w:r>
     </w:p>
+    <w:p xmlns:a="http://schemas.openxmlformats.org/drawingml/2006/main" xmlns:pic="http://schemas.openxmlformats.org/drawingml/2006/picture">
+      <w:pPr>
+        <w:jc w:val="both"/>
+      </w:pPr>
+      <w:r>
+        <w:rPr>
+          <w:rFonts w:ascii="Times New Roman" w:hAnsi="Times New Roman"/>
+          <w:sz w:val="28"/>
+        </w:rPr>
+        <w:t xml:space="preserve">The need for this second half is felt most strongly in applications built on language models. A user does not see an embedding or a vector store; the user sees an answer, and the only question that matters is whether that answer is correct and can be trusted. Every stage behind it, from document preparation to retrieval and prompt assembly, has to be correct for the answer to be worth reading.</w:t>
+      </w:r>
+    </w:p>
     <w:p>
       <w:pPr>
         <w:jc w:val="both"/>
@@ -8237,6 +8018,18 @@
         <w:t xml:space="preserve"> Technologies as an AI/ML Intern for a period of 2 Months (July - September 2026). The departmental review meeting held on 17.08.2026 collected and verified the internship details, the nature of the AI/ML and software-development work, and the project involvement.</w:t>
       </w:r>
     </w:p>
+    <w:p xmlns:a="http://schemas.openxmlformats.org/drawingml/2006/main" xmlns:pic="http://schemas.openxmlformats.org/drawingml/2006/picture">
+      <w:pPr>
+        <w:jc w:val="both"/>
+      </w:pPr>
+      <w:r>
+        <w:rPr>
+          <w:rFonts w:ascii="Times New Roman" w:hAnsi="Times New Roman"/>
+          <w:sz w:val="28"/>
+        </w:rPr>
+        <w:t xml:space="preserve">The weeks that followed were spent inside a real engineering workflow. Requirements were discussed with the industry mentor, implemented on a branch, tested locally and reviewed before they were merged, and the same short cycle was followed for data preparation, model experiments and service integration. The resulting experience is the subject of this report.</w:t>
+      </w:r>
+    </w:p>
     <w:p>
       <w:pPr>
         <w:keepNext xmlns:a="http://schemas.openxmlformats.org/drawingml/2006/main" xmlns:pic="http://schemas.openxmlformats.org/drawingml/2006/picture"/>
@@ -8279,6 +8072,18 @@
         <w:t>, Tamil Nadu / Remote. The role was that of an AI software developer contributing to a live product, RAG Chatbot - An AI Knowledge Assistant.</w:t>
       </w:r>
     </w:p>
+    <w:p xmlns:a="http://schemas.openxmlformats.org/drawingml/2006/main" xmlns:pic="http://schemas.openxmlformats.org/drawingml/2006/picture">
+      <w:pPr>
+        <w:jc w:val="both"/>
+      </w:pPr>
+      <w:r>
+        <w:rPr>
+          <w:rFonts w:ascii="Times New Roman" w:hAnsi="Times New Roman"/>
+          <w:sz w:val="28"/>
+        </w:rPr>
+        <w:t xml:space="preserve">Working from Dindigul and remotely, the intern took part in incremental delivery and reported progress to the industry mentor, Karthikeyan, Software Developer. The RAG chatbot served as the common thread through the two months: it supplied the problem, the architecture to be understood and the codebase in which changes had to be made carefully.</w:t>
+      </w:r>
+    </w:p>
     <w:p>
       <w:pPr>
         <w:keepNext xmlns:a="http://schemas.openxmlformats.org/drawingml/2006/main" xmlns:pic="http://schemas.openxmlformats.org/drawingml/2006/picture"/>
@@ -8305,6 +8110,18 @@
         <w:t>The internship connected academic study with practical engineering tasks: building, fine-tuning and evaluating models, preparing data, and integrating models into web applications and REST API microservices under version control.</w:t>
       </w:r>
     </w:p>
+    <w:p xmlns:a="http://schemas.openxmlformats.org/drawingml/2006/main" xmlns:pic="http://schemas.openxmlformats.org/drawingml/2006/picture">
+      <w:pPr>
+        <w:jc w:val="both"/>
+      </w:pPr>
+      <w:r>
+        <w:rPr>
+          <w:rFonts w:ascii="Times New Roman" w:hAnsi="Times New Roman"/>
+          <w:sz w:val="28"/>
+        </w:rPr>
+        <w:t xml:space="preserve">Three needs shaped the internship. The first was practical exposure: moving from curated coursework datasets to real source documents that are inconsistent in format and quality. The second was integration: learning how a model, a retrieval service and an interface are connected so that a result actually reaches the user. The third was professional discipline: version control, code review, testing and respect for confidentiality, none of which can be learned from a textbook alone.</w:t>
+      </w:r>
+    </w:p>
     <w:p>
       <w:pPr>
         <w:keepNext xmlns:a="http://schemas.openxmlformats.org/drawingml/2006/main" xmlns:pic="http://schemas.openxmlformats.org/drawingml/2006/picture"/>
@@ -8345,6 +8162,18 @@
           <w:sz w:val="28"/>
         </w:rPr>
         <w:t>, TensorFlow and Scikit-Learn. Integrate models into web applications and REST API microservices under version control with Git and GitHub. Contribute to a retrieval-augmented generation (RAG) chatbot as the practical outcome of the internship.</w:t>
+      </w:r>
+    </w:p>
+    <w:p xmlns:a="http://schemas.openxmlformats.org/drawingml/2006/main" xmlns:pic="http://schemas.openxmlformats.org/drawingml/2006/picture">
+      <w:pPr>
+        <w:jc w:val="both"/>
+      </w:pPr>
+      <w:r>
+        <w:rPr>
+          <w:rFonts w:ascii="Times New Roman" w:hAnsi="Times New Roman"/>
+          <w:sz w:val="28"/>
+        </w:rPr>
+        <w:t xml:space="preserve">Each objective was tied to something that could be observed at the end of the internship: a repeatable ingestion path for documents, a retrieval step whose quality could be compared between changes, grounded answers that cite their sources, and a history of reviewed commits on Git and GitHub.</w:t>
       </w:r>
     </w:p>
     <w:p>
@@ -8379,6 +8208,18 @@
         </w:rPr>
         <w:lastRenderedPageBreak/>
         <w:t>contribution, and the learning outcomes. Architecture and design are discussed at a level appropriate for an academic report; proprietary source code, model weights and internal datasets are deliberately excluded.</w:t>
+      </w:r>
+    </w:p>
+    <w:p xmlns:a="http://schemas.openxmlformats.org/drawingml/2006/main" xmlns:pic="http://schemas.openxmlformats.org/drawingml/2006/picture">
+      <w:pPr>
+        <w:jc w:val="both"/>
+      </w:pPr>
+      <w:r>
+        <w:rPr>
+          <w:rFonts w:ascii="Times New Roman" w:hAnsi="Times New Roman"/>
+          <w:sz w:val="28"/>
+        </w:rPr>
+        <w:t xml:space="preserve">The chapters that follow are arranged in the order recommended by the department. Chapter 2 introduces the company, Chapter 3 the internship activities, Chapter 4 the project undertaken, Chapter 5 the skills gained, Chapter 6 the challenges faced, Chapter 7 the professional experience, and Chapter 8 the conclusion and future scope. The internship offer letter, the references and the supporting appendices complete the report.</w:t>
       </w:r>
     </w:p>
     <w:p>
@@ -12839,7 +12680,7 @@
         </w:rPr>
         <w:drawing>
           <wp:inline distT="0" distB="0" distL="0" distR="0" wp14:anchorId="6D85A2BD" wp14:editId="3AC111BD">
-            <wp:extent cx="2527200" cy="2067709"/>
+            <wp:extent cx="3240000" cy="2650909"/>
             <wp:effectExtent l="0" t="0" r="0" b="0"/>
             <wp:docPr id="57" name="Picture 57"/>
             <wp:cNvGraphicFramePr>
@@ -12861,7 +12702,7 @@
                   <pic:spPr>
                     <a:xfrm>
                       <a:off x="0" y="0"/>
-                      <a:ext cx="2527200" cy="2067709"/>
+                      <a:ext cx="3240000" cy="2650909"/>
                     </a:xfrm>
                     <a:prstGeom prst="rect">
                       <a:avLst/>
@@ -12898,7 +12739,7 @@
         <w:lastRenderedPageBreak/>
         <w:drawing>
           <wp:inline distT="0" distB="0" distL="0" distR="0" wp14:anchorId="1BD25ADA" wp14:editId="6FF412D7">
-            <wp:extent cx="3790800" cy="1137240"/>
+            <wp:extent cx="4860000" cy="1458000"/>
             <wp:effectExtent l="0" t="0" r="0" b="0"/>
             <wp:docPr id="58" name="Picture 58"/>
             <wp:cNvGraphicFramePr>
@@ -12920,7 +12761,7 @@
                   <pic:spPr>
                     <a:xfrm>
                       <a:off x="0" y="0"/>
-                      <a:ext cx="3790800" cy="1137240"/>
+                      <a:ext cx="4860000" cy="1458000"/>
                     </a:xfrm>
                     <a:prstGeom prst="rect">
                       <a:avLst/>
@@ -12956,7 +12797,7 @@
         </w:rPr>
         <w:drawing>
           <wp:inline distT="0" distB="0" distL="0" distR="0" wp14:anchorId="0183C469" wp14:editId="37129ED3">
-            <wp:extent cx="2414880" cy="2195345"/>
+            <wp:extent cx="3096000" cy="2814545"/>
             <wp:effectExtent l="0" t="0" r="0" b="0"/>
             <wp:docPr id="59" name="Picture 59"/>
             <wp:cNvGraphicFramePr>
@@ -12978,7 +12819,7 @@
                   <pic:spPr>
                     <a:xfrm>
                       <a:off x="0" y="0"/>
-                      <a:ext cx="2414880" cy="2195345"/>
+                      <a:ext cx="3096000" cy="2814545"/>
                     </a:xfrm>
                     <a:prstGeom prst="rect">
                       <a:avLst/>

</xml_diff>